<commit_message>
Update to release 2024-09-28, based on KoSIT release 2024-06-20
Update to release 2024-09-28, based on KoSIT release 2024-06-20
in detail:
* update to KoSIT visualization for XRechnung v3.0.x, release 2024-06-20
* update to KoSIT test suite for XRechnung v3.0.x, release 2024-06-20
* Codelists updated
</commit_message>
<xml_diff>
--- a/Dokumentation.docx
+++ b/Dokumentation.docx
@@ -78,7 +78,7 @@
           <w:r>
             <w:fldChar w:fldCharType="separate"/>
           </w:r>
-          <w:hyperlink w:anchor="_Toc120022767" w:history="1">
+          <w:hyperlink w:anchor="_Toc178405147" w:history="1">
             <w:r>
               <w:rPr>
                 <w:rStyle w:val="Hyperlink"/>
@@ -105,7 +105,7 @@
                 <w:noProof/>
                 <w:webHidden/>
               </w:rPr>
-              <w:instrText xml:space="preserve"> PAGEREF _Toc120022767 \h </w:instrText>
+              <w:instrText xml:space="preserve"> PAGEREF _Toc178405147 \h </w:instrText>
             </w:r>
             <w:r>
               <w:rPr>
@@ -148,7 +148,7 @@
               <w:lang w:eastAsia="de-DE"/>
             </w:rPr>
           </w:pPr>
-          <w:hyperlink w:anchor="_Toc120022768" w:history="1">
+          <w:hyperlink w:anchor="_Toc178405148" w:history="1">
             <w:r>
               <w:rPr>
                 <w:rStyle w:val="Hyperlink"/>
@@ -175,7 +175,7 @@
                 <w:noProof/>
                 <w:webHidden/>
               </w:rPr>
-              <w:instrText xml:space="preserve"> PAGEREF _Toc120022768 \h </w:instrText>
+              <w:instrText xml:space="preserve"> PAGEREF _Toc178405148 \h </w:instrText>
             </w:r>
             <w:r>
               <w:rPr>
@@ -218,7 +218,7 @@
               <w:lang w:eastAsia="de-DE"/>
             </w:rPr>
           </w:pPr>
-          <w:hyperlink w:anchor="_Toc120022769" w:history="1">
+          <w:hyperlink w:anchor="_Toc178405149" w:history="1">
             <w:r>
               <w:rPr>
                 <w:rStyle w:val="Hyperlink"/>
@@ -245,7 +245,7 @@
                 <w:noProof/>
                 <w:webHidden/>
               </w:rPr>
-              <w:instrText xml:space="preserve"> PAGEREF _Toc120022769 \h </w:instrText>
+              <w:instrText xml:space="preserve"> PAGEREF _Toc178405149 \h </w:instrText>
             </w:r>
             <w:r>
               <w:rPr>
@@ -288,7 +288,7 @@
               <w:lang w:eastAsia="de-DE"/>
             </w:rPr>
           </w:pPr>
-          <w:hyperlink w:anchor="_Toc120022770" w:history="1">
+          <w:hyperlink w:anchor="_Toc178405150" w:history="1">
             <w:r>
               <w:rPr>
                 <w:rStyle w:val="Hyperlink"/>
@@ -315,7 +315,7 @@
                 <w:noProof/>
                 <w:webHidden/>
               </w:rPr>
-              <w:instrText xml:space="preserve"> PAGEREF _Toc120022770 \h </w:instrText>
+              <w:instrText xml:space="preserve"> PAGEREF _Toc178405150 \h </w:instrText>
             </w:r>
             <w:r>
               <w:rPr>
@@ -358,7 +358,7 @@
               <w:lang w:eastAsia="de-DE"/>
             </w:rPr>
           </w:pPr>
-          <w:hyperlink w:anchor="_Toc120022771" w:history="1">
+          <w:hyperlink w:anchor="_Toc178405151" w:history="1">
             <w:r>
               <w:rPr>
                 <w:rStyle w:val="Hyperlink"/>
@@ -385,7 +385,7 @@
                 <w:noProof/>
                 <w:webHidden/>
               </w:rPr>
-              <w:instrText xml:space="preserve"> PAGEREF _Toc120022771 \h </w:instrText>
+              <w:instrText xml:space="preserve"> PAGEREF _Toc178405151 \h </w:instrText>
             </w:r>
             <w:r>
               <w:rPr>
@@ -405,7 +405,7 @@
                 <w:noProof/>
                 <w:webHidden/>
               </w:rPr>
-              <w:t>4</w:t>
+              <w:t>5</w:t>
             </w:r>
             <w:r>
               <w:rPr>
@@ -428,7 +428,7 @@
               <w:lang w:eastAsia="de-DE"/>
             </w:rPr>
           </w:pPr>
-          <w:hyperlink w:anchor="_Toc120022772" w:history="1">
+          <w:hyperlink w:anchor="_Toc178405152" w:history="1">
             <w:r>
               <w:rPr>
                 <w:rStyle w:val="Hyperlink"/>
@@ -455,7 +455,7 @@
                 <w:noProof/>
                 <w:webHidden/>
               </w:rPr>
-              <w:instrText xml:space="preserve"> PAGEREF _Toc120022772 \h </w:instrText>
+              <w:instrText xml:space="preserve"> PAGEREF _Toc178405152 \h </w:instrText>
             </w:r>
             <w:r>
               <w:rPr>
@@ -501,16 +501,18 @@
       <w:pPr>
         <w:pStyle w:val="berschrift1"/>
       </w:pPr>
+      <w:bookmarkStart w:id="0" w:name="_GoBack"/>
+      <w:bookmarkEnd w:id="0"/>
     </w:p>
     <w:p>
       <w:pPr>
         <w:pStyle w:val="berschrift1"/>
       </w:pPr>
-      <w:bookmarkStart w:id="0" w:name="_Toc120022767"/>
+      <w:bookmarkStart w:id="1" w:name="_Toc178405147"/>
       <w:r>
         <w:t>Autor</w:t>
       </w:r>
-      <w:bookmarkEnd w:id="0"/>
+      <w:bookmarkEnd w:id="1"/>
     </w:p>
     <w:p>
       <w:r>
@@ -541,11 +543,11 @@
       <w:pPr>
         <w:pStyle w:val="berschrift1"/>
       </w:pPr>
-      <w:bookmarkStart w:id="1" w:name="_Toc120022768"/>
+      <w:bookmarkStart w:id="2" w:name="_Toc178405148"/>
       <w:r>
         <w:t>Version</w:t>
       </w:r>
-      <w:bookmarkEnd w:id="1"/>
+      <w:bookmarkEnd w:id="2"/>
     </w:p>
     <w:p>
       <w:r>
@@ -576,7 +578,43 @@
           <w:rPr>
             <w:rStyle w:val="Hyperlink"/>
           </w:rPr>
-          <w:t xml:space="preserve">2023-09-22 compatible </w:t>
+          <w:t>202</w:t>
+        </w:r>
+        <w:r>
+          <w:rPr>
+            <w:rStyle w:val="Hyperlink"/>
+          </w:rPr>
+          <w:t>4</w:t>
+        </w:r>
+        <w:r>
+          <w:rPr>
+            <w:rStyle w:val="Hyperlink"/>
+          </w:rPr>
+          <w:t>-0</w:t>
+        </w:r>
+        <w:r>
+          <w:rPr>
+            <w:rStyle w:val="Hyperlink"/>
+          </w:rPr>
+          <w:t>6</w:t>
+        </w:r>
+        <w:r>
+          <w:rPr>
+            <w:rStyle w:val="Hyperlink"/>
+          </w:rPr>
+          <w:t>-2</w:t>
+        </w:r>
+        <w:r>
+          <w:rPr>
+            <w:rStyle w:val="Hyperlink"/>
+          </w:rPr>
+          <w:t>0</w:t>
+        </w:r>
+        <w:r>
+          <w:rPr>
+            <w:rStyle w:val="Hyperlink"/>
+          </w:rPr>
+          <w:t xml:space="preserve"> compatible </w:t>
         </w:r>
         <w:proofErr w:type="spellStart"/>
         <w:r>
@@ -632,11 +670,11 @@
       <w:pPr>
         <w:pStyle w:val="berschrift1"/>
       </w:pPr>
-      <w:bookmarkStart w:id="2" w:name="_Toc120022769"/>
+      <w:bookmarkStart w:id="3" w:name="_Toc178405149"/>
       <w:r>
         <w:t>Zweck der Skripte</w:t>
       </w:r>
-      <w:bookmarkEnd w:id="2"/>
+      <w:bookmarkEnd w:id="3"/>
     </w:p>
     <w:p>
       <w:r>
@@ -694,7 +732,7 @@
         <mc:AlternateContent>
           <mc:Choice Requires="wps">
             <w:drawing>
-              <wp:anchor distT="0" distB="0" distL="114300" distR="114300" simplePos="0" relativeHeight="251675648" behindDoc="0" locked="0" layoutInCell="1" allowOverlap="1" wp14:anchorId="7A156D03" wp14:editId="50B64398">
+              <wp:anchor distT="0" distB="0" distL="114300" distR="114300" simplePos="0" relativeHeight="251658247" behindDoc="0" locked="0" layoutInCell="1" allowOverlap="1" wp14:anchorId="7A156D03" wp14:editId="50B64398">
                 <wp:simplePos x="0" y="0"/>
                 <wp:positionH relativeFrom="column">
                   <wp:posOffset>845820</wp:posOffset>
@@ -766,7 +804,7 @@
           </mc:Choice>
           <mc:Fallback>
             <w:pict>
-              <v:oval w14:anchorId="1F96EC8E" id="Ellipse 17" o:spid="_x0000_s1026" style="position:absolute;margin-left:66.6pt;margin-top:158.7pt;width:52.9pt;height:12pt;z-index:251675648;visibility:visible;mso-wrap-style:square;mso-width-percent:0;mso-height-percent:0;mso-wrap-distance-left:9pt;mso-wrap-distance-top:0;mso-wrap-distance-right:9pt;mso-wrap-distance-bottom:0;mso-position-horizontal:absolute;mso-position-horizontal-relative:text;mso-position-vertical:absolute;mso-position-vertical-relative:text;mso-width-percent:0;mso-height-percent:0;mso-width-relative:margin;mso-height-relative:margin;v-text-anchor:middle" o:gfxdata="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" fillcolor="#c00000" strokecolor="#ed7d31 [3205]" strokeweight="1pt">
+              <v:oval w14:anchorId="46DE6968" id="Ellipse 17" o:spid="_x0000_s1026" style="position:absolute;margin-left:66.6pt;margin-top:158.7pt;width:52.9pt;height:12pt;z-index:251658247;visibility:visible;mso-wrap-style:square;mso-width-percent:0;mso-height-percent:0;mso-wrap-distance-left:9pt;mso-wrap-distance-top:0;mso-wrap-distance-right:9pt;mso-wrap-distance-bottom:0;mso-position-horizontal:absolute;mso-position-horizontal-relative:text;mso-position-vertical:absolute;mso-position-vertical-relative:text;mso-width-percent:0;mso-height-percent:0;mso-width-relative:margin;mso-height-relative:margin;v-text-anchor:middle" o:gfxdata="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" fillcolor="#c00000" strokecolor="#ed7d31 [3205]" strokeweight="1pt">
                 <v:fill opacity="15163f"/>
                 <v:stroke joinstyle="miter"/>
               </v:oval>
@@ -781,7 +819,7 @@
         <mc:AlternateContent>
           <mc:Choice Requires="wps">
             <w:drawing>
-              <wp:anchor distT="0" distB="0" distL="114300" distR="114300" simplePos="0" relativeHeight="251669504" behindDoc="0" locked="0" layoutInCell="1" allowOverlap="1" wp14:anchorId="2A48E6E0" wp14:editId="7E471441">
+              <wp:anchor distT="0" distB="0" distL="114300" distR="114300" simplePos="0" relativeHeight="251658244" behindDoc="0" locked="0" layoutInCell="1" allowOverlap="1" wp14:anchorId="2A48E6E0" wp14:editId="7E471441">
                 <wp:simplePos x="0" y="0"/>
                 <wp:positionH relativeFrom="column">
                   <wp:posOffset>892868</wp:posOffset>
@@ -853,7 +891,7 @@
           </mc:Choice>
           <mc:Fallback>
             <w:pict>
-              <v:oval w14:anchorId="1E5E5E4E" id="Ellipse 13" o:spid="_x0000_s1026" style="position:absolute;margin-left:70.3pt;margin-top:529.65pt;width:56.7pt;height:12.55pt;z-index:251669504;visibility:visible;mso-wrap-style:square;mso-width-percent:0;mso-height-percent:0;mso-wrap-distance-left:9pt;mso-wrap-distance-top:0;mso-wrap-distance-right:9pt;mso-wrap-distance-bottom:0;mso-position-horizontal:absolute;mso-position-horizontal-relative:text;mso-position-vertical:absolute;mso-position-vertical-relative:text;mso-width-percent:0;mso-height-percent:0;mso-width-relative:margin;mso-height-relative:margin;v-text-anchor:middle" o:gfxdata="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" fillcolor="#c00000" strokecolor="#ed7d31 [3205]" strokeweight="1pt">
+              <v:oval w14:anchorId="7F5A6D6F" id="Ellipse 13" o:spid="_x0000_s1026" style="position:absolute;margin-left:70.3pt;margin-top:529.65pt;width:56.7pt;height:12.55pt;z-index:251658244;visibility:visible;mso-wrap-style:square;mso-width-percent:0;mso-height-percent:0;mso-wrap-distance-left:9pt;mso-wrap-distance-top:0;mso-wrap-distance-right:9pt;mso-wrap-distance-bottom:0;mso-position-horizontal:absolute;mso-position-horizontal-relative:text;mso-position-vertical:absolute;mso-position-vertical-relative:text;mso-width-percent:0;mso-height-percent:0;mso-width-relative:margin;mso-height-relative:margin;v-text-anchor:middle" o:gfxdata="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" fillcolor="#c00000" strokecolor="#ed7d31 [3205]" strokeweight="1pt">
                 <v:fill opacity="15163f"/>
                 <v:stroke joinstyle="miter"/>
               </v:oval>
@@ -868,7 +906,7 @@
         <mc:AlternateContent>
           <mc:Choice Requires="wps">
             <w:drawing>
-              <wp:anchor distT="0" distB="0" distL="114300" distR="114300" simplePos="0" relativeHeight="251677696" behindDoc="0" locked="0" layoutInCell="1" allowOverlap="1" wp14:anchorId="2B04F3F2" wp14:editId="294A05E1">
+              <wp:anchor distT="0" distB="0" distL="114300" distR="114300" simplePos="0" relativeHeight="251658248" behindDoc="0" locked="0" layoutInCell="1" allowOverlap="1" wp14:anchorId="2B04F3F2" wp14:editId="294A05E1">
                 <wp:simplePos x="0" y="0"/>
                 <wp:positionH relativeFrom="column">
                   <wp:posOffset>2993275</wp:posOffset>
@@ -940,7 +978,7 @@
           </mc:Choice>
           <mc:Fallback>
             <w:pict>
-              <v:oval w14:anchorId="34459E88" id="Ellipse 18" o:spid="_x0000_s1026" style="position:absolute;margin-left:235.7pt;margin-top:158.75pt;width:52.9pt;height:12pt;z-index:251677696;visibility:visible;mso-wrap-style:square;mso-width-percent:0;mso-height-percent:0;mso-wrap-distance-left:9pt;mso-wrap-distance-top:0;mso-wrap-distance-right:9pt;mso-wrap-distance-bottom:0;mso-position-horizontal:absolute;mso-position-horizontal-relative:text;mso-position-vertical:absolute;mso-position-vertical-relative:text;mso-width-percent:0;mso-height-percent:0;mso-width-relative:margin;mso-height-relative:margin;v-text-anchor:middle" o:gfxdata="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" fillcolor="#c00000" strokecolor="#ed7d31 [3205]" strokeweight="1pt">
+              <v:oval w14:anchorId="05DE5B72" id="Ellipse 18" o:spid="_x0000_s1026" style="position:absolute;margin-left:235.7pt;margin-top:158.75pt;width:52.9pt;height:12pt;z-index:251658248;visibility:visible;mso-wrap-style:square;mso-width-percent:0;mso-height-percent:0;mso-wrap-distance-left:9pt;mso-wrap-distance-top:0;mso-wrap-distance-right:9pt;mso-wrap-distance-bottom:0;mso-position-horizontal:absolute;mso-position-horizontal-relative:text;mso-position-vertical:absolute;mso-position-vertical-relative:text;mso-width-percent:0;mso-height-percent:0;mso-width-relative:margin;mso-height-relative:margin;v-text-anchor:middle" o:gfxdata="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" fillcolor="#c00000" strokecolor="#ed7d31 [3205]" strokeweight="1pt">
                 <v:fill opacity="15163f"/>
                 <v:stroke joinstyle="miter"/>
               </v:oval>
@@ -955,7 +993,7 @@
         <mc:AlternateContent>
           <mc:Choice Requires="wps">
             <w:drawing>
-              <wp:anchor distT="0" distB="0" distL="114300" distR="114300" simplePos="0" relativeHeight="251673600" behindDoc="0" locked="0" layoutInCell="1" allowOverlap="1" wp14:anchorId="2F9B919E" wp14:editId="6FEAC1B2">
+              <wp:anchor distT="0" distB="0" distL="114300" distR="114300" simplePos="0" relativeHeight="251658246" behindDoc="0" locked="0" layoutInCell="1" allowOverlap="1" wp14:anchorId="2F9B919E" wp14:editId="6FEAC1B2">
                 <wp:simplePos x="0" y="0"/>
                 <wp:positionH relativeFrom="column">
                   <wp:posOffset>859213</wp:posOffset>
@@ -1027,7 +1065,7 @@
           </mc:Choice>
           <mc:Fallback>
             <w:pict>
-              <v:oval w14:anchorId="59EE0D19" id="Ellipse 15" o:spid="_x0000_s1026" style="position:absolute;margin-left:67.65pt;margin-top:313.65pt;width:38.75pt;height:12.55pt;z-index:251673600;visibility:visible;mso-wrap-style:square;mso-width-percent:0;mso-height-percent:0;mso-wrap-distance-left:9pt;mso-wrap-distance-top:0;mso-wrap-distance-right:9pt;mso-wrap-distance-bottom:0;mso-position-horizontal:absolute;mso-position-horizontal-relative:text;mso-position-vertical:absolute;mso-position-vertical-relative:text;mso-width-percent:0;mso-height-percent:0;mso-width-relative:margin;mso-height-relative:margin;v-text-anchor:middle" o:gfxdata="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" fillcolor="#c00000" strokecolor="#ed7d31 [3205]" strokeweight="1pt">
+              <v:oval w14:anchorId="4E7D4787" id="Ellipse 15" o:spid="_x0000_s1026" style="position:absolute;margin-left:67.65pt;margin-top:313.65pt;width:38.75pt;height:12.55pt;z-index:251658246;visibility:visible;mso-wrap-style:square;mso-width-percent:0;mso-height-percent:0;mso-wrap-distance-left:9pt;mso-wrap-distance-top:0;mso-wrap-distance-right:9pt;mso-wrap-distance-bottom:0;mso-position-horizontal:absolute;mso-position-horizontal-relative:text;mso-position-vertical:absolute;mso-position-vertical-relative:text;mso-width-percent:0;mso-height-percent:0;mso-width-relative:margin;mso-height-relative:margin;v-text-anchor:middle" o:gfxdata="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" fillcolor="#c00000" strokecolor="#ed7d31 [3205]" strokeweight="1pt">
                 <v:fill opacity="15163f"/>
                 <v:stroke joinstyle="miter"/>
               </v:oval>
@@ -1042,7 +1080,7 @@
         <mc:AlternateContent>
           <mc:Choice Requires="wps">
             <w:drawing>
-              <wp:anchor distT="0" distB="0" distL="114300" distR="114300" simplePos="0" relativeHeight="251671552" behindDoc="0" locked="0" layoutInCell="1" allowOverlap="1" wp14:anchorId="1C350D6E" wp14:editId="50FA43F9">
+              <wp:anchor distT="0" distB="0" distL="114300" distR="114300" simplePos="0" relativeHeight="251658245" behindDoc="0" locked="0" layoutInCell="1" allowOverlap="1" wp14:anchorId="1C350D6E" wp14:editId="50FA43F9">
                 <wp:simplePos x="0" y="0"/>
                 <wp:positionH relativeFrom="column">
                   <wp:posOffset>873298</wp:posOffset>
@@ -1108,7 +1146,7 @@
           </mc:Choice>
           <mc:Fallback>
             <w:pict>
-              <v:oval w14:anchorId="76E7C650" id="Ellipse 14" o:spid="_x0000_s1026" style="position:absolute;margin-left:68.75pt;margin-top:299.45pt;width:62.15pt;height:13.65pt;z-index:251671552;visibility:visible;mso-wrap-style:square;mso-wrap-distance-left:9pt;mso-wrap-distance-top:0;mso-wrap-distance-right:9pt;mso-wrap-distance-bottom:0;mso-position-horizontal:absolute;mso-position-horizontal-relative:text;mso-position-vertical:absolute;mso-position-vertical-relative:text;v-text-anchor:middle" o:gfxdata="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" fillcolor="#c00000" strokecolor="#ed7d31 [3205]" strokeweight="1pt">
+              <v:oval w14:anchorId="7338BBCC" id="Ellipse 14" o:spid="_x0000_s1026" style="position:absolute;margin-left:68.75pt;margin-top:299.45pt;width:62.15pt;height:13.65pt;z-index:251658245;visibility:visible;mso-wrap-style:square;mso-wrap-distance-left:9pt;mso-wrap-distance-top:0;mso-wrap-distance-right:9pt;mso-wrap-distance-bottom:0;mso-position-horizontal:absolute;mso-position-horizontal-relative:text;mso-position-vertical:absolute;mso-position-vertical-relative:text;v-text-anchor:middle" o:gfxdata="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" fillcolor="#c00000" strokecolor="#ed7d31 [3205]" strokeweight="1pt">
                 <v:fill opacity="15163f"/>
                 <v:stroke joinstyle="miter"/>
               </v:oval>
@@ -1123,7 +1161,7 @@
         <mc:AlternateContent>
           <mc:Choice Requires="wps">
             <w:drawing>
-              <wp:anchor distT="0" distB="0" distL="114300" distR="114300" simplePos="0" relativeHeight="251667456" behindDoc="0" locked="0" layoutInCell="1" allowOverlap="1" wp14:anchorId="567673D2" wp14:editId="34A79940">
+              <wp:anchor distT="0" distB="0" distL="114300" distR="114300" simplePos="0" relativeHeight="251658243" behindDoc="0" locked="0" layoutInCell="1" allowOverlap="1" wp14:anchorId="567673D2" wp14:editId="34A79940">
                 <wp:simplePos x="0" y="0"/>
                 <wp:positionH relativeFrom="column">
                   <wp:posOffset>852806</wp:posOffset>
@@ -1195,7 +1233,7 @@
           </mc:Choice>
           <mc:Fallback>
             <w:pict>
-              <v:oval w14:anchorId="18A74690" id="Ellipse 12" o:spid="_x0000_s1026" style="position:absolute;margin-left:67.15pt;margin-top:663.35pt;width:55.65pt;height:12.55pt;z-index:251667456;visibility:visible;mso-wrap-style:square;mso-width-percent:0;mso-height-percent:0;mso-wrap-distance-left:9pt;mso-wrap-distance-top:0;mso-wrap-distance-right:9pt;mso-wrap-distance-bottom:0;mso-position-horizontal:absolute;mso-position-horizontal-relative:text;mso-position-vertical:absolute;mso-position-vertical-relative:text;mso-width-percent:0;mso-height-percent:0;mso-width-relative:margin;mso-height-relative:margin;v-text-anchor:middle" o:gfxdata="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" fillcolor="#c00000" strokecolor="#ed7d31 [3205]" strokeweight="1pt">
+              <v:oval w14:anchorId="32634E9E" id="Ellipse 12" o:spid="_x0000_s1026" style="position:absolute;margin-left:67.15pt;margin-top:663.35pt;width:55.65pt;height:12.55pt;z-index:251658243;visibility:visible;mso-wrap-style:square;mso-width-percent:0;mso-height-percent:0;mso-wrap-distance-left:9pt;mso-wrap-distance-top:0;mso-wrap-distance-right:9pt;mso-wrap-distance-bottom:0;mso-position-horizontal:absolute;mso-position-horizontal-relative:text;mso-position-vertical:absolute;mso-position-vertical-relative:text;mso-width-percent:0;mso-height-percent:0;mso-width-relative:margin;mso-height-relative:margin;v-text-anchor:middle" o:gfxdata="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" fillcolor="#c00000" strokecolor="#ed7d31 [3205]" strokeweight="1pt">
                 <v:fill opacity="15163f"/>
                 <v:stroke joinstyle="miter"/>
               </v:oval>
@@ -1258,7 +1296,7 @@
         <mc:AlternateContent>
           <mc:Choice Requires="wps">
             <w:drawing>
-              <wp:anchor distT="0" distB="0" distL="114300" distR="114300" simplePos="0" relativeHeight="251663360" behindDoc="0" locked="0" layoutInCell="1" allowOverlap="1" wp14:anchorId="2F1F79EA" wp14:editId="54DCF43D">
+              <wp:anchor distT="0" distB="0" distL="114300" distR="114300" simplePos="0" relativeHeight="251658240" behindDoc="0" locked="0" layoutInCell="1" allowOverlap="1" wp14:anchorId="2F1F79EA" wp14:editId="54DCF43D">
                 <wp:simplePos x="0" y="0"/>
                 <wp:positionH relativeFrom="column">
                   <wp:posOffset>3837998</wp:posOffset>
@@ -1330,7 +1368,7 @@
           </mc:Choice>
           <mc:Fallback>
             <w:pict>
-              <v:oval w14:anchorId="0D696BD7" id="Ellipse 5" o:spid="_x0000_s1026" style="position:absolute;margin-left:302.2pt;margin-top:69.75pt;width:43.6pt;height:9.8pt;z-index:251663360;visibility:visible;mso-wrap-style:square;mso-width-percent:0;mso-height-percent:0;mso-wrap-distance-left:9pt;mso-wrap-distance-top:0;mso-wrap-distance-right:9pt;mso-wrap-distance-bottom:0;mso-position-horizontal:absolute;mso-position-horizontal-relative:text;mso-position-vertical:absolute;mso-position-vertical-relative:text;mso-width-percent:0;mso-height-percent:0;mso-width-relative:margin;mso-height-relative:margin;v-text-anchor:middle" o:gfxdata="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" fillcolor="#c00000" strokecolor="#ed7d31 [3205]" strokeweight="1pt">
+              <v:oval w14:anchorId="40158BF9" id="Ellipse 5" o:spid="_x0000_s1026" style="position:absolute;margin-left:302.2pt;margin-top:69.75pt;width:43.6pt;height:9.8pt;z-index:251658240;visibility:visible;mso-wrap-style:square;mso-width-percent:0;mso-height-percent:0;mso-wrap-distance-left:9pt;mso-wrap-distance-top:0;mso-wrap-distance-right:9pt;mso-wrap-distance-bottom:0;mso-position-horizontal:absolute;mso-position-horizontal-relative:text;mso-position-vertical:absolute;mso-position-vertical-relative:text;mso-width-percent:0;mso-height-percent:0;mso-width-relative:margin;mso-height-relative:margin;v-text-anchor:middle" o:gfxdata="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" fillcolor="#c00000" strokecolor="#ed7d31 [3205]" strokeweight="1pt">
                 <v:fill opacity="15163f"/>
                 <v:stroke joinstyle="miter"/>
               </v:oval>
@@ -1345,7 +1383,7 @@
         <mc:AlternateContent>
           <mc:Choice Requires="wps">
             <w:drawing>
-              <wp:anchor distT="0" distB="0" distL="114300" distR="114300" simplePos="0" relativeHeight="251664384" behindDoc="0" locked="0" layoutInCell="1" allowOverlap="1" wp14:anchorId="58346218" wp14:editId="4B90E3C8">
+              <wp:anchor distT="0" distB="0" distL="114300" distR="114300" simplePos="0" relativeHeight="251658241" behindDoc="0" locked="0" layoutInCell="1" allowOverlap="1" wp14:anchorId="58346218" wp14:editId="4B90E3C8">
                 <wp:simplePos x="0" y="0"/>
                 <wp:positionH relativeFrom="column">
                   <wp:posOffset>2981902</wp:posOffset>
@@ -1417,7 +1455,7 @@
           </mc:Choice>
           <mc:Fallback>
             <w:pict>
-              <v:oval w14:anchorId="021C3E59" id="Ellipse 6" o:spid="_x0000_s1026" style="position:absolute;margin-left:234.8pt;margin-top:158.15pt;width:50.2pt;height:12.5pt;z-index:251664384;visibility:visible;mso-wrap-style:square;mso-width-percent:0;mso-height-percent:0;mso-wrap-distance-left:9pt;mso-wrap-distance-top:0;mso-wrap-distance-right:9pt;mso-wrap-distance-bottom:0;mso-position-horizontal:absolute;mso-position-horizontal-relative:text;mso-position-vertical:absolute;mso-position-vertical-relative:text;mso-width-percent:0;mso-height-percent:0;mso-width-relative:margin;mso-height-relative:margin;v-text-anchor:middle" o:gfxdata="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" fillcolor="#c00000" strokecolor="#ed7d31 [3205]" strokeweight="1pt">
+              <v:oval w14:anchorId="09776D76" id="Ellipse 6" o:spid="_x0000_s1026" style="position:absolute;margin-left:234.8pt;margin-top:158.15pt;width:50.2pt;height:12.5pt;z-index:251658241;visibility:visible;mso-wrap-style:square;mso-width-percent:0;mso-height-percent:0;mso-wrap-distance-left:9pt;mso-wrap-distance-top:0;mso-wrap-distance-right:9pt;mso-wrap-distance-bottom:0;mso-position-horizontal:absolute;mso-position-horizontal-relative:text;mso-position-vertical:absolute;mso-position-vertical-relative:text;mso-width-percent:0;mso-height-percent:0;mso-width-relative:margin;mso-height-relative:margin;v-text-anchor:middle" o:gfxdata="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" fillcolor="#c00000" strokecolor="#ed7d31 [3205]" strokeweight="1pt">
                 <v:fill opacity="15163f"/>
                 <v:stroke joinstyle="miter"/>
               </v:oval>
@@ -1432,7 +1470,7 @@
         <mc:AlternateContent>
           <mc:Choice Requires="wps">
             <w:drawing>
-              <wp:anchor distT="0" distB="0" distL="114300" distR="114300" simplePos="0" relativeHeight="251665408" behindDoc="0" locked="0" layoutInCell="1" allowOverlap="1" wp14:anchorId="16DBE851" wp14:editId="1456946E">
+              <wp:anchor distT="0" distB="0" distL="114300" distR="114300" simplePos="0" relativeHeight="251658242" behindDoc="0" locked="0" layoutInCell="1" allowOverlap="1" wp14:anchorId="16DBE851" wp14:editId="1456946E">
                 <wp:simplePos x="0" y="0"/>
                 <wp:positionH relativeFrom="column">
                   <wp:posOffset>2805488</wp:posOffset>
@@ -1501,7 +1539,7 @@
           </mc:Choice>
           <mc:Fallback>
             <w:pict>
-              <v:oval w14:anchorId="7FA54EF9" id="Ellipse 7" o:spid="_x0000_s1026" style="position:absolute;margin-left:220.9pt;margin-top:315.8pt;width:115.05pt;height:15.25pt;z-index:251665408;visibility:visible;mso-wrap-style:square;mso-height-percent:0;mso-wrap-distance-left:9pt;mso-wrap-distance-top:0;mso-wrap-distance-right:9pt;mso-wrap-distance-bottom:0;mso-position-horizontal:absolute;mso-position-horizontal-relative:text;mso-position-vertical:absolute;mso-position-vertical-relative:text;mso-height-percent:0;mso-height-relative:margin;v-text-anchor:middle" o:gfxdata="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" fillcolor="#c00000" strokecolor="#ed7d31 [3205]" strokeweight="1pt">
+              <v:oval w14:anchorId="32682D04" id="Ellipse 7" o:spid="_x0000_s1026" style="position:absolute;margin-left:220.9pt;margin-top:315.8pt;width:115.05pt;height:15.25pt;z-index:251658242;visibility:visible;mso-wrap-style:square;mso-height-percent:0;mso-wrap-distance-left:9pt;mso-wrap-distance-top:0;mso-wrap-distance-right:9pt;mso-wrap-distance-bottom:0;mso-position-horizontal:absolute;mso-position-horizontal-relative:text;mso-position-vertical:absolute;mso-position-vertical-relative:text;mso-height-percent:0;mso-height-relative:margin;v-text-anchor:middle" o:gfxdata="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" fillcolor="#c00000" strokecolor="#ed7d31 [3205]" strokeweight="1pt">
                 <v:fill opacity="15163f"/>
                 <v:stroke joinstyle="miter"/>
               </v:oval>
@@ -1572,11 +1610,11 @@
       <w:pPr>
         <w:pStyle w:val="berschrift1"/>
       </w:pPr>
-      <w:bookmarkStart w:id="3" w:name="_Toc120022770"/>
+      <w:bookmarkStart w:id="4" w:name="_Toc178405150"/>
       <w:r>
         <w:t>Installation</w:t>
       </w:r>
-      <w:bookmarkEnd w:id="3"/>
+      <w:bookmarkEnd w:id="4"/>
     </w:p>
     <w:p>
       <w:r>
@@ -1745,26 +1783,1473 @@
       </w:r>
     </w:p>
     <w:p>
-      <w:r>
+      <w:pPr>
         <w:rPr>
           <w:noProof/>
         </w:rPr>
+      </w:pPr>
+      <w:r>
+        <w:rPr>
+          <w:noProof/>
+        </w:rPr>
+        <w:t xml:space="preserve"> </w:t>
+      </w:r>
+    </w:p>
+    <w:p>
+      <w:pPr>
+        <w:jc w:val="right"/>
+      </w:pPr>
+      <w:r>
         <w:lastRenderedPageBreak/>
         <mc:AlternateContent>
           <mc:Choice Requires="wps">
             <w:drawing>
-              <wp:anchor distT="0" distB="0" distL="114300" distR="114300" simplePos="0" relativeHeight="251703296" behindDoc="0" locked="0" layoutInCell="1" allowOverlap="1" wp14:anchorId="6EE4D5EF" wp14:editId="166A72CD">
+              <wp:anchor distT="0" distB="0" distL="114300" distR="114300" simplePos="0" relativeHeight="251658270" behindDoc="0" locked="0" layoutInCell="1" allowOverlap="1" wp14:anchorId="748CDCE7" wp14:editId="0D895D7B">
+                <wp:simplePos x="0" y="0"/>
+                <wp:positionH relativeFrom="column">
+                  <wp:posOffset>1086485</wp:posOffset>
+                </wp:positionH>
+                <wp:positionV relativeFrom="paragraph">
+                  <wp:posOffset>669925</wp:posOffset>
+                </wp:positionV>
+                <wp:extent cx="965200" cy="6992620"/>
+                <wp:effectExtent l="0" t="0" r="25400" b="36830"/>
+                <wp:wrapNone/>
+                <wp:docPr id="38" name="Verbinder: gewinkelt 38"/>
+                <wp:cNvGraphicFramePr/>
+                <a:graphic xmlns:a="http://schemas.openxmlformats.org/drawingml/2006/main">
+                  <a:graphicData uri="http://schemas.microsoft.com/office/word/2010/wordprocessingShape">
+                    <wps:wsp>
+                      <wps:cNvCnPr/>
+                      <wps:spPr>
+                        <a:xfrm flipH="1">
+                          <a:off x="0" y="0"/>
+                          <a:ext cx="965200" cy="6992620"/>
+                        </a:xfrm>
+                        <a:prstGeom prst="bentConnector3">
+                          <a:avLst/>
+                        </a:prstGeom>
+                      </wps:spPr>
+                      <wps:style>
+                        <a:lnRef idx="1">
+                          <a:schemeClr val="accent1"/>
+                        </a:lnRef>
+                        <a:fillRef idx="0">
+                          <a:schemeClr val="accent1"/>
+                        </a:fillRef>
+                        <a:effectRef idx="0">
+                          <a:schemeClr val="accent1"/>
+                        </a:effectRef>
+                        <a:fontRef idx="minor">
+                          <a:schemeClr val="tx1"/>
+                        </a:fontRef>
+                      </wps:style>
+                      <wps:bodyPr/>
+                    </wps:wsp>
+                  </a:graphicData>
+                </a:graphic>
+                <wp14:sizeRelH relativeFrom="margin">
+                  <wp14:pctWidth>0</wp14:pctWidth>
+                </wp14:sizeRelH>
+                <wp14:sizeRelV relativeFrom="margin">
+                  <wp14:pctHeight>0</wp14:pctHeight>
+                </wp14:sizeRelV>
+              </wp:anchor>
+            </w:drawing>
+          </mc:Choice>
+          <mc:Fallback>
+            <w:pict>
+              <v:shapetype w14:anchorId="6E5DC204" id="_x0000_t34" coordsize="21600,21600" o:spt="34" o:oned="t" adj="10800" path="m,l@0,0@0,21600,21600,21600e" filled="f">
+                <v:stroke joinstyle="miter"/>
+                <v:formulas>
+                  <v:f eqn="val #0"/>
+                </v:formulas>
+                <v:path arrowok="t" fillok="f" o:connecttype="none"/>
+                <v:handles>
+                  <v:h position="#0,center"/>
+                </v:handles>
+                <o:lock v:ext="edit" shapetype="t"/>
+              </v:shapetype>
+              <v:shape id="Verbinder: gewinkelt 38" o:spid="_x0000_s1026" type="#_x0000_t34" style="position:absolute;margin-left:85.55pt;margin-top:52.75pt;width:76pt;height:550.6pt;flip:x;z-index:251658270;visibility:visible;mso-wrap-style:square;mso-width-percent:0;mso-height-percent:0;mso-wrap-distance-left:9pt;mso-wrap-distance-top:0;mso-wrap-distance-right:9pt;mso-wrap-distance-bottom:0;mso-position-horizontal:absolute;mso-position-horizontal-relative:text;mso-position-vertical:absolute;mso-position-vertical-relative:text;mso-width-percent:0;mso-height-percent:0;mso-width-relative:margin;mso-height-relative:margin" o:gfxdata="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" strokecolor="#4472c4 [3204]" strokeweight=".5pt"/>
+            </w:pict>
+          </mc:Fallback>
+        </mc:AlternateContent>
+      </w:r>
+      <w:r>
+        <w:rPr>
+          <w:noProof/>
+        </w:rPr>
+        <mc:AlternateContent>
+          <mc:Choice Requires="wps">
+            <w:drawing>
+              <wp:anchor distT="0" distB="0" distL="114300" distR="114300" simplePos="0" relativeHeight="251676702" behindDoc="0" locked="0" layoutInCell="1" allowOverlap="1" wp14:anchorId="35A22209" wp14:editId="5AD011D3">
+                <wp:simplePos x="0" y="0"/>
+                <wp:positionH relativeFrom="column">
+                  <wp:posOffset>1087755</wp:posOffset>
+                </wp:positionH>
+                <wp:positionV relativeFrom="paragraph">
+                  <wp:posOffset>5226685</wp:posOffset>
+                </wp:positionV>
+                <wp:extent cx="958850" cy="2435860"/>
+                <wp:effectExtent l="0" t="0" r="12700" b="21590"/>
+                <wp:wrapNone/>
+                <wp:docPr id="47" name="Verbinder: gewinkelt 47"/>
+                <wp:cNvGraphicFramePr/>
+                <a:graphic xmlns:a="http://schemas.openxmlformats.org/drawingml/2006/main">
+                  <a:graphicData uri="http://schemas.microsoft.com/office/word/2010/wordprocessingShape">
+                    <wps:wsp>
+                      <wps:cNvCnPr/>
+                      <wps:spPr>
+                        <a:xfrm flipH="1">
+                          <a:off x="0" y="0"/>
+                          <a:ext cx="958850" cy="2435860"/>
+                        </a:xfrm>
+                        <a:prstGeom prst="bentConnector3">
+                          <a:avLst>
+                            <a:gd name="adj1" fmla="val 49760"/>
+                          </a:avLst>
+                        </a:prstGeom>
+                      </wps:spPr>
+                      <wps:style>
+                        <a:lnRef idx="1">
+                          <a:schemeClr val="accent1"/>
+                        </a:lnRef>
+                        <a:fillRef idx="0">
+                          <a:schemeClr val="accent1"/>
+                        </a:fillRef>
+                        <a:effectRef idx="0">
+                          <a:schemeClr val="accent1"/>
+                        </a:effectRef>
+                        <a:fontRef idx="minor">
+                          <a:schemeClr val="tx1"/>
+                        </a:fontRef>
+                      </wps:style>
+                      <wps:bodyPr/>
+                    </wps:wsp>
+                  </a:graphicData>
+                </a:graphic>
+                <wp14:sizeRelH relativeFrom="margin">
+                  <wp14:pctWidth>0</wp14:pctWidth>
+                </wp14:sizeRelH>
+                <wp14:sizeRelV relativeFrom="margin">
+                  <wp14:pctHeight>0</wp14:pctHeight>
+                </wp14:sizeRelV>
+              </wp:anchor>
+            </w:drawing>
+          </mc:Choice>
+          <mc:Fallback>
+            <w:pict>
+              <v:shape w14:anchorId="3C449368" id="Verbinder: gewinkelt 47" o:spid="_x0000_s1026" type="#_x0000_t34" style="position:absolute;margin-left:85.65pt;margin-top:411.55pt;width:75.5pt;height:191.8pt;flip:x;z-index:251676702;visibility:visible;mso-wrap-style:square;mso-width-percent:0;mso-height-percent:0;mso-wrap-distance-left:9pt;mso-wrap-distance-top:0;mso-wrap-distance-right:9pt;mso-wrap-distance-bottom:0;mso-position-horizontal:absolute;mso-position-horizontal-relative:text;mso-position-vertical:absolute;mso-position-vertical-relative:text;mso-width-percent:0;mso-height-percent:0;mso-width-relative:margin;mso-height-relative:margin" o:gfxdata="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" adj="10748" strokecolor="#4472c4 [3204]" strokeweight=".5pt"/>
+            </w:pict>
+          </mc:Fallback>
+        </mc:AlternateContent>
+      </w:r>
+      <w:r>
+        <w:rPr>
+          <w:noProof/>
+        </w:rPr>
+        <mc:AlternateContent>
+          <mc:Choice Requires="wps">
+            <w:drawing>
+              <wp:anchor distT="0" distB="0" distL="114300" distR="114300" simplePos="0" relativeHeight="251660318" behindDoc="0" locked="0" layoutInCell="1" allowOverlap="1" wp14:anchorId="032AC5C3" wp14:editId="462EDF05">
+                <wp:simplePos x="0" y="0"/>
+                <wp:positionH relativeFrom="column">
+                  <wp:posOffset>1106805</wp:posOffset>
+                </wp:positionH>
+                <wp:positionV relativeFrom="paragraph">
+                  <wp:posOffset>7657466</wp:posOffset>
+                </wp:positionV>
+                <wp:extent cx="944880" cy="2540"/>
+                <wp:effectExtent l="0" t="0" r="26670" b="35560"/>
+                <wp:wrapNone/>
+                <wp:docPr id="39" name="Gerader Verbinder 39"/>
+                <wp:cNvGraphicFramePr/>
+                <a:graphic xmlns:a="http://schemas.openxmlformats.org/drawingml/2006/main">
+                  <a:graphicData uri="http://schemas.microsoft.com/office/word/2010/wordprocessingShape">
+                    <wps:wsp>
+                      <wps:cNvCnPr/>
+                      <wps:spPr>
+                        <a:xfrm flipV="1">
+                          <a:off x="0" y="0"/>
+                          <a:ext cx="944880" cy="2540"/>
+                        </a:xfrm>
+                        <a:prstGeom prst="line">
+                          <a:avLst/>
+                        </a:prstGeom>
+                      </wps:spPr>
+                      <wps:style>
+                        <a:lnRef idx="1">
+                          <a:schemeClr val="accent1"/>
+                        </a:lnRef>
+                        <a:fillRef idx="0">
+                          <a:schemeClr val="accent1"/>
+                        </a:fillRef>
+                        <a:effectRef idx="0">
+                          <a:schemeClr val="accent1"/>
+                        </a:effectRef>
+                        <a:fontRef idx="minor">
+                          <a:schemeClr val="tx1"/>
+                        </a:fontRef>
+                      </wps:style>
+                      <wps:bodyPr/>
+                    </wps:wsp>
+                  </a:graphicData>
+                </a:graphic>
+                <wp14:sizeRelH relativeFrom="margin">
+                  <wp14:pctWidth>0</wp14:pctWidth>
+                </wp14:sizeRelH>
+                <wp14:sizeRelV relativeFrom="margin">
+                  <wp14:pctHeight>0</wp14:pctHeight>
+                </wp14:sizeRelV>
+              </wp:anchor>
+            </w:drawing>
+          </mc:Choice>
+          <mc:Fallback>
+            <w:pict>
+              <v:line w14:anchorId="7402323B" id="Gerader Verbinder 39" o:spid="_x0000_s1026" style="position:absolute;flip:y;z-index:251660318;visibility:visible;mso-wrap-style:square;mso-width-percent:0;mso-height-percent:0;mso-wrap-distance-left:9pt;mso-wrap-distance-top:0;mso-wrap-distance-right:9pt;mso-wrap-distance-bottom:0;mso-position-horizontal:absolute;mso-position-horizontal-relative:text;mso-position-vertical:absolute;mso-position-vertical-relative:text;mso-width-percent:0;mso-height-percent:0;mso-width-relative:margin;mso-height-relative:margin" from="87.15pt,602.95pt" to="161.55pt,603.15pt" o:gfxdata="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" strokecolor="#4472c4 [3204]" strokeweight=".5pt">
+                <v:stroke joinstyle="miter"/>
+              </v:line>
+            </w:pict>
+          </mc:Fallback>
+        </mc:AlternateContent>
+      </w:r>
+      <w:r>
+        <mc:AlternateContent>
+          <mc:Choice Requires="wps">
+            <w:drawing>
+              <wp:anchor distT="0" distB="0" distL="114300" distR="114300" simplePos="0" relativeHeight="251686942" behindDoc="0" locked="0" layoutInCell="1" allowOverlap="1" wp14:anchorId="6C2F364A" wp14:editId="68C160A6">
                 <wp:simplePos x="0" y="0"/>
                 <wp:positionH relativeFrom="margin">
-                  <wp:posOffset>-129328</wp:posOffset>
+                  <wp:posOffset>4661535</wp:posOffset>
                 </wp:positionH>
                 <wp:positionV relativeFrom="paragraph">
-                  <wp:posOffset>6250305</wp:posOffset>
+                  <wp:posOffset>4528820</wp:posOffset>
+                </wp:positionV>
+                <wp:extent cx="1349375" cy="658495"/>
+                <wp:effectExtent l="0" t="0" r="22225" b="27305"/>
+                <wp:wrapNone/>
+                <wp:docPr id="55" name="Rechteck 55"/>
+                <wp:cNvGraphicFramePr/>
+                <a:graphic xmlns:a="http://schemas.openxmlformats.org/drawingml/2006/main">
+                  <a:graphicData uri="http://schemas.microsoft.com/office/word/2010/wordprocessingShape">
+                    <wps:wsp>
+                      <wps:cNvSpPr/>
+                      <wps:spPr>
+                        <a:xfrm>
+                          <a:off x="0" y="0"/>
+                          <a:ext cx="1349375" cy="658495"/>
+                        </a:xfrm>
+                        <a:prstGeom prst="rect">
+                          <a:avLst/>
+                        </a:prstGeom>
+                        <a:solidFill>
+                          <a:srgbClr val="B5E1D0"/>
+                        </a:solidFill>
+                        <a:ln>
+                          <a:solidFill>
+                            <a:schemeClr val="accent6">
+                              <a:lumMod val="75000"/>
+                            </a:schemeClr>
+                          </a:solidFill>
+                        </a:ln>
+                      </wps:spPr>
+                      <wps:style>
+                        <a:lnRef idx="2">
+                          <a:schemeClr val="accent1">
+                            <a:shade val="50000"/>
+                          </a:schemeClr>
+                        </a:lnRef>
+                        <a:fillRef idx="1">
+                          <a:schemeClr val="accent1"/>
+                        </a:fillRef>
+                        <a:effectRef idx="0">
+                          <a:schemeClr val="accent1"/>
+                        </a:effectRef>
+                        <a:fontRef idx="minor">
+                          <a:schemeClr val="lt1"/>
+                        </a:fontRef>
+                      </wps:style>
+                      <wps:txbx>
+                        <w:txbxContent>
+                          <w:p>
+                            <w:pPr>
+                              <w:jc w:val="center"/>
+                              <w:rPr>
+                                <w:color w:val="000000" w:themeColor="text1"/>
+                                <w14:shadow w14:blurRad="38100" w14:dist="19050" w14:dir="2700000" w14:sx="100000" w14:sy="100000" w14:kx="0" w14:ky="0" w14:algn="tl">
+                                  <w14:schemeClr w14:val="dk1">
+                                    <w14:alpha w14:val="60000"/>
+                                  </w14:schemeClr>
+                                </w14:shadow>
+                                <w14:textOutline w14:w="0" w14:cap="flat" w14:cmpd="sng" w14:algn="ctr">
+                                  <w14:noFill/>
+                                  <w14:prstDash w14:val="solid"/>
+                                  <w14:round/>
+                                </w14:textOutline>
+                              </w:rPr>
+                            </w:pPr>
+                            <w:r>
+                              <w:rPr>
+                                <w:color w:val="000000" w:themeColor="text1"/>
+                                <w14:shadow w14:blurRad="38100" w14:dist="19050" w14:dir="2700000" w14:sx="100000" w14:sy="100000" w14:kx="0" w14:ky="0" w14:algn="tl">
+                                  <w14:schemeClr w14:val="dk1">
+                                    <w14:alpha w14:val="60000"/>
+                                  </w14:schemeClr>
+                                </w14:shadow>
+                                <w14:textOutline w14:w="0" w14:cap="flat" w14:cmpd="sng" w14:algn="ctr">
+                                  <w14:noFill/>
+                                  <w14:prstDash w14:val="solid"/>
+                                  <w14:round/>
+                                </w14:textOutline>
+                              </w:rPr>
+                              <w:t>auszutauschende/ zu überschreibende</w:t>
+                            </w:r>
+                            <w:r>
+                              <w:rPr>
+                                <w:color w:val="000000" w:themeColor="text1"/>
+                                <w14:shadow w14:blurRad="38100" w14:dist="19050" w14:dir="2700000" w14:sx="100000" w14:sy="100000" w14:kx="0" w14:ky="0" w14:algn="tl">
+                                  <w14:schemeClr w14:val="dk1">
+                                    <w14:alpha w14:val="60000"/>
+                                  </w14:schemeClr>
+                                </w14:shadow>
+                                <w14:textOutline w14:w="0" w14:cap="flat" w14:cmpd="sng" w14:algn="ctr">
+                                  <w14:noFill/>
+                                  <w14:prstDash w14:val="solid"/>
+                                  <w14:round/>
+                                </w14:textOutline>
+                              </w:rPr>
+                              <w:t xml:space="preserve"> Dateien</w:t>
+                            </w:r>
+                          </w:p>
+                        </w:txbxContent>
+                      </wps:txbx>
+                      <wps:bodyPr rot="0" spcFirstLastPara="0" vertOverflow="overflow" horzOverflow="overflow" vert="horz" wrap="square" lIns="91440" tIns="45720" rIns="91440" bIns="45720" numCol="1" spcCol="0" rtlCol="0" fromWordArt="0" anchor="ctr" anchorCtr="0" forceAA="0" compatLnSpc="1">
+                        <a:prstTxWarp prst="textNoShape">
+                          <a:avLst/>
+                        </a:prstTxWarp>
+                        <a:noAutofit/>
+                      </wps:bodyPr>
+                    </wps:wsp>
+                  </a:graphicData>
+                </a:graphic>
+                <wp14:sizeRelH relativeFrom="margin">
+                  <wp14:pctWidth>0</wp14:pctWidth>
+                </wp14:sizeRelH>
+                <wp14:sizeRelV relativeFrom="margin">
+                  <wp14:pctHeight>0</wp14:pctHeight>
+                </wp14:sizeRelV>
+              </wp:anchor>
+            </w:drawing>
+          </mc:Choice>
+          <mc:Fallback>
+            <w:pict>
+              <v:rect w14:anchorId="6C2F364A" id="Rechteck 55" o:spid="_x0000_s1026" style="position:absolute;left:0;text-align:left;margin-left:367.05pt;margin-top:356.6pt;width:106.25pt;height:51.85pt;z-index:251686942;visibility:visible;mso-wrap-style:square;mso-width-percent:0;mso-height-percent:0;mso-wrap-distance-left:9pt;mso-wrap-distance-top:0;mso-wrap-distance-right:9pt;mso-wrap-distance-bottom:0;mso-position-horizontal:absolute;mso-position-horizontal-relative:margin;mso-position-vertical:absolute;mso-position-vertical-relative:text;mso-width-percent:0;mso-height-percent:0;mso-width-relative:margin;mso-height-relative:margin;v-text-anchor:middle" o:gfxdata="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" fillcolor="#b5e1d0" strokecolor="#538135 [2409]" strokeweight="1pt">
+                <v:textbox>
+                  <w:txbxContent>
+                    <w:p>
+                      <w:pPr>
+                        <w:jc w:val="center"/>
+                        <w:rPr>
+                          <w:color w:val="000000" w:themeColor="text1"/>
+                          <w14:shadow w14:blurRad="38100" w14:dist="19050" w14:dir="2700000" w14:sx="100000" w14:sy="100000" w14:kx="0" w14:ky="0" w14:algn="tl">
+                            <w14:schemeClr w14:val="dk1">
+                              <w14:alpha w14:val="60000"/>
+                            </w14:schemeClr>
+                          </w14:shadow>
+                          <w14:textOutline w14:w="0" w14:cap="flat" w14:cmpd="sng" w14:algn="ctr">
+                            <w14:noFill/>
+                            <w14:prstDash w14:val="solid"/>
+                            <w14:round/>
+                          </w14:textOutline>
+                        </w:rPr>
+                      </w:pPr>
+                      <w:r>
+                        <w:rPr>
+                          <w:color w:val="000000" w:themeColor="text1"/>
+                          <w14:shadow w14:blurRad="38100" w14:dist="19050" w14:dir="2700000" w14:sx="100000" w14:sy="100000" w14:kx="0" w14:ky="0" w14:algn="tl">
+                            <w14:schemeClr w14:val="dk1">
+                              <w14:alpha w14:val="60000"/>
+                            </w14:schemeClr>
+                          </w14:shadow>
+                          <w14:textOutline w14:w="0" w14:cap="flat" w14:cmpd="sng" w14:algn="ctr">
+                            <w14:noFill/>
+                            <w14:prstDash w14:val="solid"/>
+                            <w14:round/>
+                          </w14:textOutline>
+                        </w:rPr>
+                        <w:t>auszutauschende/ zu überschreibende</w:t>
+                      </w:r>
+                      <w:r>
+                        <w:rPr>
+                          <w:color w:val="000000" w:themeColor="text1"/>
+                          <w14:shadow w14:blurRad="38100" w14:dist="19050" w14:dir="2700000" w14:sx="100000" w14:sy="100000" w14:kx="0" w14:ky="0" w14:algn="tl">
+                            <w14:schemeClr w14:val="dk1">
+                              <w14:alpha w14:val="60000"/>
+                            </w14:schemeClr>
+                          </w14:shadow>
+                          <w14:textOutline w14:w="0" w14:cap="flat" w14:cmpd="sng" w14:algn="ctr">
+                            <w14:noFill/>
+                            <w14:prstDash w14:val="solid"/>
+                            <w14:round/>
+                          </w14:textOutline>
+                        </w:rPr>
+                        <w:t xml:space="preserve"> Dateien</w:t>
+                      </w:r>
+                    </w:p>
+                  </w:txbxContent>
+                </v:textbox>
+                <w10:wrap anchorx="margin"/>
+              </v:rect>
+            </w:pict>
+          </mc:Fallback>
+        </mc:AlternateContent>
+      </w:r>
+      <w:r>
+        <mc:AlternateContent>
+          <mc:Choice Requires="wps">
+            <w:drawing>
+              <wp:anchor distT="0" distB="0" distL="114300" distR="114300" simplePos="0" relativeHeight="251685918" behindDoc="0" locked="0" layoutInCell="1" allowOverlap="1" wp14:anchorId="122E2B76" wp14:editId="2F62F378">
+                <wp:simplePos x="0" y="0"/>
+                <wp:positionH relativeFrom="column">
+                  <wp:posOffset>3804285</wp:posOffset>
+                </wp:positionH>
+                <wp:positionV relativeFrom="paragraph">
+                  <wp:posOffset>4860925</wp:posOffset>
+                </wp:positionV>
+                <wp:extent cx="858520" cy="949960"/>
+                <wp:effectExtent l="0" t="0" r="17780" b="21590"/>
+                <wp:wrapNone/>
+                <wp:docPr id="54" name="Verbinder: gewinkelt 54"/>
+                <wp:cNvGraphicFramePr/>
+                <a:graphic xmlns:a="http://schemas.openxmlformats.org/drawingml/2006/main">
+                  <a:graphicData uri="http://schemas.microsoft.com/office/word/2010/wordprocessingShape">
+                    <wps:wsp>
+                      <wps:cNvCnPr/>
+                      <wps:spPr>
+                        <a:xfrm flipV="1">
+                          <a:off x="0" y="0"/>
+                          <a:ext cx="858520" cy="949960"/>
+                        </a:xfrm>
+                        <a:prstGeom prst="bentConnector3">
+                          <a:avLst>
+                            <a:gd name="adj1" fmla="val 38194"/>
+                          </a:avLst>
+                        </a:prstGeom>
+                      </wps:spPr>
+                      <wps:style>
+                        <a:lnRef idx="1">
+                          <a:schemeClr val="accent6"/>
+                        </a:lnRef>
+                        <a:fillRef idx="0">
+                          <a:schemeClr val="accent6"/>
+                        </a:fillRef>
+                        <a:effectRef idx="0">
+                          <a:schemeClr val="accent6"/>
+                        </a:effectRef>
+                        <a:fontRef idx="minor">
+                          <a:schemeClr val="tx1"/>
+                        </a:fontRef>
+                      </wps:style>
+                      <wps:bodyPr/>
+                    </wps:wsp>
+                  </a:graphicData>
+                </a:graphic>
+                <wp14:sizeRelH relativeFrom="margin">
+                  <wp14:pctWidth>0</wp14:pctWidth>
+                </wp14:sizeRelH>
+                <wp14:sizeRelV relativeFrom="margin">
+                  <wp14:pctHeight>0</wp14:pctHeight>
+                </wp14:sizeRelV>
+              </wp:anchor>
+            </w:drawing>
+          </mc:Choice>
+          <mc:Fallback>
+            <w:pict>
+              <v:shape w14:anchorId="6F79A391" id="Verbinder: gewinkelt 54" o:spid="_x0000_s1026" type="#_x0000_t34" style="position:absolute;margin-left:299.55pt;margin-top:382.75pt;width:67.6pt;height:74.8pt;flip:y;z-index:251685918;visibility:visible;mso-wrap-style:square;mso-width-percent:0;mso-height-percent:0;mso-wrap-distance-left:9pt;mso-wrap-distance-top:0;mso-wrap-distance-right:9pt;mso-wrap-distance-bottom:0;mso-position-horizontal:absolute;mso-position-horizontal-relative:text;mso-position-vertical:absolute;mso-position-vertical-relative:text;mso-width-percent:0;mso-height-percent:0;mso-width-relative:margin;mso-height-relative:margin" o:gfxdata="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" adj="8250" strokecolor="#70ad47 [3209]" strokeweight=".5pt"/>
+            </w:pict>
+          </mc:Fallback>
+        </mc:AlternateContent>
+      </w:r>
+      <w:r>
+        <mc:AlternateContent>
+          <mc:Choice Requires="wps">
+            <w:drawing>
+              <wp:anchor distT="0" distB="0" distL="114300" distR="114300" simplePos="0" relativeHeight="251684894" behindDoc="0" locked="0" layoutInCell="1" allowOverlap="1" wp14:anchorId="77E6D1A6" wp14:editId="63C986BC">
+                <wp:simplePos x="0" y="0"/>
+                <wp:positionH relativeFrom="column">
+                  <wp:posOffset>3804285</wp:posOffset>
+                </wp:positionH>
+                <wp:positionV relativeFrom="paragraph">
+                  <wp:posOffset>4286885</wp:posOffset>
+                </wp:positionV>
+                <wp:extent cx="858520" cy="574040"/>
+                <wp:effectExtent l="0" t="0" r="17780" b="35560"/>
+                <wp:wrapNone/>
+                <wp:docPr id="53" name="Verbinder: gewinkelt 53"/>
+                <wp:cNvGraphicFramePr/>
+                <a:graphic xmlns:a="http://schemas.openxmlformats.org/drawingml/2006/main">
+                  <a:graphicData uri="http://schemas.microsoft.com/office/word/2010/wordprocessingShape">
+                    <wps:wsp>
+                      <wps:cNvCnPr/>
+                      <wps:spPr>
+                        <a:xfrm>
+                          <a:off x="0" y="0"/>
+                          <a:ext cx="858520" cy="574040"/>
+                        </a:xfrm>
+                        <a:prstGeom prst="bentConnector3">
+                          <a:avLst>
+                            <a:gd name="adj1" fmla="val 38052"/>
+                          </a:avLst>
+                        </a:prstGeom>
+                      </wps:spPr>
+                      <wps:style>
+                        <a:lnRef idx="1">
+                          <a:schemeClr val="accent6"/>
+                        </a:lnRef>
+                        <a:fillRef idx="0">
+                          <a:schemeClr val="accent6"/>
+                        </a:fillRef>
+                        <a:effectRef idx="0">
+                          <a:schemeClr val="accent6"/>
+                        </a:effectRef>
+                        <a:fontRef idx="minor">
+                          <a:schemeClr val="tx1"/>
+                        </a:fontRef>
+                      </wps:style>
+                      <wps:bodyPr/>
+                    </wps:wsp>
+                  </a:graphicData>
+                </a:graphic>
+                <wp14:sizeRelH relativeFrom="margin">
+                  <wp14:pctWidth>0</wp14:pctWidth>
+                </wp14:sizeRelH>
+                <wp14:sizeRelV relativeFrom="margin">
+                  <wp14:pctHeight>0</wp14:pctHeight>
+                </wp14:sizeRelV>
+              </wp:anchor>
+            </w:drawing>
+          </mc:Choice>
+          <mc:Fallback>
+            <w:pict>
+              <v:shape w14:anchorId="63FDC1B4" id="Verbinder: gewinkelt 53" o:spid="_x0000_s1026" type="#_x0000_t34" style="position:absolute;margin-left:299.55pt;margin-top:337.55pt;width:67.6pt;height:45.2pt;z-index:251684894;visibility:visible;mso-wrap-style:square;mso-width-percent:0;mso-height-percent:0;mso-wrap-distance-left:9pt;mso-wrap-distance-top:0;mso-wrap-distance-right:9pt;mso-wrap-distance-bottom:0;mso-position-horizontal:absolute;mso-position-horizontal-relative:text;mso-position-vertical:absolute;mso-position-vertical-relative:text;mso-width-percent:0;mso-height-percent:0;mso-width-relative:margin;mso-height-relative:margin" o:gfxdata="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" adj="8219" strokecolor="#70ad47 [3209]" strokeweight=".5pt"/>
+            </w:pict>
+          </mc:Fallback>
+        </mc:AlternateContent>
+      </w:r>
+      <w:r>
+        <mc:AlternateContent>
+          <mc:Choice Requires="wps">
+            <w:drawing>
+              <wp:anchor distT="0" distB="0" distL="114300" distR="114300" simplePos="0" relativeHeight="251678750" behindDoc="0" locked="0" layoutInCell="1" allowOverlap="1" wp14:anchorId="59F44FC1" wp14:editId="6C7ECF1F">
+                <wp:simplePos x="0" y="0"/>
+                <wp:positionH relativeFrom="column">
+                  <wp:posOffset>1035685</wp:posOffset>
+                </wp:positionH>
+                <wp:positionV relativeFrom="paragraph">
+                  <wp:posOffset>2742565</wp:posOffset>
+                </wp:positionV>
+                <wp:extent cx="1017270" cy="1935480"/>
+                <wp:effectExtent l="0" t="0" r="11430" b="26670"/>
+                <wp:wrapNone/>
+                <wp:docPr id="48" name="Verbinder: gewinkelt 48"/>
+                <wp:cNvGraphicFramePr/>
+                <a:graphic xmlns:a="http://schemas.openxmlformats.org/drawingml/2006/main">
+                  <a:graphicData uri="http://schemas.microsoft.com/office/word/2010/wordprocessingShape">
+                    <wps:wsp>
+                      <wps:cNvCnPr/>
+                      <wps:spPr>
+                        <a:xfrm flipH="1">
+                          <a:off x="0" y="0"/>
+                          <a:ext cx="1017270" cy="1935480"/>
+                        </a:xfrm>
+                        <a:prstGeom prst="bentConnector3">
+                          <a:avLst>
+                            <a:gd name="adj1" fmla="val 72111"/>
+                          </a:avLst>
+                        </a:prstGeom>
+                      </wps:spPr>
+                      <wps:style>
+                        <a:lnRef idx="1">
+                          <a:schemeClr val="accent2"/>
+                        </a:lnRef>
+                        <a:fillRef idx="0">
+                          <a:schemeClr val="accent2"/>
+                        </a:fillRef>
+                        <a:effectRef idx="0">
+                          <a:schemeClr val="accent2"/>
+                        </a:effectRef>
+                        <a:fontRef idx="minor">
+                          <a:schemeClr val="tx1"/>
+                        </a:fontRef>
+                      </wps:style>
+                      <wps:bodyPr/>
+                    </wps:wsp>
+                  </a:graphicData>
+                </a:graphic>
+                <wp14:sizeRelH relativeFrom="margin">
+                  <wp14:pctWidth>0</wp14:pctWidth>
+                </wp14:sizeRelH>
+                <wp14:sizeRelV relativeFrom="margin">
+                  <wp14:pctHeight>0</wp14:pctHeight>
+                </wp14:sizeRelV>
+              </wp:anchor>
+            </w:drawing>
+          </mc:Choice>
+          <mc:Fallback>
+            <w:pict>
+              <v:shape w14:anchorId="74541C9B" id="Verbinder: gewinkelt 48" o:spid="_x0000_s1026" type="#_x0000_t34" style="position:absolute;margin-left:81.55pt;margin-top:215.95pt;width:80.1pt;height:152.4pt;flip:x;z-index:251678750;visibility:visible;mso-wrap-style:square;mso-width-percent:0;mso-height-percent:0;mso-wrap-distance-left:9pt;mso-wrap-distance-top:0;mso-wrap-distance-right:9pt;mso-wrap-distance-bottom:0;mso-position-horizontal:absolute;mso-position-horizontal-relative:text;mso-position-vertical:absolute;mso-position-vertical-relative:text;mso-width-percent:0;mso-height-percent:0;mso-width-relative:margin;mso-height-relative:margin" o:gfxdata="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" adj="15576" strokecolor="#ed7d31 [3205]" strokeweight=".5pt"/>
+            </w:pict>
+          </mc:Fallback>
+        </mc:AlternateContent>
+      </w:r>
+      <w:r>
+        <mc:AlternateContent>
+          <mc:Choice Requires="wps">
+            <w:drawing>
+              <wp:anchor distT="0" distB="0" distL="114300" distR="114300" simplePos="0" relativeHeight="251680798" behindDoc="0" locked="0" layoutInCell="1" allowOverlap="1" wp14:anchorId="1E5D0631" wp14:editId="57DCC7D4">
+                <wp:simplePos x="0" y="0"/>
+                <wp:positionH relativeFrom="column">
+                  <wp:posOffset>1034414</wp:posOffset>
+                </wp:positionH>
+                <wp:positionV relativeFrom="paragraph">
+                  <wp:posOffset>4678045</wp:posOffset>
+                </wp:positionV>
+                <wp:extent cx="992505" cy="1821180"/>
+                <wp:effectExtent l="0" t="0" r="17145" b="26670"/>
+                <wp:wrapNone/>
+                <wp:docPr id="50" name="Verbinder: gewinkelt 50"/>
+                <wp:cNvGraphicFramePr/>
+                <a:graphic xmlns:a="http://schemas.openxmlformats.org/drawingml/2006/main">
+                  <a:graphicData uri="http://schemas.microsoft.com/office/word/2010/wordprocessingShape">
+                    <wps:wsp>
+                      <wps:cNvCnPr/>
+                      <wps:spPr>
+                        <a:xfrm flipH="1" flipV="1">
+                          <a:off x="0" y="0"/>
+                          <a:ext cx="992505" cy="1821180"/>
+                        </a:xfrm>
+                        <a:prstGeom prst="bentConnector3">
+                          <a:avLst>
+                            <a:gd name="adj1" fmla="val 71523"/>
+                          </a:avLst>
+                        </a:prstGeom>
+                      </wps:spPr>
+                      <wps:style>
+                        <a:lnRef idx="1">
+                          <a:schemeClr val="accent2"/>
+                        </a:lnRef>
+                        <a:fillRef idx="0">
+                          <a:schemeClr val="accent2"/>
+                        </a:fillRef>
+                        <a:effectRef idx="0">
+                          <a:schemeClr val="accent2"/>
+                        </a:effectRef>
+                        <a:fontRef idx="minor">
+                          <a:schemeClr val="tx1"/>
+                        </a:fontRef>
+                      </wps:style>
+                      <wps:bodyPr/>
+                    </wps:wsp>
+                  </a:graphicData>
+                </a:graphic>
+                <wp14:sizeRelH relativeFrom="margin">
+                  <wp14:pctWidth>0</wp14:pctWidth>
+                </wp14:sizeRelH>
+                <wp14:sizeRelV relativeFrom="margin">
+                  <wp14:pctHeight>0</wp14:pctHeight>
+                </wp14:sizeRelV>
+              </wp:anchor>
+            </w:drawing>
+          </mc:Choice>
+          <mc:Fallback>
+            <w:pict>
+              <v:shape w14:anchorId="3CD6793B" id="Verbinder: gewinkelt 50" o:spid="_x0000_s1026" type="#_x0000_t34" style="position:absolute;margin-left:81.45pt;margin-top:368.35pt;width:78.15pt;height:143.4pt;flip:x y;z-index:251680798;visibility:visible;mso-wrap-style:square;mso-width-percent:0;mso-height-percent:0;mso-wrap-distance-left:9pt;mso-wrap-distance-top:0;mso-wrap-distance-right:9pt;mso-wrap-distance-bottom:0;mso-position-horizontal:absolute;mso-position-horizontal-relative:text;mso-position-vertical:absolute;mso-position-vertical-relative:text;mso-width-percent:0;mso-height-percent:0;mso-width-relative:margin;mso-height-relative:margin" o:gfxdata="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" adj="15449" strokecolor="#ed7d31 [3205]" strokeweight=".5pt"/>
+            </w:pict>
+          </mc:Fallback>
+        </mc:AlternateContent>
+      </w:r>
+      <w:r>
+        <mc:AlternateContent>
+          <mc:Choice Requires="wps">
+            <w:drawing>
+              <wp:anchor distT="0" distB="0" distL="114300" distR="114300" simplePos="0" relativeHeight="251681822" behindDoc="0" locked="0" layoutInCell="1" allowOverlap="1" wp14:anchorId="6E922FC0" wp14:editId="4BEAFBB0">
+                <wp:simplePos x="0" y="0"/>
+                <wp:positionH relativeFrom="column">
+                  <wp:posOffset>36830</wp:posOffset>
+                </wp:positionH>
+                <wp:positionV relativeFrom="paragraph">
+                  <wp:posOffset>4331970</wp:posOffset>
+                </wp:positionV>
+                <wp:extent cx="996950" cy="706120"/>
+                <wp:effectExtent l="0" t="0" r="12700" b="17780"/>
+                <wp:wrapNone/>
+                <wp:docPr id="51" name="Rechteck 51"/>
+                <wp:cNvGraphicFramePr/>
+                <a:graphic xmlns:a="http://schemas.openxmlformats.org/drawingml/2006/main">
+                  <a:graphicData uri="http://schemas.microsoft.com/office/word/2010/wordprocessingShape">
+                    <wps:wsp>
+                      <wps:cNvSpPr/>
+                      <wps:spPr>
+                        <a:xfrm>
+                          <a:off x="0" y="0"/>
+                          <a:ext cx="996950" cy="706120"/>
+                        </a:xfrm>
+                        <a:prstGeom prst="rect">
+                          <a:avLst/>
+                        </a:prstGeom>
+                        <a:solidFill>
+                          <a:srgbClr val="C00000">
+                            <a:alpha val="23137"/>
+                          </a:srgbClr>
+                        </a:solidFill>
+                        <a:ln>
+                          <a:solidFill>
+                            <a:schemeClr val="accent2"/>
+                          </a:solidFill>
+                        </a:ln>
+                      </wps:spPr>
+                      <wps:style>
+                        <a:lnRef idx="2">
+                          <a:schemeClr val="accent1">
+                            <a:shade val="50000"/>
+                          </a:schemeClr>
+                        </a:lnRef>
+                        <a:fillRef idx="1">
+                          <a:schemeClr val="accent1"/>
+                        </a:fillRef>
+                        <a:effectRef idx="0">
+                          <a:schemeClr val="accent1"/>
+                        </a:effectRef>
+                        <a:fontRef idx="minor">
+                          <a:schemeClr val="lt1"/>
+                        </a:fontRef>
+                      </wps:style>
+                      <wps:txbx>
+                        <w:txbxContent>
+                          <w:p>
+                            <w:pPr>
+                              <w:jc w:val="center"/>
+                              <w:rPr>
+                                <w:color w:val="000000" w:themeColor="text1"/>
+                                <w14:shadow w14:blurRad="38100" w14:dist="19050" w14:dir="2700000" w14:sx="100000" w14:sy="100000" w14:kx="0" w14:ky="0" w14:algn="tl">
+                                  <w14:schemeClr w14:val="dk1">
+                                    <w14:alpha w14:val="60000"/>
+                                  </w14:schemeClr>
+                                </w14:shadow>
+                                <w14:textOutline w14:w="0" w14:cap="flat" w14:cmpd="sng" w14:algn="ctr">
+                                  <w14:noFill/>
+                                  <w14:prstDash w14:val="solid"/>
+                                  <w14:round/>
+                                </w14:textOutline>
+                              </w:rPr>
+                            </w:pPr>
+                            <w:r>
+                              <w:rPr>
+                                <w:color w:val="000000" w:themeColor="text1"/>
+                                <w14:shadow w14:blurRad="38100" w14:dist="19050" w14:dir="2700000" w14:sx="100000" w14:sy="100000" w14:kx="0" w14:ky="0" w14:algn="tl">
+                                  <w14:schemeClr w14:val="dk1">
+                                    <w14:alpha w14:val="60000"/>
+                                  </w14:schemeClr>
+                                </w14:shadow>
+                                <w14:textOutline w14:w="0" w14:cap="flat" w14:cmpd="sng" w14:algn="ctr">
+                                  <w14:noFill/>
+                                  <w14:prstDash w14:val="solid"/>
+                                  <w14:round/>
+                                </w14:textOutline>
+                              </w:rPr>
+                              <w:t>n</w:t>
+                            </w:r>
+                            <w:r>
+                              <w:rPr>
+                                <w:color w:val="000000" w:themeColor="text1"/>
+                                <w14:shadow w14:blurRad="38100" w14:dist="19050" w14:dir="2700000" w14:sx="100000" w14:sy="100000" w14:kx="0" w14:ky="0" w14:algn="tl">
+                                  <w14:schemeClr w14:val="dk1">
+                                    <w14:alpha w14:val="60000"/>
+                                  </w14:schemeClr>
+                                </w14:shadow>
+                                <w14:textOutline w14:w="0" w14:cap="flat" w14:cmpd="sng" w14:algn="ctr">
+                                  <w14:noFill/>
+                                  <w14:prstDash w14:val="solid"/>
+                                  <w14:round/>
+                                </w14:textOutline>
+                              </w:rPr>
+                              <w:t>eu einzufügende Dateien</w:t>
+                            </w:r>
+                          </w:p>
+                        </w:txbxContent>
+                      </wps:txbx>
+                      <wps:bodyPr rot="0" spcFirstLastPara="0" vertOverflow="overflow" horzOverflow="overflow" vert="horz" wrap="square" lIns="91440" tIns="45720" rIns="91440" bIns="45720" numCol="1" spcCol="0" rtlCol="0" fromWordArt="0" anchor="ctr" anchorCtr="0" forceAA="0" compatLnSpc="1">
+                        <a:prstTxWarp prst="textNoShape">
+                          <a:avLst/>
+                        </a:prstTxWarp>
+                        <a:noAutofit/>
+                      </wps:bodyPr>
+                    </wps:wsp>
+                  </a:graphicData>
+                </a:graphic>
+                <wp14:sizeRelH relativeFrom="margin">
+                  <wp14:pctWidth>0</wp14:pctWidth>
+                </wp14:sizeRelH>
+                <wp14:sizeRelV relativeFrom="margin">
+                  <wp14:pctHeight>0</wp14:pctHeight>
+                </wp14:sizeRelV>
+              </wp:anchor>
+            </w:drawing>
+          </mc:Choice>
+          <mc:Fallback>
+            <w:pict>
+              <v:rect w14:anchorId="6E922FC0" id="Rechteck 51" o:spid="_x0000_s1027" style="position:absolute;left:0;text-align:left;margin-left:2.9pt;margin-top:341.1pt;width:78.5pt;height:55.6pt;z-index:251681822;visibility:visible;mso-wrap-style:square;mso-width-percent:0;mso-height-percent:0;mso-wrap-distance-left:9pt;mso-wrap-distance-top:0;mso-wrap-distance-right:9pt;mso-wrap-distance-bottom:0;mso-position-horizontal:absolute;mso-position-horizontal-relative:text;mso-position-vertical:absolute;mso-position-vertical-relative:text;mso-width-percent:0;mso-height-percent:0;mso-width-relative:margin;mso-height-relative:margin;v-text-anchor:middle" o:gfxdata="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" fillcolor="#c00000" strokecolor="#ed7d31 [3205]" strokeweight="1pt">
+                <v:fill opacity="15163f"/>
+                <v:textbox>
+                  <w:txbxContent>
+                    <w:p>
+                      <w:pPr>
+                        <w:jc w:val="center"/>
+                        <w:rPr>
+                          <w:color w:val="000000" w:themeColor="text1"/>
+                          <w14:shadow w14:blurRad="38100" w14:dist="19050" w14:dir="2700000" w14:sx="100000" w14:sy="100000" w14:kx="0" w14:ky="0" w14:algn="tl">
+                            <w14:schemeClr w14:val="dk1">
+                              <w14:alpha w14:val="60000"/>
+                            </w14:schemeClr>
+                          </w14:shadow>
+                          <w14:textOutline w14:w="0" w14:cap="flat" w14:cmpd="sng" w14:algn="ctr">
+                            <w14:noFill/>
+                            <w14:prstDash w14:val="solid"/>
+                            <w14:round/>
+                          </w14:textOutline>
+                        </w:rPr>
+                      </w:pPr>
+                      <w:r>
+                        <w:rPr>
+                          <w:color w:val="000000" w:themeColor="text1"/>
+                          <w14:shadow w14:blurRad="38100" w14:dist="19050" w14:dir="2700000" w14:sx="100000" w14:sy="100000" w14:kx="0" w14:ky="0" w14:algn="tl">
+                            <w14:schemeClr w14:val="dk1">
+                              <w14:alpha w14:val="60000"/>
+                            </w14:schemeClr>
+                          </w14:shadow>
+                          <w14:textOutline w14:w="0" w14:cap="flat" w14:cmpd="sng" w14:algn="ctr">
+                            <w14:noFill/>
+                            <w14:prstDash w14:val="solid"/>
+                            <w14:round/>
+                          </w14:textOutline>
+                        </w:rPr>
+                        <w:t>n</w:t>
+                      </w:r>
+                      <w:r>
+                        <w:rPr>
+                          <w:color w:val="000000" w:themeColor="text1"/>
+                          <w14:shadow w14:blurRad="38100" w14:dist="19050" w14:dir="2700000" w14:sx="100000" w14:sy="100000" w14:kx="0" w14:ky="0" w14:algn="tl">
+                            <w14:schemeClr w14:val="dk1">
+                              <w14:alpha w14:val="60000"/>
+                            </w14:schemeClr>
+                          </w14:shadow>
+                          <w14:textOutline w14:w="0" w14:cap="flat" w14:cmpd="sng" w14:algn="ctr">
+                            <w14:noFill/>
+                            <w14:prstDash w14:val="solid"/>
+                            <w14:round/>
+                          </w14:textOutline>
+                        </w:rPr>
+                        <w:t>eu einzufügende Dateien</w:t>
+                      </w:r>
+                    </w:p>
+                  </w:txbxContent>
+                </v:textbox>
+              </v:rect>
+            </w:pict>
+          </mc:Fallback>
+        </mc:AlternateContent>
+      </w:r>
+      <w:r>
+        <w:rPr>
+          <w:noProof/>
+        </w:rPr>
+        <mc:AlternateContent>
+          <mc:Choice Requires="wps">
+            <w:drawing>
+              <wp:anchor distT="0" distB="0" distL="114300" distR="114300" simplePos="0" relativeHeight="251682846" behindDoc="0" locked="0" layoutInCell="1" allowOverlap="1" wp14:anchorId="33F9EDCF" wp14:editId="2E6468A4">
+                <wp:simplePos x="0" y="0"/>
+                <wp:positionH relativeFrom="column">
+                  <wp:posOffset>1085215</wp:posOffset>
+                </wp:positionH>
+                <wp:positionV relativeFrom="paragraph">
+                  <wp:posOffset>4678045</wp:posOffset>
+                </wp:positionV>
+                <wp:extent cx="963930" cy="0"/>
+                <wp:effectExtent l="0" t="0" r="0" b="0"/>
+                <wp:wrapNone/>
+                <wp:docPr id="52" name="Gerader Verbinder 52"/>
+                <wp:cNvGraphicFramePr/>
+                <a:graphic xmlns:a="http://schemas.openxmlformats.org/drawingml/2006/main">
+                  <a:graphicData uri="http://schemas.microsoft.com/office/word/2010/wordprocessingShape">
+                    <wps:wsp>
+                      <wps:cNvCnPr/>
+                      <wps:spPr>
+                        <a:xfrm flipH="1" flipV="1">
+                          <a:off x="0" y="0"/>
+                          <a:ext cx="963930" cy="0"/>
+                        </a:xfrm>
+                        <a:prstGeom prst="line">
+                          <a:avLst/>
+                        </a:prstGeom>
+                      </wps:spPr>
+                      <wps:style>
+                        <a:lnRef idx="1">
+                          <a:schemeClr val="accent2"/>
+                        </a:lnRef>
+                        <a:fillRef idx="0">
+                          <a:schemeClr val="accent2"/>
+                        </a:fillRef>
+                        <a:effectRef idx="0">
+                          <a:schemeClr val="accent2"/>
+                        </a:effectRef>
+                        <a:fontRef idx="minor">
+                          <a:schemeClr val="tx1"/>
+                        </a:fontRef>
+                      </wps:style>
+                      <wps:bodyPr/>
+                    </wps:wsp>
+                  </a:graphicData>
+                </a:graphic>
+                <wp14:sizeRelH relativeFrom="margin">
+                  <wp14:pctWidth>0</wp14:pctWidth>
+                </wp14:sizeRelH>
+                <wp14:sizeRelV relativeFrom="margin">
+                  <wp14:pctHeight>0</wp14:pctHeight>
+                </wp14:sizeRelV>
+              </wp:anchor>
+            </w:drawing>
+          </mc:Choice>
+          <mc:Fallback>
+            <w:pict>
+              <v:line w14:anchorId="555C7271" id="Gerader Verbinder 52" o:spid="_x0000_s1026" style="position:absolute;flip:x y;z-index:251682846;visibility:visible;mso-wrap-style:square;mso-width-percent:0;mso-height-percent:0;mso-wrap-distance-left:9pt;mso-wrap-distance-top:0;mso-wrap-distance-right:9pt;mso-wrap-distance-bottom:0;mso-position-horizontal:absolute;mso-position-horizontal-relative:text;mso-position-vertical:absolute;mso-position-vertical-relative:text;mso-width-percent:0;mso-height-percent:0;mso-width-relative:margin;mso-height-relative:margin" from="85.45pt,368.35pt" to="161.35pt,368.35pt" o:gfxdata="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" strokecolor="#ed7d31 [3205]" strokeweight=".5pt">
+                <v:stroke joinstyle="miter"/>
+              </v:line>
+            </w:pict>
+          </mc:Fallback>
+        </mc:AlternateContent>
+      </w:r>
+      <w:r>
+        <w:rPr>
+          <w:noProof/>
+        </w:rPr>
+        <mc:AlternateContent>
+          <mc:Choice Requires="wps">
+            <w:drawing>
+              <wp:anchor distT="0" distB="0" distL="114300" distR="114300" simplePos="0" relativeHeight="251674654" behindDoc="0" locked="0" layoutInCell="1" allowOverlap="1" wp14:anchorId="41573C95" wp14:editId="6CEA7522">
+                <wp:simplePos x="0" y="0"/>
+                <wp:positionH relativeFrom="column">
+                  <wp:posOffset>2049145</wp:posOffset>
+                </wp:positionH>
+                <wp:positionV relativeFrom="paragraph">
+                  <wp:posOffset>5554345</wp:posOffset>
+                </wp:positionV>
+                <wp:extent cx="1752600" cy="525780"/>
+                <wp:effectExtent l="0" t="0" r="19050" b="26670"/>
+                <wp:wrapNone/>
+                <wp:docPr id="46" name="Rechteck 46"/>
+                <wp:cNvGraphicFramePr/>
+                <a:graphic xmlns:a="http://schemas.openxmlformats.org/drawingml/2006/main">
+                  <a:graphicData uri="http://schemas.microsoft.com/office/word/2010/wordprocessingShape">
+                    <wps:wsp>
+                      <wps:cNvSpPr/>
+                      <wps:spPr>
+                        <a:xfrm>
+                          <a:off x="0" y="0"/>
+                          <a:ext cx="1752600" cy="525780"/>
+                        </a:xfrm>
+                        <a:prstGeom prst="rect">
+                          <a:avLst/>
+                        </a:prstGeom>
+                        <a:solidFill>
+                          <a:schemeClr val="accent6">
+                            <a:alpha val="23137"/>
+                          </a:schemeClr>
+                        </a:solidFill>
+                        <a:ln>
+                          <a:solidFill>
+                            <a:schemeClr val="accent6">
+                              <a:lumMod val="75000"/>
+                            </a:schemeClr>
+                          </a:solidFill>
+                        </a:ln>
+                      </wps:spPr>
+                      <wps:style>
+                        <a:lnRef idx="2">
+                          <a:schemeClr val="accent1">
+                            <a:shade val="50000"/>
+                          </a:schemeClr>
+                        </a:lnRef>
+                        <a:fillRef idx="1">
+                          <a:schemeClr val="accent1"/>
+                        </a:fillRef>
+                        <a:effectRef idx="0">
+                          <a:schemeClr val="accent1"/>
+                        </a:effectRef>
+                        <a:fontRef idx="minor">
+                          <a:schemeClr val="lt1"/>
+                        </a:fontRef>
+                      </wps:style>
+                      <wps:bodyPr rot="0" spcFirstLastPara="0" vertOverflow="overflow" horzOverflow="overflow" vert="horz" wrap="square" lIns="91440" tIns="45720" rIns="91440" bIns="45720" numCol="1" spcCol="0" rtlCol="0" fromWordArt="0" anchor="ctr" anchorCtr="0" forceAA="0" compatLnSpc="1">
+                        <a:prstTxWarp prst="textNoShape">
+                          <a:avLst/>
+                        </a:prstTxWarp>
+                        <a:noAutofit/>
+                      </wps:bodyPr>
+                    </wps:wsp>
+                  </a:graphicData>
+                </a:graphic>
+                <wp14:sizeRelH relativeFrom="margin">
+                  <wp14:pctWidth>0</wp14:pctWidth>
+                </wp14:sizeRelH>
+                <wp14:sizeRelV relativeFrom="margin">
+                  <wp14:pctHeight>0</wp14:pctHeight>
+                </wp14:sizeRelV>
+              </wp:anchor>
+            </w:drawing>
+          </mc:Choice>
+          <mc:Fallback>
+            <w:pict>
+              <v:rect w14:anchorId="7FC15CE3" id="Rechteck 46" o:spid="_x0000_s1026" style="position:absolute;margin-left:161.35pt;margin-top:437.35pt;width:138pt;height:41.4pt;z-index:251674654;visibility:visible;mso-wrap-style:square;mso-width-percent:0;mso-height-percent:0;mso-wrap-distance-left:9pt;mso-wrap-distance-top:0;mso-wrap-distance-right:9pt;mso-wrap-distance-bottom:0;mso-position-horizontal:absolute;mso-position-horizontal-relative:text;mso-position-vertical:absolute;mso-position-vertical-relative:text;mso-width-percent:0;mso-height-percent:0;mso-width-relative:margin;mso-height-relative:margin;v-text-anchor:middle" o:gfxdata="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" fillcolor="#70ad47 [3209]" strokecolor="#538135 [2409]" strokeweight="1pt">
+                <v:fill opacity="15163f"/>
+              </v:rect>
+            </w:pict>
+          </mc:Fallback>
+        </mc:AlternateContent>
+      </w:r>
+      <w:r>
+        <mc:AlternateContent>
+          <mc:Choice Requires="wps">
+            <w:drawing>
+              <wp:anchor distT="0" distB="0" distL="114300" distR="114300" simplePos="0" relativeHeight="251658269" behindDoc="0" locked="0" layoutInCell="1" allowOverlap="1" wp14:anchorId="45E08E17" wp14:editId="799C914F">
+                <wp:simplePos x="0" y="0"/>
+                <wp:positionH relativeFrom="column">
+                  <wp:posOffset>2049145</wp:posOffset>
+                </wp:positionH>
+                <wp:positionV relativeFrom="paragraph">
+                  <wp:posOffset>6849745</wp:posOffset>
+                </wp:positionV>
+                <wp:extent cx="1752600" cy="1341120"/>
+                <wp:effectExtent l="0" t="0" r="19050" b="11430"/>
+                <wp:wrapNone/>
+                <wp:docPr id="37" name="Rechteck 37"/>
+                <wp:cNvGraphicFramePr/>
+                <a:graphic xmlns:a="http://schemas.openxmlformats.org/drawingml/2006/main">
+                  <a:graphicData uri="http://schemas.microsoft.com/office/word/2010/wordprocessingShape">
+                    <wps:wsp>
+                      <wps:cNvSpPr/>
+                      <wps:spPr>
+                        <a:xfrm>
+                          <a:off x="0" y="0"/>
+                          <a:ext cx="1752600" cy="1341120"/>
+                        </a:xfrm>
+                        <a:prstGeom prst="rect">
+                          <a:avLst/>
+                        </a:prstGeom>
+                        <a:noFill/>
+                      </wps:spPr>
+                      <wps:style>
+                        <a:lnRef idx="2">
+                          <a:schemeClr val="accent1">
+                            <a:shade val="50000"/>
+                          </a:schemeClr>
+                        </a:lnRef>
+                        <a:fillRef idx="1">
+                          <a:schemeClr val="accent1"/>
+                        </a:fillRef>
+                        <a:effectRef idx="0">
+                          <a:schemeClr val="accent1"/>
+                        </a:effectRef>
+                        <a:fontRef idx="minor">
+                          <a:schemeClr val="lt1"/>
+                        </a:fontRef>
+                      </wps:style>
+                      <wps:bodyPr rot="0" spcFirstLastPara="0" vertOverflow="overflow" horzOverflow="overflow" vert="horz" wrap="square" lIns="91440" tIns="45720" rIns="91440" bIns="45720" numCol="1" spcCol="0" rtlCol="0" fromWordArt="0" anchor="ctr" anchorCtr="0" forceAA="0" compatLnSpc="1">
+                        <a:prstTxWarp prst="textNoShape">
+                          <a:avLst/>
+                        </a:prstTxWarp>
+                        <a:noAutofit/>
+                      </wps:bodyPr>
+                    </wps:wsp>
+                  </a:graphicData>
+                </a:graphic>
+                <wp14:sizeRelH relativeFrom="margin">
+                  <wp14:pctWidth>0</wp14:pctWidth>
+                </wp14:sizeRelH>
+                <wp14:sizeRelV relativeFrom="margin">
+                  <wp14:pctHeight>0</wp14:pctHeight>
+                </wp14:sizeRelV>
+              </wp:anchor>
+            </w:drawing>
+          </mc:Choice>
+          <mc:Fallback>
+            <w:pict>
+              <v:rect w14:anchorId="50FB173E" id="Rechteck 37" o:spid="_x0000_s1026" style="position:absolute;margin-left:161.35pt;margin-top:539.35pt;width:138pt;height:105.6pt;z-index:251658269;visibility:visible;mso-wrap-style:square;mso-width-percent:0;mso-height-percent:0;mso-wrap-distance-left:9pt;mso-wrap-distance-top:0;mso-wrap-distance-right:9pt;mso-wrap-distance-bottom:0;mso-position-horizontal:absolute;mso-position-horizontal-relative:text;mso-position-vertical:absolute;mso-position-vertical-relative:text;mso-width-percent:0;mso-height-percent:0;mso-width-relative:margin;mso-height-relative:margin;v-text-anchor:middle" o:gfxdata="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" filled="f" strokecolor="#1f3763 [1604]" strokeweight="1pt"/>
+            </w:pict>
+          </mc:Fallback>
+        </mc:AlternateContent>
+      </w:r>
+      <w:r>
+        <w:rPr>
+          <w:noProof/>
+        </w:rPr>
+        <mc:AlternateContent>
+          <mc:Choice Requires="wps">
+            <w:drawing>
+              <wp:anchor distT="0" distB="0" distL="114300" distR="114300" simplePos="0" relativeHeight="251672606" behindDoc="0" locked="0" layoutInCell="1" allowOverlap="1" wp14:anchorId="4F276CBF" wp14:editId="067F7C90">
+                <wp:simplePos x="0" y="0"/>
+                <wp:positionH relativeFrom="column">
+                  <wp:posOffset>2049145</wp:posOffset>
+                </wp:positionH>
+                <wp:positionV relativeFrom="paragraph">
+                  <wp:posOffset>6080125</wp:posOffset>
+                </wp:positionV>
+                <wp:extent cx="1752600" cy="769620"/>
+                <wp:effectExtent l="0" t="0" r="19050" b="11430"/>
+                <wp:wrapNone/>
+                <wp:docPr id="45" name="Rechteck 45"/>
+                <wp:cNvGraphicFramePr/>
+                <a:graphic xmlns:a="http://schemas.openxmlformats.org/drawingml/2006/main">
+                  <a:graphicData uri="http://schemas.microsoft.com/office/word/2010/wordprocessingShape">
+                    <wps:wsp>
+                      <wps:cNvSpPr/>
+                      <wps:spPr>
+                        <a:xfrm>
+                          <a:off x="0" y="0"/>
+                          <a:ext cx="1752600" cy="769620"/>
+                        </a:xfrm>
+                        <a:prstGeom prst="rect">
+                          <a:avLst/>
+                        </a:prstGeom>
+                        <a:solidFill>
+                          <a:srgbClr val="C00000">
+                            <a:alpha val="23137"/>
+                          </a:srgbClr>
+                        </a:solidFill>
+                        <a:ln>
+                          <a:solidFill>
+                            <a:schemeClr val="accent2"/>
+                          </a:solidFill>
+                        </a:ln>
+                      </wps:spPr>
+                      <wps:style>
+                        <a:lnRef idx="2">
+                          <a:schemeClr val="accent1">
+                            <a:shade val="50000"/>
+                          </a:schemeClr>
+                        </a:lnRef>
+                        <a:fillRef idx="1">
+                          <a:schemeClr val="accent1"/>
+                        </a:fillRef>
+                        <a:effectRef idx="0">
+                          <a:schemeClr val="accent1"/>
+                        </a:effectRef>
+                        <a:fontRef idx="minor">
+                          <a:schemeClr val="lt1"/>
+                        </a:fontRef>
+                      </wps:style>
+                      <wps:bodyPr rot="0" spcFirstLastPara="0" vertOverflow="overflow" horzOverflow="overflow" vert="horz" wrap="square" lIns="91440" tIns="45720" rIns="91440" bIns="45720" numCol="1" spcCol="0" rtlCol="0" fromWordArt="0" anchor="ctr" anchorCtr="0" forceAA="0" compatLnSpc="1">
+                        <a:prstTxWarp prst="textNoShape">
+                          <a:avLst/>
+                        </a:prstTxWarp>
+                        <a:noAutofit/>
+                      </wps:bodyPr>
+                    </wps:wsp>
+                  </a:graphicData>
+                </a:graphic>
+                <wp14:sizeRelH relativeFrom="margin">
+                  <wp14:pctWidth>0</wp14:pctWidth>
+                </wp14:sizeRelH>
+                <wp14:sizeRelV relativeFrom="margin">
+                  <wp14:pctHeight>0</wp14:pctHeight>
+                </wp14:sizeRelV>
+              </wp:anchor>
+            </w:drawing>
+          </mc:Choice>
+          <mc:Fallback>
+            <w:pict>
+              <v:rect w14:anchorId="0005ABB0" id="Rechteck 45" o:spid="_x0000_s1026" style="position:absolute;margin-left:161.35pt;margin-top:478.75pt;width:138pt;height:60.6pt;z-index:251672606;visibility:visible;mso-wrap-style:square;mso-width-percent:0;mso-height-percent:0;mso-wrap-distance-left:9pt;mso-wrap-distance-top:0;mso-wrap-distance-right:9pt;mso-wrap-distance-bottom:0;mso-position-horizontal:absolute;mso-position-horizontal-relative:text;mso-position-vertical:absolute;mso-position-vertical-relative:text;mso-width-percent:0;mso-height-percent:0;mso-width-relative:margin;mso-height-relative:margin;v-text-anchor:middle" o:gfxdata="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" fillcolor="#c00000" strokecolor="#ed7d31 [3205]" strokeweight="1pt">
+                <v:fill opacity="15163f"/>
+              </v:rect>
+            </w:pict>
+          </mc:Fallback>
+        </mc:AlternateContent>
+      </w:r>
+      <w:r>
+        <w:rPr>
+          <w:noProof/>
+        </w:rPr>
+        <mc:AlternateContent>
+          <mc:Choice Requires="wps">
+            <w:drawing>
+              <wp:anchor distT="0" distB="0" distL="114300" distR="114300" simplePos="0" relativeHeight="251670558" behindDoc="0" locked="0" layoutInCell="1" allowOverlap="1" wp14:anchorId="2DA8904F" wp14:editId="63DA5356">
+                <wp:simplePos x="0" y="0"/>
+                <wp:positionH relativeFrom="column">
+                  <wp:posOffset>2049145</wp:posOffset>
+                </wp:positionH>
+                <wp:positionV relativeFrom="paragraph">
+                  <wp:posOffset>4525645</wp:posOffset>
+                </wp:positionV>
+                <wp:extent cx="1752600" cy="274320"/>
+                <wp:effectExtent l="0" t="0" r="19050" b="11430"/>
+                <wp:wrapNone/>
+                <wp:docPr id="44" name="Rechteck 44"/>
+                <wp:cNvGraphicFramePr/>
+                <a:graphic xmlns:a="http://schemas.openxmlformats.org/drawingml/2006/main">
+                  <a:graphicData uri="http://schemas.microsoft.com/office/word/2010/wordprocessingShape">
+                    <wps:wsp>
+                      <wps:cNvSpPr/>
+                      <wps:spPr>
+                        <a:xfrm>
+                          <a:off x="0" y="0"/>
+                          <a:ext cx="1752600" cy="274320"/>
+                        </a:xfrm>
+                        <a:prstGeom prst="rect">
+                          <a:avLst/>
+                        </a:prstGeom>
+                        <a:solidFill>
+                          <a:srgbClr val="C00000">
+                            <a:alpha val="23137"/>
+                          </a:srgbClr>
+                        </a:solidFill>
+                        <a:ln>
+                          <a:solidFill>
+                            <a:schemeClr val="accent2"/>
+                          </a:solidFill>
+                        </a:ln>
+                      </wps:spPr>
+                      <wps:style>
+                        <a:lnRef idx="2">
+                          <a:schemeClr val="accent1">
+                            <a:shade val="50000"/>
+                          </a:schemeClr>
+                        </a:lnRef>
+                        <a:fillRef idx="1">
+                          <a:schemeClr val="accent1"/>
+                        </a:fillRef>
+                        <a:effectRef idx="0">
+                          <a:schemeClr val="accent1"/>
+                        </a:effectRef>
+                        <a:fontRef idx="minor">
+                          <a:schemeClr val="lt1"/>
+                        </a:fontRef>
+                      </wps:style>
+                      <wps:bodyPr rot="0" spcFirstLastPara="0" vertOverflow="overflow" horzOverflow="overflow" vert="horz" wrap="square" lIns="91440" tIns="45720" rIns="91440" bIns="45720" numCol="1" spcCol="0" rtlCol="0" fromWordArt="0" anchor="ctr" anchorCtr="0" forceAA="0" compatLnSpc="1">
+                        <a:prstTxWarp prst="textNoShape">
+                          <a:avLst/>
+                        </a:prstTxWarp>
+                        <a:noAutofit/>
+                      </wps:bodyPr>
+                    </wps:wsp>
+                  </a:graphicData>
+                </a:graphic>
+                <wp14:sizeRelH relativeFrom="margin">
+                  <wp14:pctWidth>0</wp14:pctWidth>
+                </wp14:sizeRelH>
+                <wp14:sizeRelV relativeFrom="margin">
+                  <wp14:pctHeight>0</wp14:pctHeight>
+                </wp14:sizeRelV>
+              </wp:anchor>
+            </w:drawing>
+          </mc:Choice>
+          <mc:Fallback>
+            <w:pict>
+              <v:rect w14:anchorId="73D9841A" id="Rechteck 44" o:spid="_x0000_s1026" style="position:absolute;margin-left:161.35pt;margin-top:356.35pt;width:138pt;height:21.6pt;z-index:251670558;visibility:visible;mso-wrap-style:square;mso-width-percent:0;mso-height-percent:0;mso-wrap-distance-left:9pt;mso-wrap-distance-top:0;mso-wrap-distance-right:9pt;mso-wrap-distance-bottom:0;mso-position-horizontal:absolute;mso-position-horizontal-relative:text;mso-position-vertical:absolute;mso-position-vertical-relative:text;mso-width-percent:0;mso-height-percent:0;mso-width-relative:margin;mso-height-relative:margin;v-text-anchor:middle" o:gfxdata="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" fillcolor="#c00000" strokecolor="#ed7d31 [3205]" strokeweight="1pt">
+                <v:fill opacity="15163f"/>
+              </v:rect>
+            </w:pict>
+          </mc:Fallback>
+        </mc:AlternateContent>
+      </w:r>
+      <w:r>
+        <w:rPr>
+          <w:noProof/>
+        </w:rPr>
+        <mc:AlternateContent>
+          <mc:Choice Requires="wps">
+            <w:drawing>
+              <wp:anchor distT="0" distB="0" distL="114300" distR="114300" simplePos="0" relativeHeight="251668510" behindDoc="0" locked="0" layoutInCell="1" allowOverlap="1" wp14:anchorId="6DE29145" wp14:editId="49BBFED5">
+                <wp:simplePos x="0" y="0"/>
+                <wp:positionH relativeFrom="column">
+                  <wp:posOffset>2049145</wp:posOffset>
+                </wp:positionH>
+                <wp:positionV relativeFrom="paragraph">
+                  <wp:posOffset>4037965</wp:posOffset>
+                </wp:positionV>
+                <wp:extent cx="1752600" cy="487680"/>
+                <wp:effectExtent l="0" t="0" r="19050" b="26670"/>
+                <wp:wrapNone/>
+                <wp:docPr id="43" name="Rechteck 43"/>
+                <wp:cNvGraphicFramePr/>
+                <a:graphic xmlns:a="http://schemas.openxmlformats.org/drawingml/2006/main">
+                  <a:graphicData uri="http://schemas.microsoft.com/office/word/2010/wordprocessingShape">
+                    <wps:wsp>
+                      <wps:cNvSpPr/>
+                      <wps:spPr>
+                        <a:xfrm>
+                          <a:off x="0" y="0"/>
+                          <a:ext cx="1752600" cy="487680"/>
+                        </a:xfrm>
+                        <a:prstGeom prst="rect">
+                          <a:avLst/>
+                        </a:prstGeom>
+                        <a:solidFill>
+                          <a:schemeClr val="accent6">
+                            <a:alpha val="23137"/>
+                          </a:schemeClr>
+                        </a:solidFill>
+                        <a:ln>
+                          <a:solidFill>
+                            <a:schemeClr val="accent6">
+                              <a:lumMod val="75000"/>
+                            </a:schemeClr>
+                          </a:solidFill>
+                        </a:ln>
+                      </wps:spPr>
+                      <wps:style>
+                        <a:lnRef idx="2">
+                          <a:schemeClr val="accent1">
+                            <a:shade val="50000"/>
+                          </a:schemeClr>
+                        </a:lnRef>
+                        <a:fillRef idx="1">
+                          <a:schemeClr val="accent1"/>
+                        </a:fillRef>
+                        <a:effectRef idx="0">
+                          <a:schemeClr val="accent1"/>
+                        </a:effectRef>
+                        <a:fontRef idx="minor">
+                          <a:schemeClr val="lt1"/>
+                        </a:fontRef>
+                      </wps:style>
+                      <wps:bodyPr rot="0" spcFirstLastPara="0" vertOverflow="overflow" horzOverflow="overflow" vert="horz" wrap="square" lIns="91440" tIns="45720" rIns="91440" bIns="45720" numCol="1" spcCol="0" rtlCol="0" fromWordArt="0" anchor="ctr" anchorCtr="0" forceAA="0" compatLnSpc="1">
+                        <a:prstTxWarp prst="textNoShape">
+                          <a:avLst/>
+                        </a:prstTxWarp>
+                        <a:noAutofit/>
+                      </wps:bodyPr>
+                    </wps:wsp>
+                  </a:graphicData>
+                </a:graphic>
+                <wp14:sizeRelH relativeFrom="margin">
+                  <wp14:pctWidth>0</wp14:pctWidth>
+                </wp14:sizeRelH>
+                <wp14:sizeRelV relativeFrom="margin">
+                  <wp14:pctHeight>0</wp14:pctHeight>
+                </wp14:sizeRelV>
+              </wp:anchor>
+            </w:drawing>
+          </mc:Choice>
+          <mc:Fallback>
+            <w:pict>
+              <v:rect w14:anchorId="16C09F0E" id="Rechteck 43" o:spid="_x0000_s1026" style="position:absolute;margin-left:161.35pt;margin-top:317.95pt;width:138pt;height:38.4pt;z-index:251668510;visibility:visible;mso-wrap-style:square;mso-width-percent:0;mso-height-percent:0;mso-wrap-distance-left:9pt;mso-wrap-distance-top:0;mso-wrap-distance-right:9pt;mso-wrap-distance-bottom:0;mso-position-horizontal:absolute;mso-position-horizontal-relative:text;mso-position-vertical:absolute;mso-position-vertical-relative:text;mso-width-percent:0;mso-height-percent:0;mso-width-relative:margin;mso-height-relative:margin;v-text-anchor:middle" o:gfxdata="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" fillcolor="#70ad47 [3209]" strokecolor="#538135 [2409]" strokeweight="1pt">
+                <v:fill opacity="15163f"/>
+              </v:rect>
+            </w:pict>
+          </mc:Fallback>
+        </mc:AlternateContent>
+      </w:r>
+      <w:r>
+        <w:rPr>
+          <w:noProof/>
+        </w:rPr>
+        <mc:AlternateContent>
+          <mc:Choice Requires="wps">
+            <w:drawing>
+              <wp:anchor distT="0" distB="0" distL="114300" distR="114300" simplePos="0" relativeHeight="251666462" behindDoc="0" locked="0" layoutInCell="1" allowOverlap="1" wp14:anchorId="46A65EE5" wp14:editId="4C2BFD22">
+                <wp:simplePos x="0" y="0"/>
+                <wp:positionH relativeFrom="column">
+                  <wp:posOffset>2049145</wp:posOffset>
+                </wp:positionH>
+                <wp:positionV relativeFrom="paragraph">
+                  <wp:posOffset>944245</wp:posOffset>
+                </wp:positionV>
+                <wp:extent cx="1752600" cy="3086100"/>
+                <wp:effectExtent l="0" t="0" r="19050" b="19050"/>
+                <wp:wrapNone/>
+                <wp:docPr id="42" name="Rechteck 42"/>
+                <wp:cNvGraphicFramePr/>
+                <a:graphic xmlns:a="http://schemas.openxmlformats.org/drawingml/2006/main">
+                  <a:graphicData uri="http://schemas.microsoft.com/office/word/2010/wordprocessingShape">
+                    <wps:wsp>
+                      <wps:cNvSpPr/>
+                      <wps:spPr>
+                        <a:xfrm>
+                          <a:off x="0" y="0"/>
+                          <a:ext cx="1752600" cy="3086100"/>
+                        </a:xfrm>
+                        <a:prstGeom prst="rect">
+                          <a:avLst/>
+                        </a:prstGeom>
+                        <a:solidFill>
+                          <a:srgbClr val="C00000">
+                            <a:alpha val="23137"/>
+                          </a:srgbClr>
+                        </a:solidFill>
+                        <a:ln>
+                          <a:solidFill>
+                            <a:schemeClr val="accent2"/>
+                          </a:solidFill>
+                        </a:ln>
+                      </wps:spPr>
+                      <wps:style>
+                        <a:lnRef idx="2">
+                          <a:schemeClr val="accent1">
+                            <a:shade val="50000"/>
+                          </a:schemeClr>
+                        </a:lnRef>
+                        <a:fillRef idx="1">
+                          <a:schemeClr val="accent1"/>
+                        </a:fillRef>
+                        <a:effectRef idx="0">
+                          <a:schemeClr val="accent1"/>
+                        </a:effectRef>
+                        <a:fontRef idx="minor">
+                          <a:schemeClr val="lt1"/>
+                        </a:fontRef>
+                      </wps:style>
+                      <wps:bodyPr rot="0" spcFirstLastPara="0" vertOverflow="overflow" horzOverflow="overflow" vert="horz" wrap="square" lIns="91440" tIns="45720" rIns="91440" bIns="45720" numCol="1" spcCol="0" rtlCol="0" fromWordArt="0" anchor="ctr" anchorCtr="0" forceAA="0" compatLnSpc="1">
+                        <a:prstTxWarp prst="textNoShape">
+                          <a:avLst/>
+                        </a:prstTxWarp>
+                        <a:noAutofit/>
+                      </wps:bodyPr>
+                    </wps:wsp>
+                  </a:graphicData>
+                </a:graphic>
+                <wp14:sizeRelH relativeFrom="margin">
+                  <wp14:pctWidth>0</wp14:pctWidth>
+                </wp14:sizeRelH>
+                <wp14:sizeRelV relativeFrom="margin">
+                  <wp14:pctHeight>0</wp14:pctHeight>
+                </wp14:sizeRelV>
+              </wp:anchor>
+            </w:drawing>
+          </mc:Choice>
+          <mc:Fallback>
+            <w:pict>
+              <v:rect w14:anchorId="7500ADD5" id="Rechteck 42" o:spid="_x0000_s1026" style="position:absolute;margin-left:161.35pt;margin-top:74.35pt;width:138pt;height:243pt;z-index:251666462;visibility:visible;mso-wrap-style:square;mso-width-percent:0;mso-height-percent:0;mso-wrap-distance-left:9pt;mso-wrap-distance-top:0;mso-wrap-distance-right:9pt;mso-wrap-distance-bottom:0;mso-position-horizontal:absolute;mso-position-horizontal-relative:text;mso-position-vertical:absolute;mso-position-vertical-relative:text;mso-width-percent:0;mso-height-percent:0;mso-width-relative:margin;mso-height-relative:margin;v-text-anchor:middle" o:gfxdata="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" fillcolor="#c00000" strokecolor="#ed7d31 [3205]" strokeweight="1pt">
+                <v:fill opacity="15163f"/>
+              </v:rect>
+            </w:pict>
+          </mc:Fallback>
+        </mc:AlternateContent>
+      </w:r>
+      <w:r>
+        <mc:AlternateContent>
+          <mc:Choice Requires="wps">
+            <w:drawing>
+              <wp:anchor distT="0" distB="0" distL="114300" distR="114300" simplePos="0" relativeHeight="251658268" behindDoc="0" locked="0" layoutInCell="1" allowOverlap="1" wp14:anchorId="76FDB15F" wp14:editId="4E5C054A">
+                <wp:simplePos x="0" y="0"/>
+                <wp:positionH relativeFrom="margin">
+                  <wp:posOffset>-38735</wp:posOffset>
+                </wp:positionH>
+                <wp:positionV relativeFrom="paragraph">
+                  <wp:posOffset>7406640</wp:posOffset>
                 </wp:positionV>
                 <wp:extent cx="1123950" cy="514985"/>
                 <wp:effectExtent l="0" t="0" r="19050" b="18415"/>
                 <wp:wrapNone/>
-                <wp:docPr id="32" name="Rechteck 32"/>
+                <wp:docPr id="36" name="Rechteck 36"/>
                 <wp:cNvGraphicFramePr/>
                 <a:graphic xmlns:a="http://schemas.openxmlformats.org/drawingml/2006/main">
                   <a:graphicData uri="http://schemas.microsoft.com/office/word/2010/wordprocessingShape">
@@ -1883,7 +3368,7 @@
           </mc:Choice>
           <mc:Fallback>
             <w:pict>
-              <v:rect w14:anchorId="6EE4D5EF" id="Rechteck 32" o:spid="_x0000_s1026" style="position:absolute;margin-left:-10.2pt;margin-top:492.15pt;width:88.5pt;height:40.55pt;z-index:251703296;visibility:visible;mso-wrap-style:square;mso-width-percent:0;mso-wrap-distance-left:9pt;mso-wrap-distance-top:0;mso-wrap-distance-right:9pt;mso-wrap-distance-bottom:0;mso-position-horizontal:absolute;mso-position-horizontal-relative:margin;mso-position-vertical:absolute;mso-position-vertical-relative:text;mso-width-percent:0;mso-width-relative:margin;v-text-anchor:middle" o:gfxdata="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" filled="f" strokecolor="#1f3763 [1604]" strokeweight="1pt">
+              <v:rect w14:anchorId="76FDB15F" id="Rechteck 36" o:spid="_x0000_s1028" style="position:absolute;left:0;text-align:left;margin-left:-3.05pt;margin-top:583.2pt;width:88.5pt;height:40.55pt;z-index:251658268;visibility:visible;mso-wrap-style:square;mso-width-percent:0;mso-wrap-distance-left:9pt;mso-wrap-distance-top:0;mso-wrap-distance-right:9pt;mso-wrap-distance-bottom:0;mso-position-horizontal:absolute;mso-position-horizontal-relative:margin;mso-position-vertical:absolute;mso-position-vertical-relative:text;mso-width-percent:0;mso-width-relative:margin;v-text-anchor:middle" o:gfxdata="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" filled="f" strokecolor="#1f3763 [1604]" strokeweight="1pt">
                 <v:textbox>
                   <w:txbxContent>
                     <w:p>
@@ -1967,96 +3452,18 @@
         <mc:AlternateContent>
           <mc:Choice Requires="wps">
             <w:drawing>
-              <wp:anchor distT="0" distB="0" distL="114300" distR="114300" simplePos="0" relativeHeight="251711488" behindDoc="0" locked="0" layoutInCell="1" allowOverlap="1" wp14:anchorId="6ABF8E8E" wp14:editId="64B38619">
+              <wp:anchor distT="0" distB="0" distL="114300" distR="114300" simplePos="0" relativeHeight="251664414" behindDoc="0" locked="0" layoutInCell="1" allowOverlap="1" wp14:anchorId="3E9ED1CD" wp14:editId="2EEA4D93">
                 <wp:simplePos x="0" y="0"/>
                 <wp:positionH relativeFrom="column">
-                  <wp:posOffset>996738</wp:posOffset>
+                  <wp:posOffset>2049145</wp:posOffset>
                 </wp:positionH>
                 <wp:positionV relativeFrom="paragraph">
-                  <wp:posOffset>967105</wp:posOffset>
+                  <wp:posOffset>426085</wp:posOffset>
                 </wp:positionV>
-                <wp:extent cx="914400" cy="5550323"/>
-                <wp:effectExtent l="0" t="0" r="19050" b="31750"/>
+                <wp:extent cx="1753200" cy="519430"/>
+                <wp:effectExtent l="0" t="0" r="19050" b="13970"/>
                 <wp:wrapNone/>
-                <wp:docPr id="35" name="Verbinder: gewinkelt 35"/>
-                <wp:cNvGraphicFramePr/>
-                <a:graphic xmlns:a="http://schemas.openxmlformats.org/drawingml/2006/main">
-                  <a:graphicData uri="http://schemas.microsoft.com/office/word/2010/wordprocessingShape">
-                    <wps:wsp>
-                      <wps:cNvCnPr/>
-                      <wps:spPr>
-                        <a:xfrm flipH="1">
-                          <a:off x="0" y="0"/>
-                          <a:ext cx="914400" cy="5550323"/>
-                        </a:xfrm>
-                        <a:prstGeom prst="bentConnector3">
-                          <a:avLst/>
-                        </a:prstGeom>
-                      </wps:spPr>
-                      <wps:style>
-                        <a:lnRef idx="1">
-                          <a:schemeClr val="accent1"/>
-                        </a:lnRef>
-                        <a:fillRef idx="0">
-                          <a:schemeClr val="accent1"/>
-                        </a:fillRef>
-                        <a:effectRef idx="0">
-                          <a:schemeClr val="accent1"/>
-                        </a:effectRef>
-                        <a:fontRef idx="minor">
-                          <a:schemeClr val="tx1"/>
-                        </a:fontRef>
-                      </wps:style>
-                      <wps:bodyPr/>
-                    </wps:wsp>
-                  </a:graphicData>
-                </a:graphic>
-                <wp14:sizeRelH relativeFrom="margin">
-                  <wp14:pctWidth>0</wp14:pctWidth>
-                </wp14:sizeRelH>
-                <wp14:sizeRelV relativeFrom="margin">
-                  <wp14:pctHeight>0</wp14:pctHeight>
-                </wp14:sizeRelV>
-              </wp:anchor>
-            </w:drawing>
-          </mc:Choice>
-          <mc:Fallback>
-            <w:pict>
-              <v:shapetype w14:anchorId="43017022" id="_x0000_t34" coordsize="21600,21600" o:spt="34" o:oned="t" adj="10800" path="m,l@0,0@0,21600,21600,21600e" filled="f">
-                <v:stroke joinstyle="miter"/>
-                <v:formulas>
-                  <v:f eqn="val #0"/>
-                </v:formulas>
-                <v:path arrowok="t" fillok="f" o:connecttype="none"/>
-                <v:handles>
-                  <v:h position="#0,center"/>
-                </v:handles>
-                <o:lock v:ext="edit" shapetype="t"/>
-              </v:shapetype>
-              <v:shape id="Verbinder: gewinkelt 35" o:spid="_x0000_s1026" type="#_x0000_t34" style="position:absolute;margin-left:78.5pt;margin-top:76.15pt;width:1in;height:437.05pt;flip:x;z-index:251711488;visibility:visible;mso-wrap-style:square;mso-width-percent:0;mso-height-percent:0;mso-wrap-distance-left:9pt;mso-wrap-distance-top:0;mso-wrap-distance-right:9pt;mso-wrap-distance-bottom:0;mso-position-horizontal:absolute;mso-position-horizontal-relative:text;mso-position-vertical:absolute;mso-position-vertical-relative:text;mso-width-percent:0;mso-height-percent:0;mso-width-relative:margin;mso-height-relative:margin" o:gfxdata="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" strokecolor="#4472c4 [3204]" strokeweight=".5pt"/>
-            </w:pict>
-          </mc:Fallback>
-        </mc:AlternateContent>
-      </w:r>
-      <w:r>
-        <w:rPr>
-          <w:noProof/>
-        </w:rPr>
-        <mc:AlternateContent>
-          <mc:Choice Requires="wps">
-            <w:drawing>
-              <wp:anchor distT="0" distB="0" distL="114300" distR="114300" simplePos="0" relativeHeight="251708416" behindDoc="0" locked="0" layoutInCell="1" allowOverlap="1" wp14:anchorId="0E2C7498" wp14:editId="11E6CE55">
-                <wp:simplePos x="0" y="0"/>
-                <wp:positionH relativeFrom="column">
-                  <wp:posOffset>1911138</wp:posOffset>
-                </wp:positionH>
-                <wp:positionV relativeFrom="paragraph">
-                  <wp:posOffset>738505</wp:posOffset>
-                </wp:positionV>
-                <wp:extent cx="1405890" cy="436033"/>
-                <wp:effectExtent l="0" t="0" r="22860" b="21590"/>
-                <wp:wrapNone/>
-                <wp:docPr id="16" name="Rechteck 16"/>
+                <wp:docPr id="41" name="Rechteck 41"/>
                 <wp:cNvGraphicFramePr/>
                 <a:graphic xmlns:a="http://schemas.openxmlformats.org/drawingml/2006/main">
                   <a:graphicData uri="http://schemas.microsoft.com/office/word/2010/wordprocessingShape">
@@ -2065,7 +3472,7 @@
                       <wps:spPr>
                         <a:xfrm>
                           <a:off x="0" y="0"/>
-                          <a:ext cx="1405890" cy="436033"/>
+                          <a:ext cx="1753200" cy="519430"/>
                         </a:xfrm>
                         <a:prstGeom prst="rect">
                           <a:avLst/>
@@ -2088,953 +3495,14 @@
                           <a:schemeClr val="lt1"/>
                         </a:fontRef>
                       </wps:style>
-                      <wps:bodyPr rot="0" spcFirstLastPara="0" vertOverflow="overflow" horzOverflow="overflow" vert="horz" wrap="square" lIns="91440" tIns="45720" rIns="91440" bIns="45720" numCol="1" spcCol="0" rtlCol="0" fromWordArt="0" anchor="ctr" anchorCtr="0" forceAA="0" compatLnSpc="1">
-                        <a:prstTxWarp prst="textNoShape">
-                          <a:avLst/>
-                        </a:prstTxWarp>
-                        <a:noAutofit/>
-                      </wps:bodyPr>
-                    </wps:wsp>
-                  </a:graphicData>
-                </a:graphic>
-                <wp14:sizeRelH relativeFrom="margin">
-                  <wp14:pctWidth>0</wp14:pctWidth>
-                </wp14:sizeRelH>
-                <wp14:sizeRelV relativeFrom="margin">
-                  <wp14:pctHeight>0</wp14:pctHeight>
-                </wp14:sizeRelV>
-              </wp:anchor>
-            </w:drawing>
-          </mc:Choice>
-          <mc:Fallback>
-            <w:pict>
-              <v:rect w14:anchorId="2C394077" id="Rechteck 16" o:spid="_x0000_s1026" style="position:absolute;margin-left:150.5pt;margin-top:58.15pt;width:110.7pt;height:34.35pt;z-index:251708416;visibility:visible;mso-wrap-style:square;mso-width-percent:0;mso-height-percent:0;mso-wrap-distance-left:9pt;mso-wrap-distance-top:0;mso-wrap-distance-right:9pt;mso-wrap-distance-bottom:0;mso-position-horizontal:absolute;mso-position-horizontal-relative:text;mso-position-vertical:absolute;mso-position-vertical-relative:text;mso-width-percent:0;mso-height-percent:0;mso-width-relative:margin;mso-height-relative:margin;v-text-anchor:middle" o:gfxdata="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" filled="f" strokecolor="#1f3763 [1604]" strokeweight="1pt"/>
-            </w:pict>
-          </mc:Fallback>
-        </mc:AlternateContent>
-      </w:r>
-      <w:r>
-        <w:rPr>
-          <w:noProof/>
-        </w:rPr>
-        <mc:AlternateContent>
-          <mc:Choice Requires="wps">
-            <w:drawing>
-              <wp:anchor distT="0" distB="0" distL="114300" distR="114300" simplePos="0" relativeHeight="251685888" behindDoc="0" locked="0" layoutInCell="1" allowOverlap="1" wp14:anchorId="398E90F1" wp14:editId="5BC01B24">
-                <wp:simplePos x="0" y="0"/>
-                <wp:positionH relativeFrom="column">
-                  <wp:posOffset>1911138</wp:posOffset>
-                </wp:positionH>
-                <wp:positionV relativeFrom="paragraph">
-                  <wp:posOffset>3800052</wp:posOffset>
-                </wp:positionV>
-                <wp:extent cx="1405890" cy="411480"/>
-                <wp:effectExtent l="0" t="0" r="22860" b="26670"/>
-                <wp:wrapNone/>
-                <wp:docPr id="22" name="Rechteck 22"/>
-                <wp:cNvGraphicFramePr/>
-                <a:graphic xmlns:a="http://schemas.openxmlformats.org/drawingml/2006/main">
-                  <a:graphicData uri="http://schemas.microsoft.com/office/word/2010/wordprocessingShape">
-                    <wps:wsp>
-                      <wps:cNvSpPr/>
-                      <wps:spPr>
-                        <a:xfrm>
-                          <a:off x="0" y="0"/>
-                          <a:ext cx="1405890" cy="411480"/>
-                        </a:xfrm>
-                        <a:prstGeom prst="rect">
-                          <a:avLst/>
-                        </a:prstGeom>
-                        <a:solidFill>
-                          <a:schemeClr val="accent6">
-                            <a:alpha val="23137"/>
-                          </a:schemeClr>
-                        </a:solidFill>
-                        <a:ln>
-                          <a:solidFill>
-                            <a:schemeClr val="accent6">
-                              <a:lumMod val="75000"/>
-                            </a:schemeClr>
-                          </a:solidFill>
-                        </a:ln>
-                      </wps:spPr>
-                      <wps:style>
-                        <a:lnRef idx="2">
-                          <a:schemeClr val="accent1">
-                            <a:shade val="50000"/>
-                          </a:schemeClr>
-                        </a:lnRef>
-                        <a:fillRef idx="1">
-                          <a:schemeClr val="accent1"/>
-                        </a:fillRef>
-                        <a:effectRef idx="0">
-                          <a:schemeClr val="accent1"/>
-                        </a:effectRef>
-                        <a:fontRef idx="minor">
-                          <a:schemeClr val="lt1"/>
-                        </a:fontRef>
-                      </wps:style>
-                      <wps:bodyPr rot="0" spcFirstLastPara="0" vertOverflow="overflow" horzOverflow="overflow" vert="horz" wrap="square" lIns="91440" tIns="45720" rIns="91440" bIns="45720" numCol="1" spcCol="0" rtlCol="0" fromWordArt="0" anchor="ctr" anchorCtr="0" forceAA="0" compatLnSpc="1">
-                        <a:prstTxWarp prst="textNoShape">
-                          <a:avLst/>
-                        </a:prstTxWarp>
-                        <a:noAutofit/>
-                      </wps:bodyPr>
-                    </wps:wsp>
-                  </a:graphicData>
-                </a:graphic>
-                <wp14:sizeRelH relativeFrom="margin">
-                  <wp14:pctWidth>0</wp14:pctWidth>
-                </wp14:sizeRelH>
-                <wp14:sizeRelV relativeFrom="margin">
-                  <wp14:pctHeight>0</wp14:pctHeight>
-                </wp14:sizeRelV>
-              </wp:anchor>
-            </w:drawing>
-          </mc:Choice>
-          <mc:Fallback>
-            <w:pict>
-              <v:rect w14:anchorId="39EFF217" id="Rechteck 22" o:spid="_x0000_s1026" style="position:absolute;margin-left:150.5pt;margin-top:299.2pt;width:110.7pt;height:32.4pt;z-index:251685888;visibility:visible;mso-wrap-style:square;mso-width-percent:0;mso-height-percent:0;mso-wrap-distance-left:9pt;mso-wrap-distance-top:0;mso-wrap-distance-right:9pt;mso-wrap-distance-bottom:0;mso-position-horizontal:absolute;mso-position-horizontal-relative:text;mso-position-vertical:absolute;mso-position-vertical-relative:text;mso-width-percent:0;mso-height-percent:0;mso-width-relative:margin;mso-height-relative:margin;v-text-anchor:middle" o:gfxdata="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" fillcolor="#70ad47 [3209]" strokecolor="#538135 [2409]" strokeweight="1pt">
-                <v:fill opacity="15163f"/>
-              </v:rect>
-            </w:pict>
-          </mc:Fallback>
-        </mc:AlternateContent>
-      </w:r>
-      <w:r>
-        <w:rPr>
-          <w:noProof/>
-        </w:rPr>
-        <mc:AlternateContent>
-          <mc:Choice Requires="wps">
-            <w:drawing>
-              <wp:anchor distT="0" distB="0" distL="114300" distR="114300" simplePos="0" relativeHeight="251681792" behindDoc="0" locked="0" layoutInCell="1" allowOverlap="1" wp14:anchorId="18920A06" wp14:editId="72A3D0D7">
-                <wp:simplePos x="0" y="0"/>
-                <wp:positionH relativeFrom="column">
-                  <wp:posOffset>1911138</wp:posOffset>
-                </wp:positionH>
-                <wp:positionV relativeFrom="paragraph">
-                  <wp:posOffset>5310505</wp:posOffset>
-                </wp:positionV>
-                <wp:extent cx="1405890" cy="647700"/>
-                <wp:effectExtent l="0" t="0" r="22860" b="19050"/>
-                <wp:wrapNone/>
-                <wp:docPr id="20" name="Rechteck 20"/>
-                <wp:cNvGraphicFramePr/>
-                <a:graphic xmlns:a="http://schemas.openxmlformats.org/drawingml/2006/main">
-                  <a:graphicData uri="http://schemas.microsoft.com/office/word/2010/wordprocessingShape">
-                    <wps:wsp>
-                      <wps:cNvSpPr/>
-                      <wps:spPr>
-                        <a:xfrm>
-                          <a:off x="0" y="0"/>
-                          <a:ext cx="1405890" cy="647700"/>
-                        </a:xfrm>
-                        <a:prstGeom prst="rect">
-                          <a:avLst/>
-                        </a:prstGeom>
-                        <a:solidFill>
-                          <a:srgbClr val="C00000">
-                            <a:alpha val="23137"/>
-                          </a:srgbClr>
-                        </a:solidFill>
-                        <a:ln>
-                          <a:solidFill>
-                            <a:schemeClr val="accent2"/>
-                          </a:solidFill>
-                        </a:ln>
-                      </wps:spPr>
-                      <wps:style>
-                        <a:lnRef idx="2">
-                          <a:schemeClr val="accent1">
-                            <a:shade val="50000"/>
-                          </a:schemeClr>
-                        </a:lnRef>
-                        <a:fillRef idx="1">
-                          <a:schemeClr val="accent1"/>
-                        </a:fillRef>
-                        <a:effectRef idx="0">
-                          <a:schemeClr val="accent1"/>
-                        </a:effectRef>
-                        <a:fontRef idx="minor">
-                          <a:schemeClr val="lt1"/>
-                        </a:fontRef>
-                      </wps:style>
-                      <wps:bodyPr rot="0" spcFirstLastPara="0" vertOverflow="overflow" horzOverflow="overflow" vert="horz" wrap="square" lIns="91440" tIns="45720" rIns="91440" bIns="45720" numCol="1" spcCol="0" rtlCol="0" fromWordArt="0" anchor="ctr" anchorCtr="0" forceAA="0" compatLnSpc="1">
-                        <a:prstTxWarp prst="textNoShape">
-                          <a:avLst/>
-                        </a:prstTxWarp>
-                        <a:noAutofit/>
-                      </wps:bodyPr>
-                    </wps:wsp>
-                  </a:graphicData>
-                </a:graphic>
-                <wp14:sizeRelH relativeFrom="margin">
-                  <wp14:pctWidth>0</wp14:pctWidth>
-                </wp14:sizeRelH>
-                <wp14:sizeRelV relativeFrom="margin">
-                  <wp14:pctHeight>0</wp14:pctHeight>
-                </wp14:sizeRelV>
-              </wp:anchor>
-            </w:drawing>
-          </mc:Choice>
-          <mc:Fallback>
-            <w:pict>
-              <v:rect w14:anchorId="5BA3D0D2" id="Rechteck 20" o:spid="_x0000_s1026" style="position:absolute;margin-left:150.5pt;margin-top:418.15pt;width:110.7pt;height:51pt;z-index:251681792;visibility:visible;mso-wrap-style:square;mso-width-percent:0;mso-height-percent:0;mso-wrap-distance-left:9pt;mso-wrap-distance-top:0;mso-wrap-distance-right:9pt;mso-wrap-distance-bottom:0;mso-position-horizontal:absolute;mso-position-horizontal-relative:text;mso-position-vertical:absolute;mso-position-vertical-relative:text;mso-width-percent:0;mso-height-percent:0;mso-width-relative:margin;mso-height-relative:margin;v-text-anchor:middle" o:gfxdata="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" fillcolor="#c00000" strokecolor="#ed7d31 [3205]" strokeweight="1pt">
-                <v:fill opacity="15163f"/>
-              </v:rect>
-            </w:pict>
-          </mc:Fallback>
-        </mc:AlternateContent>
-      </w:r>
-      <w:r>
-        <w:rPr>
-          <w:noProof/>
-        </w:rPr>
-        <mc:AlternateContent>
-          <mc:Choice Requires="wps">
-            <w:drawing>
-              <wp:anchor distT="0" distB="0" distL="114300" distR="114300" simplePos="0" relativeHeight="251701248" behindDoc="0" locked="0" layoutInCell="1" allowOverlap="1" wp14:anchorId="0F0EB1FC" wp14:editId="16F55461">
-                <wp:simplePos x="0" y="0"/>
-                <wp:positionH relativeFrom="column">
-                  <wp:posOffset>1911138</wp:posOffset>
-                </wp:positionH>
-                <wp:positionV relativeFrom="paragraph">
-                  <wp:posOffset>4413038</wp:posOffset>
-                </wp:positionV>
-                <wp:extent cx="1405890" cy="436034"/>
-                <wp:effectExtent l="0" t="0" r="22860" b="21590"/>
-                <wp:wrapNone/>
-                <wp:docPr id="31" name="Rechteck 31"/>
-                <wp:cNvGraphicFramePr/>
-                <a:graphic xmlns:a="http://schemas.openxmlformats.org/drawingml/2006/main">
-                  <a:graphicData uri="http://schemas.microsoft.com/office/word/2010/wordprocessingShape">
-                    <wps:wsp>
-                      <wps:cNvSpPr/>
-                      <wps:spPr>
-                        <a:xfrm>
-                          <a:off x="0" y="0"/>
-                          <a:ext cx="1405890" cy="436034"/>
-                        </a:xfrm>
-                        <a:prstGeom prst="rect">
-                          <a:avLst/>
-                        </a:prstGeom>
-                        <a:noFill/>
-                      </wps:spPr>
-                      <wps:style>
-                        <a:lnRef idx="2">
-                          <a:schemeClr val="accent1">
-                            <a:shade val="50000"/>
-                          </a:schemeClr>
-                        </a:lnRef>
-                        <a:fillRef idx="1">
-                          <a:schemeClr val="accent1"/>
-                        </a:fillRef>
-                        <a:effectRef idx="0">
-                          <a:schemeClr val="accent1"/>
-                        </a:effectRef>
-                        <a:fontRef idx="minor">
-                          <a:schemeClr val="lt1"/>
-                        </a:fontRef>
-                      </wps:style>
-                      <wps:bodyPr rot="0" spcFirstLastPara="0" vertOverflow="overflow" horzOverflow="overflow" vert="horz" wrap="square" lIns="91440" tIns="45720" rIns="91440" bIns="45720" numCol="1" spcCol="0" rtlCol="0" fromWordArt="0" anchor="ctr" anchorCtr="0" forceAA="0" compatLnSpc="1">
-                        <a:prstTxWarp prst="textNoShape">
-                          <a:avLst/>
-                        </a:prstTxWarp>
-                        <a:noAutofit/>
-                      </wps:bodyPr>
-                    </wps:wsp>
-                  </a:graphicData>
-                </a:graphic>
-                <wp14:sizeRelH relativeFrom="margin">
-                  <wp14:pctWidth>0</wp14:pctWidth>
-                </wp14:sizeRelH>
-                <wp14:sizeRelV relativeFrom="margin">
-                  <wp14:pctHeight>0</wp14:pctHeight>
-                </wp14:sizeRelV>
-              </wp:anchor>
-            </w:drawing>
-          </mc:Choice>
-          <mc:Fallback>
-            <w:pict>
-              <v:rect w14:anchorId="20BB907A" id="Rechteck 31" o:spid="_x0000_s1026" style="position:absolute;margin-left:150.5pt;margin-top:347.5pt;width:110.7pt;height:34.35pt;z-index:251701248;visibility:visible;mso-wrap-style:square;mso-width-percent:0;mso-height-percent:0;mso-wrap-distance-left:9pt;mso-wrap-distance-top:0;mso-wrap-distance-right:9pt;mso-wrap-distance-bottom:0;mso-position-horizontal:absolute;mso-position-horizontal-relative:text;mso-position-vertical:absolute;mso-position-vertical-relative:text;mso-width-percent:0;mso-height-percent:0;mso-width-relative:margin;mso-height-relative:margin;v-text-anchor:middle" o:gfxdata="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" filled="f" strokecolor="#1f3763 [1604]" strokeweight="1pt"/>
-            </w:pict>
-          </mc:Fallback>
-        </mc:AlternateContent>
-      </w:r>
-      <w:r>
-        <w:rPr>
-          <w:noProof/>
-        </w:rPr>
-        <mc:AlternateContent>
-          <mc:Choice Requires="wps">
-            <w:drawing>
-              <wp:anchor distT="0" distB="0" distL="114300" distR="114300" simplePos="0" relativeHeight="251683840" behindDoc="0" locked="0" layoutInCell="1" allowOverlap="1" wp14:anchorId="383BC30E" wp14:editId="46514172">
-                <wp:simplePos x="0" y="0"/>
-                <wp:positionH relativeFrom="column">
-                  <wp:posOffset>1915372</wp:posOffset>
-                </wp:positionH>
-                <wp:positionV relativeFrom="paragraph">
-                  <wp:posOffset>4211532</wp:posOffset>
-                </wp:positionV>
-                <wp:extent cx="1405890" cy="201295"/>
-                <wp:effectExtent l="0" t="0" r="22860" b="27305"/>
-                <wp:wrapNone/>
-                <wp:docPr id="21" name="Rechteck 21"/>
-                <wp:cNvGraphicFramePr/>
-                <a:graphic xmlns:a="http://schemas.openxmlformats.org/drawingml/2006/main">
-                  <a:graphicData uri="http://schemas.microsoft.com/office/word/2010/wordprocessingShape">
-                    <wps:wsp>
-                      <wps:cNvSpPr/>
-                      <wps:spPr>
-                        <a:xfrm>
-                          <a:off x="0" y="0"/>
-                          <a:ext cx="1405890" cy="201295"/>
-                        </a:xfrm>
-                        <a:prstGeom prst="rect">
-                          <a:avLst/>
-                        </a:prstGeom>
-                        <a:solidFill>
-                          <a:srgbClr val="C00000">
-                            <a:alpha val="23137"/>
-                          </a:srgbClr>
-                        </a:solidFill>
-                        <a:ln>
-                          <a:solidFill>
-                            <a:schemeClr val="accent2"/>
-                          </a:solidFill>
-                        </a:ln>
-                      </wps:spPr>
-                      <wps:style>
-                        <a:lnRef idx="2">
-                          <a:schemeClr val="accent1">
-                            <a:shade val="50000"/>
-                          </a:schemeClr>
-                        </a:lnRef>
-                        <a:fillRef idx="1">
-                          <a:schemeClr val="accent1"/>
-                        </a:fillRef>
-                        <a:effectRef idx="0">
-                          <a:schemeClr val="accent1"/>
-                        </a:effectRef>
-                        <a:fontRef idx="minor">
-                          <a:schemeClr val="lt1"/>
-                        </a:fontRef>
-                      </wps:style>
-                      <wps:bodyPr rot="0" spcFirstLastPara="0" vertOverflow="overflow" horzOverflow="overflow" vert="horz" wrap="square" lIns="91440" tIns="45720" rIns="91440" bIns="45720" numCol="1" spcCol="0" rtlCol="0" fromWordArt="0" anchor="ctr" anchorCtr="0" forceAA="0" compatLnSpc="1">
-                        <a:prstTxWarp prst="textNoShape">
-                          <a:avLst/>
-                        </a:prstTxWarp>
-                        <a:noAutofit/>
-                      </wps:bodyPr>
-                    </wps:wsp>
-                  </a:graphicData>
-                </a:graphic>
-                <wp14:sizeRelH relativeFrom="margin">
-                  <wp14:pctWidth>0</wp14:pctWidth>
-                </wp14:sizeRelH>
-                <wp14:sizeRelV relativeFrom="margin">
-                  <wp14:pctHeight>0</wp14:pctHeight>
-                </wp14:sizeRelV>
-              </wp:anchor>
-            </w:drawing>
-          </mc:Choice>
-          <mc:Fallback>
-            <w:pict>
-              <v:rect w14:anchorId="0EB073D8" id="Rechteck 21" o:spid="_x0000_s1026" style="position:absolute;margin-left:150.8pt;margin-top:331.6pt;width:110.7pt;height:15.85pt;z-index:251683840;visibility:visible;mso-wrap-style:square;mso-width-percent:0;mso-height-percent:0;mso-wrap-distance-left:9pt;mso-wrap-distance-top:0;mso-wrap-distance-right:9pt;mso-wrap-distance-bottom:0;mso-position-horizontal:absolute;mso-position-horizontal-relative:text;mso-position-vertical:absolute;mso-position-vertical-relative:text;mso-width-percent:0;mso-height-percent:0;mso-width-relative:margin;mso-height-relative:margin;v-text-anchor:middle" o:gfxdata="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" fillcolor="#c00000" strokecolor="#ed7d31 [3205]" strokeweight="1pt">
-                <v:fill opacity="15163f"/>
-              </v:rect>
-            </w:pict>
-          </mc:Fallback>
-        </mc:AlternateContent>
-      </w:r>
-      <w:r>
-        <w:rPr>
-          <w:noProof/>
-        </w:rPr>
-        <mc:AlternateContent>
-          <mc:Choice Requires="wps">
-            <w:drawing>
-              <wp:anchor distT="0" distB="0" distL="114300" distR="114300" simplePos="0" relativeHeight="251709440" behindDoc="0" locked="0" layoutInCell="1" allowOverlap="1" wp14:anchorId="3A867390" wp14:editId="37F2C302">
-                <wp:simplePos x="0" y="0"/>
-                <wp:positionH relativeFrom="column">
-                  <wp:posOffset>997041</wp:posOffset>
-                </wp:positionH>
-                <wp:positionV relativeFrom="paragraph">
-                  <wp:posOffset>4649198</wp:posOffset>
-                </wp:positionV>
-                <wp:extent cx="911678" cy="1863090"/>
-                <wp:effectExtent l="0" t="0" r="22225" b="22860"/>
-                <wp:wrapNone/>
-                <wp:docPr id="34" name="Verbinder: gewinkelt 34"/>
-                <wp:cNvGraphicFramePr/>
-                <a:graphic xmlns:a="http://schemas.openxmlformats.org/drawingml/2006/main">
-                  <a:graphicData uri="http://schemas.microsoft.com/office/word/2010/wordprocessingShape">
-                    <wps:wsp>
-                      <wps:cNvCnPr/>
-                      <wps:spPr>
-                        <a:xfrm flipH="1">
-                          <a:off x="0" y="0"/>
-                          <a:ext cx="911678" cy="1863090"/>
-                        </a:xfrm>
-                        <a:prstGeom prst="bentConnector3">
-                          <a:avLst/>
-                        </a:prstGeom>
-                      </wps:spPr>
-                      <wps:style>
-                        <a:lnRef idx="1">
-                          <a:schemeClr val="accent1"/>
-                        </a:lnRef>
-                        <a:fillRef idx="0">
-                          <a:schemeClr val="accent1"/>
-                        </a:fillRef>
-                        <a:effectRef idx="0">
-                          <a:schemeClr val="accent1"/>
-                        </a:effectRef>
-                        <a:fontRef idx="minor">
-                          <a:schemeClr val="tx1"/>
-                        </a:fontRef>
-                      </wps:style>
-                      <wps:bodyPr/>
-                    </wps:wsp>
-                  </a:graphicData>
-                </a:graphic>
-                <wp14:sizeRelV relativeFrom="margin">
-                  <wp14:pctHeight>0</wp14:pctHeight>
-                </wp14:sizeRelV>
-              </wp:anchor>
-            </w:drawing>
-          </mc:Choice>
-          <mc:Fallback>
-            <w:pict>
-              <v:shape w14:anchorId="776CB8F7" id="Verbinder: gewinkelt 34" o:spid="_x0000_s1026" type="#_x0000_t34" style="position:absolute;margin-left:78.5pt;margin-top:366.1pt;width:71.8pt;height:146.7pt;flip:x;z-index:251709440;visibility:visible;mso-wrap-style:square;mso-height-percent:0;mso-wrap-distance-left:9pt;mso-wrap-distance-top:0;mso-wrap-distance-right:9pt;mso-wrap-distance-bottom:0;mso-position-horizontal:absolute;mso-position-horizontal-relative:text;mso-position-vertical:absolute;mso-position-vertical-relative:text;mso-height-percent:0;mso-height-relative:margin" o:gfxdata="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" strokecolor="#4472c4 [3204]" strokeweight=".5pt"/>
-            </w:pict>
-          </mc:Fallback>
-        </mc:AlternateContent>
-      </w:r>
-      <w:r>
-        <w:rPr>
-          <w:noProof/>
-        </w:rPr>
-        <mc:AlternateContent>
-          <mc:Choice Requires="wps">
-            <w:drawing>
-              <wp:anchor distT="0" distB="0" distL="114300" distR="114300" simplePos="0" relativeHeight="251704320" behindDoc="0" locked="0" layoutInCell="1" allowOverlap="1" wp14:anchorId="6A158251" wp14:editId="2CC13FE6">
-                <wp:simplePos x="0" y="0"/>
-                <wp:positionH relativeFrom="column">
-                  <wp:posOffset>996950</wp:posOffset>
-                </wp:positionH>
-                <wp:positionV relativeFrom="paragraph">
-                  <wp:posOffset>6511290</wp:posOffset>
-                </wp:positionV>
-                <wp:extent cx="922655" cy="5715"/>
-                <wp:effectExtent l="0" t="0" r="29845" b="32385"/>
-                <wp:wrapNone/>
-                <wp:docPr id="33" name="Gerader Verbinder 33"/>
-                <wp:cNvGraphicFramePr/>
-                <a:graphic xmlns:a="http://schemas.openxmlformats.org/drawingml/2006/main">
-                  <a:graphicData uri="http://schemas.microsoft.com/office/word/2010/wordprocessingShape">
-                    <wps:wsp>
-                      <wps:cNvCnPr/>
-                      <wps:spPr>
-                        <a:xfrm>
-                          <a:off x="0" y="0"/>
-                          <a:ext cx="922655" cy="5715"/>
-                        </a:xfrm>
-                        <a:prstGeom prst="line">
-                          <a:avLst/>
-                        </a:prstGeom>
-                      </wps:spPr>
-                      <wps:style>
-                        <a:lnRef idx="1">
-                          <a:schemeClr val="accent1"/>
-                        </a:lnRef>
-                        <a:fillRef idx="0">
-                          <a:schemeClr val="accent1"/>
-                        </a:fillRef>
-                        <a:effectRef idx="0">
-                          <a:schemeClr val="accent1"/>
-                        </a:effectRef>
-                        <a:fontRef idx="minor">
-                          <a:schemeClr val="tx1"/>
-                        </a:fontRef>
-                      </wps:style>
-                      <wps:bodyPr/>
-                    </wps:wsp>
-                  </a:graphicData>
-                </a:graphic>
-                <wp14:sizeRelH relativeFrom="margin">
-                  <wp14:pctWidth>0</wp14:pctWidth>
-                </wp14:sizeRelH>
-                <wp14:sizeRelV relativeFrom="margin">
-                  <wp14:pctHeight>0</wp14:pctHeight>
-                </wp14:sizeRelV>
-              </wp:anchor>
-            </w:drawing>
-          </mc:Choice>
-          <mc:Fallback>
-            <w:pict>
-              <v:line w14:anchorId="08B25AB4" id="Gerader Verbinder 33" o:spid="_x0000_s1026" style="position:absolute;z-index:251704320;visibility:visible;mso-wrap-style:square;mso-width-percent:0;mso-height-percent:0;mso-wrap-distance-left:9pt;mso-wrap-distance-top:0;mso-wrap-distance-right:9pt;mso-wrap-distance-bottom:0;mso-position-horizontal:absolute;mso-position-horizontal-relative:text;mso-position-vertical:absolute;mso-position-vertical-relative:text;mso-width-percent:0;mso-height-percent:0;mso-width-relative:margin;mso-height-relative:margin" from="78.5pt,512.7pt" to="151.15pt,513.15pt" o:gfxdata="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" strokecolor="#4472c4 [3204]" strokeweight=".5pt">
-                <v:stroke joinstyle="miter"/>
-              </v:line>
-            </w:pict>
-          </mc:Fallback>
-        </mc:AlternateContent>
-      </w:r>
-      <w:r>
-        <w:rPr>
-          <w:noProof/>
-        </w:rPr>
-        <mc:AlternateContent>
-          <mc:Choice Requires="wps">
-            <w:drawing>
-              <wp:anchor distT="0" distB="0" distL="114300" distR="114300" simplePos="0" relativeHeight="251693056" behindDoc="0" locked="0" layoutInCell="1" allowOverlap="1" wp14:anchorId="0F0DDA68" wp14:editId="241734A1">
-                <wp:simplePos x="0" y="0"/>
-                <wp:positionH relativeFrom="column">
-                  <wp:posOffset>837565</wp:posOffset>
-                </wp:positionH>
-                <wp:positionV relativeFrom="paragraph">
-                  <wp:posOffset>4045584</wp:posOffset>
-                </wp:positionV>
-                <wp:extent cx="1066800" cy="1569720"/>
-                <wp:effectExtent l="0" t="0" r="19050" b="30480"/>
-                <wp:wrapNone/>
-                <wp:docPr id="26" name="Verbinder: gewinkelt 26"/>
-                <wp:cNvGraphicFramePr/>
-                <a:graphic xmlns:a="http://schemas.openxmlformats.org/drawingml/2006/main">
-                  <a:graphicData uri="http://schemas.microsoft.com/office/word/2010/wordprocessingShape">
-                    <wps:wsp>
-                      <wps:cNvCnPr/>
-                      <wps:spPr>
-                        <a:xfrm flipH="1" flipV="1">
-                          <a:off x="0" y="0"/>
-                          <a:ext cx="1066800" cy="1569720"/>
-                        </a:xfrm>
-                        <a:prstGeom prst="bentConnector3">
-                          <a:avLst>
-                            <a:gd name="adj1" fmla="val 71523"/>
-                          </a:avLst>
-                        </a:prstGeom>
-                      </wps:spPr>
-                      <wps:style>
-                        <a:lnRef idx="1">
-                          <a:schemeClr val="accent2"/>
-                        </a:lnRef>
-                        <a:fillRef idx="0">
-                          <a:schemeClr val="accent2"/>
-                        </a:fillRef>
-                        <a:effectRef idx="0">
-                          <a:schemeClr val="accent2"/>
-                        </a:effectRef>
-                        <a:fontRef idx="minor">
-                          <a:schemeClr val="tx1"/>
-                        </a:fontRef>
-                      </wps:style>
-                      <wps:bodyPr/>
-                    </wps:wsp>
-                  </a:graphicData>
-                </a:graphic>
-                <wp14:sizeRelH relativeFrom="margin">
-                  <wp14:pctWidth>0</wp14:pctWidth>
-                </wp14:sizeRelH>
-                <wp14:sizeRelV relativeFrom="margin">
-                  <wp14:pctHeight>0</wp14:pctHeight>
-                </wp14:sizeRelV>
-              </wp:anchor>
-            </w:drawing>
-          </mc:Choice>
-          <mc:Fallback>
-            <w:pict>
-              <v:shape w14:anchorId="79558769" id="Verbinder: gewinkelt 26" o:spid="_x0000_s1026" type="#_x0000_t34" style="position:absolute;margin-left:65.95pt;margin-top:318.55pt;width:84pt;height:123.6pt;flip:x y;z-index:251693056;visibility:visible;mso-wrap-style:square;mso-width-percent:0;mso-height-percent:0;mso-wrap-distance-left:9pt;mso-wrap-distance-top:0;mso-wrap-distance-right:9pt;mso-wrap-distance-bottom:0;mso-position-horizontal:absolute;mso-position-horizontal-relative:text;mso-position-vertical:absolute;mso-position-vertical-relative:text;mso-width-percent:0;mso-height-percent:0;mso-width-relative:margin;mso-height-relative:margin" o:gfxdata="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" adj="15449" strokecolor="#ed7d31 [3205]" strokeweight=".5pt"/>
-            </w:pict>
-          </mc:Fallback>
-        </mc:AlternateContent>
-      </w:r>
-      <w:r>
-        <w:rPr>
-          <w:noProof/>
-        </w:rPr>
-        <mc:AlternateContent>
-          <mc:Choice Requires="wps">
-            <w:drawing>
-              <wp:anchor distT="0" distB="0" distL="114300" distR="114300" simplePos="0" relativeHeight="251691008" behindDoc="0" locked="0" layoutInCell="1" allowOverlap="1" wp14:anchorId="207085D1" wp14:editId="24871C6F">
-                <wp:simplePos x="0" y="0"/>
-                <wp:positionH relativeFrom="column">
-                  <wp:posOffset>837564</wp:posOffset>
-                </wp:positionH>
-                <wp:positionV relativeFrom="paragraph">
-                  <wp:posOffset>4045585</wp:posOffset>
-                </wp:positionV>
-                <wp:extent cx="1059180" cy="259080"/>
-                <wp:effectExtent l="0" t="0" r="26670" b="26670"/>
-                <wp:wrapNone/>
-                <wp:docPr id="25" name="Verbinder: gewinkelt 25"/>
-                <wp:cNvGraphicFramePr/>
-                <a:graphic xmlns:a="http://schemas.openxmlformats.org/drawingml/2006/main">
-                  <a:graphicData uri="http://schemas.microsoft.com/office/word/2010/wordprocessingShape">
-                    <wps:wsp>
-                      <wps:cNvCnPr/>
-                      <wps:spPr>
-                        <a:xfrm flipH="1" flipV="1">
-                          <a:off x="0" y="0"/>
-                          <a:ext cx="1059180" cy="259080"/>
-                        </a:xfrm>
-                        <a:prstGeom prst="bentConnector3">
-                          <a:avLst>
-                            <a:gd name="adj1" fmla="val 71362"/>
-                          </a:avLst>
-                        </a:prstGeom>
-                      </wps:spPr>
-                      <wps:style>
-                        <a:lnRef idx="1">
-                          <a:schemeClr val="accent2"/>
-                        </a:lnRef>
-                        <a:fillRef idx="0">
-                          <a:schemeClr val="accent2"/>
-                        </a:fillRef>
-                        <a:effectRef idx="0">
-                          <a:schemeClr val="accent2"/>
-                        </a:effectRef>
-                        <a:fontRef idx="minor">
-                          <a:schemeClr val="tx1"/>
-                        </a:fontRef>
-                      </wps:style>
-                      <wps:bodyPr/>
-                    </wps:wsp>
-                  </a:graphicData>
-                </a:graphic>
-                <wp14:sizeRelH relativeFrom="margin">
-                  <wp14:pctWidth>0</wp14:pctWidth>
-                </wp14:sizeRelH>
-                <wp14:sizeRelV relativeFrom="margin">
-                  <wp14:pctHeight>0</wp14:pctHeight>
-                </wp14:sizeRelV>
-              </wp:anchor>
-            </w:drawing>
-          </mc:Choice>
-          <mc:Fallback>
-            <w:pict>
-              <v:shape w14:anchorId="58907E0A" id="Verbinder: gewinkelt 25" o:spid="_x0000_s1026" type="#_x0000_t34" style="position:absolute;margin-left:65.95pt;margin-top:318.55pt;width:83.4pt;height:20.4pt;flip:x y;z-index:251691008;visibility:visible;mso-wrap-style:square;mso-width-percent:0;mso-height-percent:0;mso-wrap-distance-left:9pt;mso-wrap-distance-top:0;mso-wrap-distance-right:9pt;mso-wrap-distance-bottom:0;mso-position-horizontal:absolute;mso-position-horizontal-relative:text;mso-position-vertical:absolute;mso-position-vertical-relative:text;mso-width-percent:0;mso-height-percent:0;mso-width-relative:margin;mso-height-relative:margin" o:gfxdata="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" adj="15414" strokecolor="#ed7d31 [3205]" strokeweight=".5pt"/>
-            </w:pict>
-          </mc:Fallback>
-        </mc:AlternateContent>
-      </w:r>
-      <w:r>
-        <w:rPr>
-          <w:noProof/>
-        </w:rPr>
-        <mc:AlternateContent>
-          <mc:Choice Requires="wps">
-            <w:drawing>
-              <wp:anchor distT="0" distB="0" distL="114300" distR="114300" simplePos="0" relativeHeight="251688960" behindDoc="0" locked="0" layoutInCell="1" allowOverlap="1" wp14:anchorId="0BA1C0AC" wp14:editId="76BC50B0">
-                <wp:simplePos x="0" y="0"/>
-                <wp:positionH relativeFrom="column">
-                  <wp:posOffset>837565</wp:posOffset>
-                </wp:positionH>
-                <wp:positionV relativeFrom="paragraph">
-                  <wp:posOffset>2392045</wp:posOffset>
-                </wp:positionV>
-                <wp:extent cx="1066800" cy="1659255"/>
-                <wp:effectExtent l="0" t="0" r="19050" b="36195"/>
-                <wp:wrapNone/>
-                <wp:docPr id="24" name="Verbinder: gewinkelt 24"/>
-                <wp:cNvGraphicFramePr/>
-                <a:graphic xmlns:a="http://schemas.openxmlformats.org/drawingml/2006/main">
-                  <a:graphicData uri="http://schemas.microsoft.com/office/word/2010/wordprocessingShape">
-                    <wps:wsp>
-                      <wps:cNvCnPr/>
-                      <wps:spPr>
-                        <a:xfrm flipH="1">
-                          <a:off x="0" y="0"/>
-                          <a:ext cx="1066800" cy="1659255"/>
-                        </a:xfrm>
-                        <a:prstGeom prst="bentConnector3">
-                          <a:avLst>
-                            <a:gd name="adj1" fmla="val 71362"/>
-                          </a:avLst>
-                        </a:prstGeom>
-                      </wps:spPr>
-                      <wps:style>
-                        <a:lnRef idx="1">
-                          <a:schemeClr val="accent2"/>
-                        </a:lnRef>
-                        <a:fillRef idx="0">
-                          <a:schemeClr val="accent2"/>
-                        </a:fillRef>
-                        <a:effectRef idx="0">
-                          <a:schemeClr val="accent2"/>
-                        </a:effectRef>
-                        <a:fontRef idx="minor">
-                          <a:schemeClr val="tx1"/>
-                        </a:fontRef>
-                      </wps:style>
-                      <wps:bodyPr/>
-                    </wps:wsp>
-                  </a:graphicData>
-                </a:graphic>
-                <wp14:sizeRelH relativeFrom="margin">
-                  <wp14:pctWidth>0</wp14:pctWidth>
-                </wp14:sizeRelH>
-                <wp14:sizeRelV relativeFrom="margin">
-                  <wp14:pctHeight>0</wp14:pctHeight>
-                </wp14:sizeRelV>
-              </wp:anchor>
-            </w:drawing>
-          </mc:Choice>
-          <mc:Fallback>
-            <w:pict>
-              <v:shape w14:anchorId="7E50756F" id="Verbinder: gewinkelt 24" o:spid="_x0000_s1026" type="#_x0000_t34" style="position:absolute;margin-left:65.95pt;margin-top:188.35pt;width:84pt;height:130.65pt;flip:x;z-index:251688960;visibility:visible;mso-wrap-style:square;mso-width-percent:0;mso-height-percent:0;mso-wrap-distance-left:9pt;mso-wrap-distance-top:0;mso-wrap-distance-right:9pt;mso-wrap-distance-bottom:0;mso-position-horizontal:absolute;mso-position-horizontal-relative:text;mso-position-vertical:absolute;mso-position-vertical-relative:text;mso-width-percent:0;mso-height-percent:0;mso-width-relative:margin;mso-height-relative:margin" o:gfxdata="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" adj="15414" strokecolor="#ed7d31 [3205]" strokeweight=".5pt"/>
-            </w:pict>
-          </mc:Fallback>
-        </mc:AlternateContent>
-      </w:r>
-      <w:r>
-        <w:rPr>
-          <w:noProof/>
-        </w:rPr>
-        <mc:AlternateContent>
-          <mc:Choice Requires="wps">
-            <w:drawing>
-              <wp:anchor distT="0" distB="0" distL="114300" distR="114300" simplePos="0" relativeHeight="251696128" behindDoc="0" locked="0" layoutInCell="1" allowOverlap="1" wp14:anchorId="4AA121AE" wp14:editId="078D104C">
-                <wp:simplePos x="0" y="0"/>
-                <wp:positionH relativeFrom="column">
-                  <wp:posOffset>3321685</wp:posOffset>
-                </wp:positionH>
-                <wp:positionV relativeFrom="paragraph">
-                  <wp:posOffset>3992245</wp:posOffset>
-                </wp:positionV>
-                <wp:extent cx="1066800" cy="586740"/>
-                <wp:effectExtent l="0" t="0" r="19050" b="22860"/>
-                <wp:wrapNone/>
-                <wp:docPr id="28" name="Verbinder: gewinkelt 28"/>
-                <wp:cNvGraphicFramePr/>
-                <a:graphic xmlns:a="http://schemas.openxmlformats.org/drawingml/2006/main">
-                  <a:graphicData uri="http://schemas.microsoft.com/office/word/2010/wordprocessingShape">
-                    <wps:wsp>
-                      <wps:cNvCnPr/>
-                      <wps:spPr>
-                        <a:xfrm>
-                          <a:off x="0" y="0"/>
-                          <a:ext cx="1066800" cy="586740"/>
-                        </a:xfrm>
-                        <a:prstGeom prst="bentConnector3">
-                          <a:avLst>
-                            <a:gd name="adj1" fmla="val 60195"/>
-                          </a:avLst>
-                        </a:prstGeom>
-                      </wps:spPr>
-                      <wps:style>
-                        <a:lnRef idx="1">
-                          <a:schemeClr val="accent6"/>
-                        </a:lnRef>
-                        <a:fillRef idx="0">
-                          <a:schemeClr val="accent6"/>
-                        </a:fillRef>
-                        <a:effectRef idx="0">
-                          <a:schemeClr val="accent6"/>
-                        </a:effectRef>
-                        <a:fontRef idx="minor">
-                          <a:schemeClr val="tx1"/>
-                        </a:fontRef>
-                      </wps:style>
-                      <wps:bodyPr/>
-                    </wps:wsp>
-                  </a:graphicData>
-                </a:graphic>
-                <wp14:sizeRelH relativeFrom="margin">
-                  <wp14:pctWidth>0</wp14:pctWidth>
-                </wp14:sizeRelH>
-                <wp14:sizeRelV relativeFrom="margin">
-                  <wp14:pctHeight>0</wp14:pctHeight>
-                </wp14:sizeRelV>
-              </wp:anchor>
-            </w:drawing>
-          </mc:Choice>
-          <mc:Fallback>
-            <w:pict>
-              <v:shape w14:anchorId="12A82149" id="Verbinder: gewinkelt 28" o:spid="_x0000_s1026" type="#_x0000_t34" style="position:absolute;margin-left:261.55pt;margin-top:314.35pt;width:84pt;height:46.2pt;z-index:251696128;visibility:visible;mso-wrap-style:square;mso-width-percent:0;mso-height-percent:0;mso-wrap-distance-left:9pt;mso-wrap-distance-top:0;mso-wrap-distance-right:9pt;mso-wrap-distance-bottom:0;mso-position-horizontal:absolute;mso-position-horizontal-relative:text;mso-position-vertical:absolute;mso-position-vertical-relative:text;mso-width-percent:0;mso-height-percent:0;mso-width-relative:margin;mso-height-relative:margin" o:gfxdata="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" adj="13002" strokecolor="#70ad47 [3209]" strokeweight=".5pt"/>
-            </w:pict>
-          </mc:Fallback>
-        </mc:AlternateContent>
-      </w:r>
-      <w:r>
-        <w:rPr>
-          <w:noProof/>
-        </w:rPr>
-        <mc:AlternateContent>
-          <mc:Choice Requires="wps">
-            <w:drawing>
-              <wp:anchor distT="0" distB="0" distL="114300" distR="114300" simplePos="0" relativeHeight="251698176" behindDoc="0" locked="0" layoutInCell="1" allowOverlap="1" wp14:anchorId="3F8EE283" wp14:editId="46FE310B">
-                <wp:simplePos x="0" y="0"/>
-                <wp:positionH relativeFrom="column">
-                  <wp:posOffset>3321685</wp:posOffset>
-                </wp:positionH>
-                <wp:positionV relativeFrom="paragraph">
-                  <wp:posOffset>4567555</wp:posOffset>
-                </wp:positionV>
-                <wp:extent cx="1066800" cy="529590"/>
-                <wp:effectExtent l="0" t="0" r="19050" b="22860"/>
-                <wp:wrapNone/>
-                <wp:docPr id="29" name="Verbinder: gewinkelt 29"/>
-                <wp:cNvGraphicFramePr/>
-                <a:graphic xmlns:a="http://schemas.openxmlformats.org/drawingml/2006/main">
-                  <a:graphicData uri="http://schemas.microsoft.com/office/word/2010/wordprocessingShape">
-                    <wps:wsp>
-                      <wps:cNvCnPr/>
-                      <wps:spPr>
-                        <a:xfrm flipV="1">
-                          <a:off x="0" y="0"/>
-                          <a:ext cx="1066800" cy="529590"/>
-                        </a:xfrm>
-                        <a:prstGeom prst="bentConnector3">
-                          <a:avLst>
-                            <a:gd name="adj1" fmla="val 60337"/>
-                          </a:avLst>
-                        </a:prstGeom>
-                      </wps:spPr>
-                      <wps:style>
-                        <a:lnRef idx="1">
-                          <a:schemeClr val="accent6"/>
-                        </a:lnRef>
-                        <a:fillRef idx="0">
-                          <a:schemeClr val="accent6"/>
-                        </a:fillRef>
-                        <a:effectRef idx="0">
-                          <a:schemeClr val="accent6"/>
-                        </a:effectRef>
-                        <a:fontRef idx="minor">
-                          <a:schemeClr val="tx1"/>
-                        </a:fontRef>
-                      </wps:style>
-                      <wps:bodyPr/>
-                    </wps:wsp>
-                  </a:graphicData>
-                </a:graphic>
-                <wp14:sizeRelH relativeFrom="margin">
-                  <wp14:pctWidth>0</wp14:pctWidth>
-                </wp14:sizeRelH>
-                <wp14:sizeRelV relativeFrom="margin">
-                  <wp14:pctHeight>0</wp14:pctHeight>
-                </wp14:sizeRelV>
-              </wp:anchor>
-            </w:drawing>
-          </mc:Choice>
-          <mc:Fallback>
-            <w:pict>
-              <v:shape w14:anchorId="2EC34DC8" id="Verbinder: gewinkelt 29" o:spid="_x0000_s1026" type="#_x0000_t34" style="position:absolute;margin-left:261.55pt;margin-top:359.65pt;width:84pt;height:41.7pt;flip:y;z-index:251698176;visibility:visible;mso-wrap-style:square;mso-width-percent:0;mso-height-percent:0;mso-wrap-distance-left:9pt;mso-wrap-distance-top:0;mso-wrap-distance-right:9pt;mso-wrap-distance-bottom:0;mso-position-horizontal:absolute;mso-position-horizontal-relative:text;mso-position-vertical:absolute;mso-position-vertical-relative:text;mso-width-percent:0;mso-height-percent:0;mso-width-relative:margin;mso-height-relative:margin" o:gfxdata="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" adj="13033" strokecolor="#70ad47 [3209]" strokeweight=".5pt"/>
-            </w:pict>
-          </mc:Fallback>
-        </mc:AlternateContent>
-      </w:r>
-      <w:r>
-        <w:rPr>
-          <w:noProof/>
-        </w:rPr>
-        <mc:AlternateContent>
-          <mc:Choice Requires="wps">
-            <w:drawing>
-              <wp:anchor distT="0" distB="0" distL="114300" distR="114300" simplePos="0" relativeHeight="251700224" behindDoc="0" locked="0" layoutInCell="1" allowOverlap="1" wp14:anchorId="7FC03100" wp14:editId="0185CEE4">
-                <wp:simplePos x="0" y="0"/>
-                <wp:positionH relativeFrom="margin">
-                  <wp:align>right</wp:align>
-                </wp:positionH>
-                <wp:positionV relativeFrom="paragraph">
-                  <wp:posOffset>4274820</wp:posOffset>
-                </wp:positionV>
-                <wp:extent cx="1349375" cy="658495"/>
-                <wp:effectExtent l="0" t="0" r="22225" b="27305"/>
-                <wp:wrapNone/>
-                <wp:docPr id="30" name="Rechteck 30"/>
-                <wp:cNvGraphicFramePr/>
-                <a:graphic xmlns:a="http://schemas.openxmlformats.org/drawingml/2006/main">
-                  <a:graphicData uri="http://schemas.microsoft.com/office/word/2010/wordprocessingShape">
-                    <wps:wsp>
-                      <wps:cNvSpPr/>
-                      <wps:spPr>
-                        <a:xfrm>
-                          <a:off x="0" y="0"/>
-                          <a:ext cx="1349375" cy="658495"/>
-                        </a:xfrm>
-                        <a:prstGeom prst="rect">
-                          <a:avLst/>
-                        </a:prstGeom>
-                        <a:solidFill>
-                          <a:srgbClr val="B5E1D0"/>
-                        </a:solidFill>
-                        <a:ln>
-                          <a:solidFill>
-                            <a:schemeClr val="accent6">
-                              <a:lumMod val="75000"/>
-                            </a:schemeClr>
-                          </a:solidFill>
-                        </a:ln>
-                      </wps:spPr>
-                      <wps:style>
-                        <a:lnRef idx="2">
-                          <a:schemeClr val="accent1">
-                            <a:shade val="50000"/>
-                          </a:schemeClr>
-                        </a:lnRef>
-                        <a:fillRef idx="1">
-                          <a:schemeClr val="accent1"/>
-                        </a:fillRef>
-                        <a:effectRef idx="0">
-                          <a:schemeClr val="accent1"/>
-                        </a:effectRef>
-                        <a:fontRef idx="minor">
-                          <a:schemeClr val="lt1"/>
-                        </a:fontRef>
-                      </wps:style>
                       <wps:txbx>
                         <w:txbxContent>
                           <w:p>
                             <w:pPr>
                               <w:jc w:val="center"/>
-                              <w:rPr>
-                                <w:color w:val="000000" w:themeColor="text1"/>
-                                <w14:shadow w14:blurRad="38100" w14:dist="19050" w14:dir="2700000" w14:sx="100000" w14:sy="100000" w14:kx="0" w14:ky="0" w14:algn="tl">
-                                  <w14:schemeClr w14:val="dk1">
-                                    <w14:alpha w14:val="60000"/>
-                                  </w14:schemeClr>
-                                </w14:shadow>
-                                <w14:textOutline w14:w="0" w14:cap="flat" w14:cmpd="sng" w14:algn="ctr">
-                                  <w14:noFill/>
-                                  <w14:prstDash w14:val="solid"/>
-                                  <w14:round/>
-                                </w14:textOutline>
-                              </w:rPr>
                             </w:pPr>
                             <w:r>
-                              <w:rPr>
-                                <w:color w:val="000000" w:themeColor="text1"/>
-                                <w14:shadow w14:blurRad="38100" w14:dist="19050" w14:dir="2700000" w14:sx="100000" w14:sy="100000" w14:kx="0" w14:ky="0" w14:algn="tl">
-                                  <w14:schemeClr w14:val="dk1">
-                                    <w14:alpha w14:val="60000"/>
-                                  </w14:schemeClr>
-                                </w14:shadow>
-                                <w14:textOutline w14:w="0" w14:cap="flat" w14:cmpd="sng" w14:algn="ctr">
-                                  <w14:noFill/>
-                                  <w14:prstDash w14:val="solid"/>
-                                  <w14:round/>
-                                </w14:textOutline>
-                              </w:rPr>
-                              <w:t>auszutauschende/ zu überschreibende</w:t>
-                            </w:r>
-                            <w:r>
-                              <w:rPr>
-                                <w:color w:val="000000" w:themeColor="text1"/>
-                                <w14:shadow w14:blurRad="38100" w14:dist="19050" w14:dir="2700000" w14:sx="100000" w14:sy="100000" w14:kx="0" w14:ky="0" w14:algn="tl">
-                                  <w14:schemeClr w14:val="dk1">
-                                    <w14:alpha w14:val="60000"/>
-                                  </w14:schemeClr>
-                                </w14:shadow>
-                                <w14:textOutline w14:w="0" w14:cap="flat" w14:cmpd="sng" w14:algn="ctr">
-                                  <w14:noFill/>
-                                  <w14:prstDash w14:val="solid"/>
-                                  <w14:round/>
-                                </w14:textOutline>
-                              </w:rPr>
-                              <w:t xml:space="preserve"> Dateien</w:t>
+                              <w:t>ä</w:t>
                             </w:r>
                           </w:p>
                         </w:txbxContent>
@@ -3059,62 +3527,19 @@
           </mc:Choice>
           <mc:Fallback>
             <w:pict>
-              <v:rect w14:anchorId="7FC03100" id="Rechteck 30" o:spid="_x0000_s1027" style="position:absolute;margin-left:55.05pt;margin-top:336.6pt;width:106.25pt;height:51.85pt;z-index:251700224;visibility:visible;mso-wrap-style:square;mso-width-percent:0;mso-height-percent:0;mso-wrap-distance-left:9pt;mso-wrap-distance-top:0;mso-wrap-distance-right:9pt;mso-wrap-distance-bottom:0;mso-position-horizontal:right;mso-position-horizontal-relative:margin;mso-position-vertical:absolute;mso-position-vertical-relative:text;mso-width-percent:0;mso-height-percent:0;mso-width-relative:margin;mso-height-relative:margin;v-text-anchor:middle" o:gfxdata="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" fillcolor="#b5e1d0" strokecolor="#538135 [2409]" strokeweight="1pt">
+              <v:rect w14:anchorId="3E9ED1CD" id="Rechteck 41" o:spid="_x0000_s1029" style="position:absolute;left:0;text-align:left;margin-left:161.35pt;margin-top:33.55pt;width:138.05pt;height:40.9pt;z-index:251664414;visibility:visible;mso-wrap-style:square;mso-width-percent:0;mso-height-percent:0;mso-wrap-distance-left:9pt;mso-wrap-distance-top:0;mso-wrap-distance-right:9pt;mso-wrap-distance-bottom:0;mso-position-horizontal:absolute;mso-position-horizontal-relative:text;mso-position-vertical:absolute;mso-position-vertical-relative:text;mso-width-percent:0;mso-height-percent:0;mso-width-relative:margin;mso-height-relative:margin;v-text-anchor:middle" o:gfxdata="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" filled="f" strokecolor="#1f3763 [1604]" strokeweight="1pt">
                 <v:textbox>
                   <w:txbxContent>
                     <w:p>
                       <w:pPr>
                         <w:jc w:val="center"/>
-                        <w:rPr>
-                          <w:color w:val="000000" w:themeColor="text1"/>
-                          <w14:shadow w14:blurRad="38100" w14:dist="19050" w14:dir="2700000" w14:sx="100000" w14:sy="100000" w14:kx="0" w14:ky="0" w14:algn="tl">
-                            <w14:schemeClr w14:val="dk1">
-                              <w14:alpha w14:val="60000"/>
-                            </w14:schemeClr>
-                          </w14:shadow>
-                          <w14:textOutline w14:w="0" w14:cap="flat" w14:cmpd="sng" w14:algn="ctr">
-                            <w14:noFill/>
-                            <w14:prstDash w14:val="solid"/>
-                            <w14:round/>
-                          </w14:textOutline>
-                        </w:rPr>
                       </w:pPr>
                       <w:r>
-                        <w:rPr>
-                          <w:color w:val="000000" w:themeColor="text1"/>
-                          <w14:shadow w14:blurRad="38100" w14:dist="19050" w14:dir="2700000" w14:sx="100000" w14:sy="100000" w14:kx="0" w14:ky="0" w14:algn="tl">
-                            <w14:schemeClr w14:val="dk1">
-                              <w14:alpha w14:val="60000"/>
-                            </w14:schemeClr>
-                          </w14:shadow>
-                          <w14:textOutline w14:w="0" w14:cap="flat" w14:cmpd="sng" w14:algn="ctr">
-                            <w14:noFill/>
-                            <w14:prstDash w14:val="solid"/>
-                            <w14:round/>
-                          </w14:textOutline>
-                        </w:rPr>
-                        <w:t>auszutauschende/ zu überschreibende</w:t>
-                      </w:r>
-                      <w:r>
-                        <w:rPr>
-                          <w:color w:val="000000" w:themeColor="text1"/>
-                          <w14:shadow w14:blurRad="38100" w14:dist="19050" w14:dir="2700000" w14:sx="100000" w14:sy="100000" w14:kx="0" w14:ky="0" w14:algn="tl">
-                            <w14:schemeClr w14:val="dk1">
-                              <w14:alpha w14:val="60000"/>
-                            </w14:schemeClr>
-                          </w14:shadow>
-                          <w14:textOutline w14:w="0" w14:cap="flat" w14:cmpd="sng" w14:algn="ctr">
-                            <w14:noFill/>
-                            <w14:prstDash w14:val="solid"/>
-                            <w14:round/>
-                          </w14:textOutline>
-                        </w:rPr>
-                        <w:t xml:space="preserve"> Dateien</w:t>
+                        <w:t>ä</w:t>
                       </w:r>
                     </w:p>
                   </w:txbxContent>
                 </v:textbox>
-                <w10:wrap anchorx="margin"/>
               </v:rect>
             </w:pict>
           </mc:Fallback>
@@ -3127,18 +3552,18 @@
         <mc:AlternateContent>
           <mc:Choice Requires="wps">
             <w:drawing>
-              <wp:anchor distT="0" distB="0" distL="114300" distR="114300" simplePos="0" relativeHeight="251706368" behindDoc="0" locked="0" layoutInCell="1" allowOverlap="1" wp14:anchorId="51EDA90B" wp14:editId="66177678">
+              <wp:anchor distT="0" distB="0" distL="114300" distR="114300" simplePos="0" relativeHeight="251662366" behindDoc="0" locked="0" layoutInCell="1" allowOverlap="1" wp14:anchorId="77E46FD3" wp14:editId="2AD3D49A">
                 <wp:simplePos x="0" y="0"/>
                 <wp:positionH relativeFrom="column">
-                  <wp:posOffset>1911985</wp:posOffset>
+                  <wp:posOffset>2049145</wp:posOffset>
                 </wp:positionH>
                 <wp:positionV relativeFrom="paragraph">
-                  <wp:posOffset>5958205</wp:posOffset>
+                  <wp:posOffset>4799965</wp:posOffset>
                 </wp:positionV>
-                <wp:extent cx="1405890" cy="1089660"/>
-                <wp:effectExtent l="0" t="0" r="22860" b="15240"/>
+                <wp:extent cx="1753200" cy="755650"/>
+                <wp:effectExtent l="0" t="0" r="19050" b="25400"/>
                 <wp:wrapNone/>
-                <wp:docPr id="10" name="Rechteck 10"/>
+                <wp:docPr id="40" name="Rechteck 40"/>
                 <wp:cNvGraphicFramePr/>
                 <a:graphic xmlns:a="http://schemas.openxmlformats.org/drawingml/2006/main">
                   <a:graphicData uri="http://schemas.microsoft.com/office/word/2010/wordprocessingShape">
@@ -3147,7 +3572,7 @@
                       <wps:spPr>
                         <a:xfrm>
                           <a:off x="0" y="0"/>
-                          <a:ext cx="1405890" cy="1089660"/>
+                          <a:ext cx="1753200" cy="755650"/>
                         </a:xfrm>
                         <a:prstGeom prst="rect">
                           <a:avLst/>
@@ -3170,354 +3595,14 @@
                           <a:schemeClr val="lt1"/>
                         </a:fontRef>
                       </wps:style>
-                      <wps:bodyPr rot="0" spcFirstLastPara="0" vertOverflow="overflow" horzOverflow="overflow" vert="horz" wrap="square" lIns="91440" tIns="45720" rIns="91440" bIns="45720" numCol="1" spcCol="0" rtlCol="0" fromWordArt="0" anchor="ctr" anchorCtr="0" forceAA="0" compatLnSpc="1">
-                        <a:prstTxWarp prst="textNoShape">
-                          <a:avLst/>
-                        </a:prstTxWarp>
-                        <a:noAutofit/>
-                      </wps:bodyPr>
-                    </wps:wsp>
-                  </a:graphicData>
-                </a:graphic>
-                <wp14:sizeRelH relativeFrom="margin">
-                  <wp14:pctWidth>0</wp14:pctWidth>
-                </wp14:sizeRelH>
-                <wp14:sizeRelV relativeFrom="margin">
-                  <wp14:pctHeight>0</wp14:pctHeight>
-                </wp14:sizeRelV>
-              </wp:anchor>
-            </w:drawing>
-          </mc:Choice>
-          <mc:Fallback>
-            <w:pict>
-              <v:rect w14:anchorId="20BACE77" id="Rechteck 10" o:spid="_x0000_s1026" style="position:absolute;margin-left:150.55pt;margin-top:469.15pt;width:110.7pt;height:85.8pt;z-index:251706368;visibility:visible;mso-wrap-style:square;mso-width-percent:0;mso-height-percent:0;mso-wrap-distance-left:9pt;mso-wrap-distance-top:0;mso-wrap-distance-right:9pt;mso-wrap-distance-bottom:0;mso-position-horizontal:absolute;mso-position-horizontal-relative:text;mso-position-vertical:absolute;mso-position-vertical-relative:text;mso-width-percent:0;mso-height-percent:0;mso-width-relative:margin;mso-height-relative:margin;v-text-anchor:middle" o:gfxdata="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" filled="f" strokecolor="#1f3763 [1604]" strokeweight="1pt"/>
-            </w:pict>
-          </mc:Fallback>
-        </mc:AlternateContent>
-      </w:r>
-      <w:r>
-        <w:rPr>
-          <w:noProof/>
-        </w:rPr>
-        <mc:AlternateContent>
-          <mc:Choice Requires="wps">
-            <w:drawing>
-              <wp:anchor distT="0" distB="0" distL="114300" distR="114300" simplePos="0" relativeHeight="251687936" behindDoc="0" locked="0" layoutInCell="1" allowOverlap="1" wp14:anchorId="57402892" wp14:editId="3C5EC0CE">
-                <wp:simplePos x="0" y="0"/>
-                <wp:positionH relativeFrom="column">
-                  <wp:posOffset>1911985</wp:posOffset>
-                </wp:positionH>
-                <wp:positionV relativeFrom="paragraph">
-                  <wp:posOffset>4853305</wp:posOffset>
-                </wp:positionV>
-                <wp:extent cx="1405890" cy="457200"/>
-                <wp:effectExtent l="0" t="0" r="22860" b="19050"/>
-                <wp:wrapNone/>
-                <wp:docPr id="23" name="Rechteck 23"/>
-                <wp:cNvGraphicFramePr/>
-                <a:graphic xmlns:a="http://schemas.openxmlformats.org/drawingml/2006/main">
-                  <a:graphicData uri="http://schemas.microsoft.com/office/word/2010/wordprocessingShape">
-                    <wps:wsp>
-                      <wps:cNvSpPr/>
-                      <wps:spPr>
-                        <a:xfrm>
-                          <a:off x="0" y="0"/>
-                          <a:ext cx="1405890" cy="457200"/>
-                        </a:xfrm>
-                        <a:prstGeom prst="rect">
-                          <a:avLst/>
-                        </a:prstGeom>
-                        <a:solidFill>
-                          <a:schemeClr val="accent6">
-                            <a:alpha val="23137"/>
-                          </a:schemeClr>
-                        </a:solidFill>
-                        <a:ln>
-                          <a:solidFill>
-                            <a:schemeClr val="accent6">
-                              <a:lumMod val="75000"/>
-                            </a:schemeClr>
-                          </a:solidFill>
-                        </a:ln>
-                      </wps:spPr>
-                      <wps:style>
-                        <a:lnRef idx="2">
-                          <a:schemeClr val="accent1">
-                            <a:shade val="50000"/>
-                          </a:schemeClr>
-                        </a:lnRef>
-                        <a:fillRef idx="1">
-                          <a:schemeClr val="accent1"/>
-                        </a:fillRef>
-                        <a:effectRef idx="0">
-                          <a:schemeClr val="accent1"/>
-                        </a:effectRef>
-                        <a:fontRef idx="minor">
-                          <a:schemeClr val="lt1"/>
-                        </a:fontRef>
-                      </wps:style>
-                      <wps:bodyPr rot="0" spcFirstLastPara="0" vertOverflow="overflow" horzOverflow="overflow" vert="horz" wrap="square" lIns="91440" tIns="45720" rIns="91440" bIns="45720" numCol="1" spcCol="0" rtlCol="0" fromWordArt="0" anchor="ctr" anchorCtr="0" forceAA="0" compatLnSpc="1">
-                        <a:prstTxWarp prst="textNoShape">
-                          <a:avLst/>
-                        </a:prstTxWarp>
-                        <a:noAutofit/>
-                      </wps:bodyPr>
-                    </wps:wsp>
-                  </a:graphicData>
-                </a:graphic>
-                <wp14:sizeRelH relativeFrom="margin">
-                  <wp14:pctWidth>0</wp14:pctWidth>
-                </wp14:sizeRelH>
-                <wp14:sizeRelV relativeFrom="margin">
-                  <wp14:pctHeight>0</wp14:pctHeight>
-                </wp14:sizeRelV>
-              </wp:anchor>
-            </w:drawing>
-          </mc:Choice>
-          <mc:Fallback>
-            <w:pict>
-              <v:rect w14:anchorId="115152C0" id="Rechteck 23" o:spid="_x0000_s1026" style="position:absolute;margin-left:150.55pt;margin-top:382.15pt;width:110.7pt;height:36pt;z-index:251687936;visibility:visible;mso-wrap-style:square;mso-width-percent:0;mso-height-percent:0;mso-wrap-distance-left:9pt;mso-wrap-distance-top:0;mso-wrap-distance-right:9pt;mso-wrap-distance-bottom:0;mso-position-horizontal:absolute;mso-position-horizontal-relative:text;mso-position-vertical:absolute;mso-position-vertical-relative:text;mso-width-percent:0;mso-height-percent:0;mso-width-relative:margin;mso-height-relative:margin;v-text-anchor:middle" o:gfxdata="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" fillcolor="#70ad47 [3209]" strokecolor="#538135 [2409]" strokeweight="1pt">
-                <v:fill opacity="15163f"/>
-              </v:rect>
-            </w:pict>
-          </mc:Fallback>
-        </mc:AlternateContent>
-      </w:r>
-      <w:r>
-        <w:rPr>
-          <w:noProof/>
-        </w:rPr>
-        <mc:AlternateContent>
-          <mc:Choice Requires="wps">
-            <w:drawing>
-              <wp:anchor distT="0" distB="0" distL="114300" distR="114300" simplePos="0" relativeHeight="251679744" behindDoc="0" locked="0" layoutInCell="1" allowOverlap="1" wp14:anchorId="695A0E50" wp14:editId="3A8E3450">
-                <wp:simplePos x="0" y="0"/>
-                <wp:positionH relativeFrom="column">
-                  <wp:posOffset>1911985</wp:posOffset>
-                </wp:positionH>
-                <wp:positionV relativeFrom="paragraph">
-                  <wp:posOffset>1180465</wp:posOffset>
-                </wp:positionV>
-                <wp:extent cx="1405890" cy="2621280"/>
-                <wp:effectExtent l="0" t="0" r="22860" b="26670"/>
-                <wp:wrapNone/>
-                <wp:docPr id="19" name="Rechteck 19"/>
-                <wp:cNvGraphicFramePr/>
-                <a:graphic xmlns:a="http://schemas.openxmlformats.org/drawingml/2006/main">
-                  <a:graphicData uri="http://schemas.microsoft.com/office/word/2010/wordprocessingShape">
-                    <wps:wsp>
-                      <wps:cNvSpPr/>
-                      <wps:spPr>
-                        <a:xfrm>
-                          <a:off x="0" y="0"/>
-                          <a:ext cx="1405890" cy="2621280"/>
-                        </a:xfrm>
-                        <a:prstGeom prst="rect">
-                          <a:avLst/>
-                        </a:prstGeom>
-                        <a:solidFill>
-                          <a:srgbClr val="C00000">
-                            <a:alpha val="23137"/>
-                          </a:srgbClr>
-                        </a:solidFill>
-                        <a:ln>
-                          <a:solidFill>
-                            <a:schemeClr val="accent2"/>
-                          </a:solidFill>
-                        </a:ln>
-                      </wps:spPr>
-                      <wps:style>
-                        <a:lnRef idx="2">
-                          <a:schemeClr val="accent1">
-                            <a:shade val="50000"/>
-                          </a:schemeClr>
-                        </a:lnRef>
-                        <a:fillRef idx="1">
-                          <a:schemeClr val="accent1"/>
-                        </a:fillRef>
-                        <a:effectRef idx="0">
-                          <a:schemeClr val="accent1"/>
-                        </a:effectRef>
-                        <a:fontRef idx="minor">
-                          <a:schemeClr val="lt1"/>
-                        </a:fontRef>
-                      </wps:style>
-                      <wps:bodyPr rot="0" spcFirstLastPara="0" vertOverflow="overflow" horzOverflow="overflow" vert="horz" wrap="square" lIns="91440" tIns="45720" rIns="91440" bIns="45720" numCol="1" spcCol="0" rtlCol="0" fromWordArt="0" anchor="ctr" anchorCtr="0" forceAA="0" compatLnSpc="1">
-                        <a:prstTxWarp prst="textNoShape">
-                          <a:avLst/>
-                        </a:prstTxWarp>
-                        <a:noAutofit/>
-                      </wps:bodyPr>
-                    </wps:wsp>
-                  </a:graphicData>
-                </a:graphic>
-                <wp14:sizeRelH relativeFrom="margin">
-                  <wp14:pctWidth>0</wp14:pctWidth>
-                </wp14:sizeRelH>
-                <wp14:sizeRelV relativeFrom="margin">
-                  <wp14:pctHeight>0</wp14:pctHeight>
-                </wp14:sizeRelV>
-              </wp:anchor>
-            </w:drawing>
-          </mc:Choice>
-          <mc:Fallback>
-            <w:pict>
-              <v:rect w14:anchorId="46FD4FF9" id="Rechteck 19" o:spid="_x0000_s1026" style="position:absolute;margin-left:150.55pt;margin-top:92.95pt;width:110.7pt;height:206.4pt;z-index:251679744;visibility:visible;mso-wrap-style:square;mso-width-percent:0;mso-height-percent:0;mso-wrap-distance-left:9pt;mso-wrap-distance-top:0;mso-wrap-distance-right:9pt;mso-wrap-distance-bottom:0;mso-position-horizontal:absolute;mso-position-horizontal-relative:text;mso-position-vertical:absolute;mso-position-vertical-relative:text;mso-width-percent:0;mso-height-percent:0;mso-width-relative:margin;mso-height-relative:margin;v-text-anchor:middle" o:gfxdata="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" fillcolor="#c00000" strokecolor="#ed7d31 [3205]" strokeweight="1pt">
-                <v:fill opacity="15163f"/>
-              </v:rect>
-            </w:pict>
-          </mc:Fallback>
-        </mc:AlternateContent>
-      </w:r>
-      <w:r>
-        <w:rPr>
-          <w:noProof/>
-        </w:rPr>
-        <w:drawing>
-          <wp:inline distT="0" distB="0" distL="0" distR="0" wp14:anchorId="52422BEE" wp14:editId="7D6ACE26">
-            <wp:extent cx="5760720" cy="7212965"/>
-            <wp:effectExtent l="0" t="0" r="0" b="6985"/>
-            <wp:docPr id="8" name="Grafik 8"/>
-            <wp:cNvGraphicFramePr>
-              <a:graphicFrameLocks xmlns:a="http://schemas.openxmlformats.org/drawingml/2006/main" noChangeAspect="1"/>
-            </wp:cNvGraphicFramePr>
-            <a:graphic xmlns:a="http://schemas.openxmlformats.org/drawingml/2006/main">
-              <a:graphicData uri="http://schemas.openxmlformats.org/drawingml/2006/picture">
-                <pic:pic xmlns:pic="http://schemas.openxmlformats.org/drawingml/2006/picture">
-                  <pic:nvPicPr>
-                    <pic:cNvPr id="1" name=""/>
-                    <pic:cNvPicPr/>
-                  </pic:nvPicPr>
-                  <pic:blipFill>
-                    <a:blip r:embed="rId13"/>
-                    <a:stretch>
-                      <a:fillRect/>
-                    </a:stretch>
-                  </pic:blipFill>
-                  <pic:spPr>
-                    <a:xfrm>
-                      <a:off x="0" y="0"/>
-                      <a:ext cx="5760720" cy="7212965"/>
-                    </a:xfrm>
-                    <a:prstGeom prst="rect">
-                      <a:avLst/>
-                    </a:prstGeom>
-                  </pic:spPr>
-                </pic:pic>
-              </a:graphicData>
-            </a:graphic>
-          </wp:inline>
-        </w:drawing>
-      </w:r>
-      <w:r>
-        <w:rPr>
-          <w:noProof/>
-        </w:rPr>
-        <mc:AlternateContent>
-          <mc:Choice Requires="wps">
-            <w:drawing>
-              <wp:anchor distT="0" distB="0" distL="114300" distR="114300" simplePos="0" relativeHeight="251695104" behindDoc="0" locked="0" layoutInCell="1" allowOverlap="1" wp14:anchorId="10E67374" wp14:editId="590A1449">
-                <wp:simplePos x="0" y="0"/>
-                <wp:positionH relativeFrom="column">
-                  <wp:posOffset>-159385</wp:posOffset>
-                </wp:positionH>
-                <wp:positionV relativeFrom="paragraph">
-                  <wp:posOffset>3683635</wp:posOffset>
-                </wp:positionV>
-                <wp:extent cx="996950" cy="706120"/>
-                <wp:effectExtent l="0" t="0" r="12700" b="17780"/>
-                <wp:wrapNone/>
-                <wp:docPr id="27" name="Rechteck 27"/>
-                <wp:cNvGraphicFramePr/>
-                <a:graphic xmlns:a="http://schemas.openxmlformats.org/drawingml/2006/main">
-                  <a:graphicData uri="http://schemas.microsoft.com/office/word/2010/wordprocessingShape">
-                    <wps:wsp>
-                      <wps:cNvSpPr/>
-                      <wps:spPr>
-                        <a:xfrm>
-                          <a:off x="0" y="0"/>
-                          <a:ext cx="996950" cy="706120"/>
-                        </a:xfrm>
-                        <a:prstGeom prst="rect">
-                          <a:avLst/>
-                        </a:prstGeom>
-                        <a:solidFill>
-                          <a:srgbClr val="C00000">
-                            <a:alpha val="23137"/>
-                          </a:srgbClr>
-                        </a:solidFill>
-                        <a:ln>
-                          <a:solidFill>
-                            <a:schemeClr val="accent2"/>
-                          </a:solidFill>
-                        </a:ln>
-                      </wps:spPr>
-                      <wps:style>
-                        <a:lnRef idx="2">
-                          <a:schemeClr val="accent1">
-                            <a:shade val="50000"/>
-                          </a:schemeClr>
-                        </a:lnRef>
-                        <a:fillRef idx="1">
-                          <a:schemeClr val="accent1"/>
-                        </a:fillRef>
-                        <a:effectRef idx="0">
-                          <a:schemeClr val="accent1"/>
-                        </a:effectRef>
-                        <a:fontRef idx="minor">
-                          <a:schemeClr val="lt1"/>
-                        </a:fontRef>
-                      </wps:style>
                       <wps:txbx>
                         <w:txbxContent>
                           <w:p>
                             <w:pPr>
                               <w:jc w:val="center"/>
-                              <w:rPr>
-                                <w:color w:val="000000" w:themeColor="text1"/>
-                                <w14:shadow w14:blurRad="38100" w14:dist="19050" w14:dir="2700000" w14:sx="100000" w14:sy="100000" w14:kx="0" w14:ky="0" w14:algn="tl">
-                                  <w14:schemeClr w14:val="dk1">
-                                    <w14:alpha w14:val="60000"/>
-                                  </w14:schemeClr>
-                                </w14:shadow>
-                                <w14:textOutline w14:w="0" w14:cap="flat" w14:cmpd="sng" w14:algn="ctr">
-                                  <w14:noFill/>
-                                  <w14:prstDash w14:val="solid"/>
-                                  <w14:round/>
-                                </w14:textOutline>
-                              </w:rPr>
                             </w:pPr>
                             <w:r>
-                              <w:rPr>
-                                <w:color w:val="000000" w:themeColor="text1"/>
-                                <w14:shadow w14:blurRad="38100" w14:dist="19050" w14:dir="2700000" w14:sx="100000" w14:sy="100000" w14:kx="0" w14:ky="0" w14:algn="tl">
-                                  <w14:schemeClr w14:val="dk1">
-                                    <w14:alpha w14:val="60000"/>
-                                  </w14:schemeClr>
-                                </w14:shadow>
-                                <w14:textOutline w14:w="0" w14:cap="flat" w14:cmpd="sng" w14:algn="ctr">
-                                  <w14:noFill/>
-                                  <w14:prstDash w14:val="solid"/>
-                                  <w14:round/>
-                                </w14:textOutline>
-                              </w:rPr>
-                              <w:t>n</w:t>
-                            </w:r>
-                            <w:r>
-                              <w:rPr>
-                                <w:color w:val="000000" w:themeColor="text1"/>
-                                <w14:shadow w14:blurRad="38100" w14:dist="19050" w14:dir="2700000" w14:sx="100000" w14:sy="100000" w14:kx="0" w14:ky="0" w14:algn="tl">
-                                  <w14:schemeClr w14:val="dk1">
-                                    <w14:alpha w14:val="60000"/>
-                                  </w14:schemeClr>
-                                </w14:shadow>
-                                <w14:textOutline w14:w="0" w14:cap="flat" w14:cmpd="sng" w14:algn="ctr">
-                                  <w14:noFill/>
-                                  <w14:prstDash w14:val="solid"/>
-                                  <w14:round/>
-                                </w14:textOutline>
-                              </w:rPr>
-                              <w:t>eu einzufügende Dateien</w:t>
+                              <w:t>ä</w:t>
                             </w:r>
                           </w:p>
                         </w:txbxContent>
@@ -3542,58 +3627,15 @@
           </mc:Choice>
           <mc:Fallback>
             <w:pict>
-              <v:rect w14:anchorId="10E67374" id="Rechteck 27" o:spid="_x0000_s1028" style="position:absolute;margin-left:-12.55pt;margin-top:290.05pt;width:78.5pt;height:55.6pt;z-index:251695104;visibility:visible;mso-wrap-style:square;mso-width-percent:0;mso-height-percent:0;mso-wrap-distance-left:9pt;mso-wrap-distance-top:0;mso-wrap-distance-right:9pt;mso-wrap-distance-bottom:0;mso-position-horizontal:absolute;mso-position-horizontal-relative:text;mso-position-vertical:absolute;mso-position-vertical-relative:text;mso-width-percent:0;mso-height-percent:0;mso-width-relative:margin;mso-height-relative:margin;v-text-anchor:middle" o:gfxdata="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" fillcolor="#c00000" strokecolor="#ed7d31 [3205]" strokeweight="1pt">
-                <v:fill opacity="15163f"/>
+              <v:rect w14:anchorId="77E46FD3" id="Rechteck 40" o:spid="_x0000_s1030" style="position:absolute;left:0;text-align:left;margin-left:161.35pt;margin-top:377.95pt;width:138.05pt;height:59.5pt;z-index:251662366;visibility:visible;mso-wrap-style:square;mso-width-percent:0;mso-height-percent:0;mso-wrap-distance-left:9pt;mso-wrap-distance-top:0;mso-wrap-distance-right:9pt;mso-wrap-distance-bottom:0;mso-position-horizontal:absolute;mso-position-horizontal-relative:text;mso-position-vertical:absolute;mso-position-vertical-relative:text;mso-width-percent:0;mso-height-percent:0;mso-width-relative:margin;mso-height-relative:margin;v-text-anchor:middle" o:gfxdata="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" filled="f" strokecolor="#1f3763 [1604]" strokeweight="1pt">
                 <v:textbox>
                   <w:txbxContent>
                     <w:p>
                       <w:pPr>
                         <w:jc w:val="center"/>
-                        <w:rPr>
-                          <w:color w:val="000000" w:themeColor="text1"/>
-                          <w14:shadow w14:blurRad="38100" w14:dist="19050" w14:dir="2700000" w14:sx="100000" w14:sy="100000" w14:kx="0" w14:ky="0" w14:algn="tl">
-                            <w14:schemeClr w14:val="dk1">
-                              <w14:alpha w14:val="60000"/>
-                            </w14:schemeClr>
-                          </w14:shadow>
-                          <w14:textOutline w14:w="0" w14:cap="flat" w14:cmpd="sng" w14:algn="ctr">
-                            <w14:noFill/>
-                            <w14:prstDash w14:val="solid"/>
-                            <w14:round/>
-                          </w14:textOutline>
-                        </w:rPr>
                       </w:pPr>
                       <w:r>
-                        <w:rPr>
-                          <w:color w:val="000000" w:themeColor="text1"/>
-                          <w14:shadow w14:blurRad="38100" w14:dist="19050" w14:dir="2700000" w14:sx="100000" w14:sy="100000" w14:kx="0" w14:ky="0" w14:algn="tl">
-                            <w14:schemeClr w14:val="dk1">
-                              <w14:alpha w14:val="60000"/>
-                            </w14:schemeClr>
-                          </w14:shadow>
-                          <w14:textOutline w14:w="0" w14:cap="flat" w14:cmpd="sng" w14:algn="ctr">
-                            <w14:noFill/>
-                            <w14:prstDash w14:val="solid"/>
-                            <w14:round/>
-                          </w14:textOutline>
-                        </w:rPr>
-                        <w:t>n</w:t>
-                      </w:r>
-                      <w:r>
-                        <w:rPr>
-                          <w:color w:val="000000" w:themeColor="text1"/>
-                          <w14:shadow w14:blurRad="38100" w14:dist="19050" w14:dir="2700000" w14:sx="100000" w14:sy="100000" w14:kx="0" w14:ky="0" w14:algn="tl">
-                            <w14:schemeClr w14:val="dk1">
-                              <w14:alpha w14:val="60000"/>
-                            </w14:schemeClr>
-                          </w14:shadow>
-                          <w14:textOutline w14:w="0" w14:cap="flat" w14:cmpd="sng" w14:algn="ctr">
-                            <w14:noFill/>
-                            <w14:prstDash w14:val="solid"/>
-                            <w14:round/>
-                          </w14:textOutline>
-                        </w:rPr>
-                        <w:t>eu einzufügende Dateien</w:t>
+                        <w:t>ä</w:t>
                       </w:r>
                     </w:p>
                   </w:txbxContent>
@@ -3607,18 +3649,66 @@
         <w:rPr>
           <w:noProof/>
         </w:rPr>
-        <w:t xml:space="preserve"> </w:t>
+        <w:drawing>
+          <wp:inline distT="0" distB="0" distL="0" distR="0" wp14:anchorId="0D4863A9" wp14:editId="761883D3">
+            <wp:extent cx="3724275" cy="8181975"/>
+            <wp:effectExtent l="0" t="0" r="9525" b="9525"/>
+            <wp:docPr id="4" name="Grafik 4"/>
+            <wp:cNvGraphicFramePr>
+              <a:graphicFrameLocks xmlns:a="http://schemas.openxmlformats.org/drawingml/2006/main" noChangeAspect="1"/>
+            </wp:cNvGraphicFramePr>
+            <a:graphic xmlns:a="http://schemas.openxmlformats.org/drawingml/2006/main">
+              <a:graphicData uri="http://schemas.openxmlformats.org/drawingml/2006/picture">
+                <pic:pic xmlns:pic="http://schemas.openxmlformats.org/drawingml/2006/picture">
+                  <pic:nvPicPr>
+                    <pic:cNvPr id="1" name=""/>
+                    <pic:cNvPicPr/>
+                  </pic:nvPicPr>
+                  <pic:blipFill>
+                    <a:blip r:embed="rId13"/>
+                    <a:stretch>
+                      <a:fillRect/>
+                    </a:stretch>
+                  </pic:blipFill>
+                  <pic:spPr>
+                    <a:xfrm>
+                      <a:off x="0" y="0"/>
+                      <a:ext cx="3724275" cy="8181975"/>
+                    </a:xfrm>
+                    <a:prstGeom prst="rect">
+                      <a:avLst/>
+                    </a:prstGeom>
+                  </pic:spPr>
+                </pic:pic>
+              </a:graphicData>
+            </a:graphic>
+          </wp:inline>
+        </w:drawing>
+      </w:r>
+    </w:p>
+    <w:p>
+      <w:pPr>
+        <w:rPr>
+          <w:rFonts w:asciiTheme="majorHAnsi" w:eastAsiaTheme="majorEastAsia" w:hAnsiTheme="majorHAnsi" w:cstheme="majorBidi"/>
+          <w:color w:val="2F5496" w:themeColor="accent1" w:themeShade="BF"/>
+          <w:sz w:val="32"/>
+          <w:szCs w:val="32"/>
+        </w:rPr>
+      </w:pPr>
+      <w:r>
+        <w:br w:type="page"/>
       </w:r>
     </w:p>
     <w:p>
       <w:pPr>
         <w:pStyle w:val="berschrift1"/>
       </w:pPr>
-      <w:bookmarkStart w:id="4" w:name="_Toc120022771"/>
-      <w:r>
+      <w:bookmarkStart w:id="5" w:name="_Toc178405151"/>
+      <w:r>
+        <w:lastRenderedPageBreak/>
         <w:t>Benutzung</w:t>
       </w:r>
-      <w:bookmarkEnd w:id="4"/>
+      <w:bookmarkEnd w:id="5"/>
     </w:p>
     <w:p>
       <w:r>
@@ -3663,7 +3753,6 @@
           <w:sz w:val="20"/>
           <w:szCs w:val="20"/>
         </w:rPr>
-        <w:lastRenderedPageBreak/>
         <w:t>set</w:t>
       </w:r>
       <w:proofErr w:type="spellEnd"/>
@@ -3883,7 +3972,31 @@
           <w:sz w:val="20"/>
           <w:szCs w:val="20"/>
         </w:rPr>
-        <w:t>10.6</w:t>
+        <w:t>1</w:t>
+      </w:r>
+      <w:r>
+        <w:rPr>
+          <w:rFonts w:ascii="Courier New" w:hAnsi="Courier New" w:cs="Courier New"/>
+          <w:sz w:val="20"/>
+          <w:szCs w:val="20"/>
+        </w:rPr>
+        <w:t>1</w:t>
+      </w:r>
+      <w:r>
+        <w:rPr>
+          <w:rFonts w:ascii="Courier New" w:hAnsi="Courier New" w:cs="Courier New"/>
+          <w:sz w:val="20"/>
+          <w:szCs w:val="20"/>
+        </w:rPr>
+        <w:t>.</w:t>
+      </w:r>
+      <w:r>
+        <w:rPr>
+          <w:rFonts w:ascii="Courier New" w:hAnsi="Courier New" w:cs="Courier New"/>
+          <w:sz w:val="20"/>
+          <w:szCs w:val="20"/>
+        </w:rPr>
+        <w:t>4</w:t>
       </w:r>
       <w:r>
         <w:rPr>
@@ -4072,7 +4185,31 @@
           <w:sz w:val="20"/>
           <w:szCs w:val="20"/>
         </w:rPr>
-        <w:t>10.6</w:t>
+        <w:t>1</w:t>
+      </w:r>
+      <w:r>
+        <w:rPr>
+          <w:rFonts w:ascii="Courier New" w:hAnsi="Courier New" w:cs="Courier New"/>
+          <w:sz w:val="20"/>
+          <w:szCs w:val="20"/>
+        </w:rPr>
+        <w:t>1</w:t>
+      </w:r>
+      <w:r>
+        <w:rPr>
+          <w:rFonts w:ascii="Courier New" w:hAnsi="Courier New" w:cs="Courier New"/>
+          <w:sz w:val="20"/>
+          <w:szCs w:val="20"/>
+        </w:rPr>
+        <w:t>.</w:t>
+      </w:r>
+      <w:r>
+        <w:rPr>
+          <w:rFonts w:ascii="Courier New" w:hAnsi="Courier New" w:cs="Courier New"/>
+          <w:sz w:val="20"/>
+          <w:szCs w:val="20"/>
+        </w:rPr>
+        <w:t>4</w:t>
       </w:r>
       <w:r>
         <w:rPr>
@@ -4415,7 +4552,31 @@
           <w:sz w:val="20"/>
           <w:szCs w:val="20"/>
         </w:rPr>
-        <w:t>10.6</w:t>
+        <w:t>1</w:t>
+      </w:r>
+      <w:r>
+        <w:rPr>
+          <w:rFonts w:ascii="Courier New" w:hAnsi="Courier New" w:cs="Courier New"/>
+          <w:sz w:val="20"/>
+          <w:szCs w:val="20"/>
+        </w:rPr>
+        <w:t>1</w:t>
+      </w:r>
+      <w:r>
+        <w:rPr>
+          <w:rFonts w:ascii="Courier New" w:hAnsi="Courier New" w:cs="Courier New"/>
+          <w:sz w:val="20"/>
+          <w:szCs w:val="20"/>
+        </w:rPr>
+        <w:t>.</w:t>
+      </w:r>
+      <w:r>
+        <w:rPr>
+          <w:rFonts w:ascii="Courier New" w:hAnsi="Courier New" w:cs="Courier New"/>
+          <w:sz w:val="20"/>
+          <w:szCs w:val="20"/>
+        </w:rPr>
+        <w:t>4</w:t>
       </w:r>
       <w:r>
         <w:rPr>
@@ -4620,7 +4781,31 @@
           <w:sz w:val="20"/>
           <w:szCs w:val="20"/>
         </w:rPr>
-        <w:t>10.6</w:t>
+        <w:t>1</w:t>
+      </w:r>
+      <w:r>
+        <w:rPr>
+          <w:rFonts w:ascii="Courier New" w:hAnsi="Courier New" w:cs="Courier New"/>
+          <w:sz w:val="20"/>
+          <w:szCs w:val="20"/>
+        </w:rPr>
+        <w:t>1</w:t>
+      </w:r>
+      <w:r>
+        <w:rPr>
+          <w:rFonts w:ascii="Courier New" w:hAnsi="Courier New" w:cs="Courier New"/>
+          <w:sz w:val="20"/>
+          <w:szCs w:val="20"/>
+        </w:rPr>
+        <w:t>.</w:t>
+      </w:r>
+      <w:r>
+        <w:rPr>
+          <w:rFonts w:ascii="Courier New" w:hAnsi="Courier New" w:cs="Courier New"/>
+          <w:sz w:val="20"/>
+          <w:szCs w:val="20"/>
+        </w:rPr>
+        <w:t>4</w:t>
       </w:r>
       <w:r>
         <w:rPr>
@@ -4955,7 +5140,31 @@
           <w:sz w:val="20"/>
           <w:szCs w:val="20"/>
         </w:rPr>
-        <w:t>10.6</w:t>
+        <w:t>1</w:t>
+      </w:r>
+      <w:r>
+        <w:rPr>
+          <w:rFonts w:ascii="Courier New" w:hAnsi="Courier New" w:cs="Courier New"/>
+          <w:sz w:val="20"/>
+          <w:szCs w:val="20"/>
+        </w:rPr>
+        <w:t>1</w:t>
+      </w:r>
+      <w:r>
+        <w:rPr>
+          <w:rFonts w:ascii="Courier New" w:hAnsi="Courier New" w:cs="Courier New"/>
+          <w:sz w:val="20"/>
+          <w:szCs w:val="20"/>
+        </w:rPr>
+        <w:t>.</w:t>
+      </w:r>
+      <w:r>
+        <w:rPr>
+          <w:rFonts w:ascii="Courier New" w:hAnsi="Courier New" w:cs="Courier New"/>
+          <w:sz w:val="20"/>
+          <w:szCs w:val="20"/>
+        </w:rPr>
+        <w:t>4</w:t>
       </w:r>
       <w:r>
         <w:rPr>
@@ -5128,7 +5337,31 @@
           <w:sz w:val="20"/>
           <w:szCs w:val="20"/>
         </w:rPr>
-        <w:t>10.6</w:t>
+        <w:t>1</w:t>
+      </w:r>
+      <w:r>
+        <w:rPr>
+          <w:rFonts w:ascii="Courier New" w:hAnsi="Courier New" w:cs="Courier New"/>
+          <w:sz w:val="20"/>
+          <w:szCs w:val="20"/>
+        </w:rPr>
+        <w:t>1</w:t>
+      </w:r>
+      <w:r>
+        <w:rPr>
+          <w:rFonts w:ascii="Courier New" w:hAnsi="Courier New" w:cs="Courier New"/>
+          <w:sz w:val="20"/>
+          <w:szCs w:val="20"/>
+        </w:rPr>
+        <w:t>.</w:t>
+      </w:r>
+      <w:r>
+        <w:rPr>
+          <w:rFonts w:ascii="Courier New" w:hAnsi="Courier New" w:cs="Courier New"/>
+          <w:sz w:val="20"/>
+          <w:szCs w:val="20"/>
+        </w:rPr>
+        <w:t>4</w:t>
       </w:r>
       <w:r>
         <w:rPr>
@@ -5222,11 +5455,11 @@
       <w:pPr>
         <w:pStyle w:val="berschrift1"/>
       </w:pPr>
-      <w:bookmarkStart w:id="5" w:name="_Toc120022772"/>
+      <w:bookmarkStart w:id="6" w:name="_Toc178405152"/>
       <w:r>
         <w:t>Skripte erzeugen</w:t>
       </w:r>
-      <w:bookmarkEnd w:id="5"/>
+      <w:bookmarkEnd w:id="6"/>
     </w:p>
     <w:p>
       <w:r>
@@ -5442,11 +5675,7 @@
       </w:r>
       <w:proofErr w:type="spellEnd"/>
       <w:r>
-        <w:t xml:space="preserve">. 20 eingebettet, da die Prüfung in BT-130 und BT-150 auf beide Codelisten erfolgen muss. So bleibt die </w:t>
-      </w:r>
-      <w:r>
-        <w:lastRenderedPageBreak/>
-        <w:t xml:space="preserve">Codeliste UN/ECE </w:t>
+        <w:t xml:space="preserve">. 20 eingebettet, da die Prüfung in BT-130 und BT-150 auf beide Codelisten erfolgen muss. So bleibt die Codeliste UN/ECE </w:t>
       </w:r>
       <w:proofErr w:type="spellStart"/>
       <w:r>
@@ -5809,6 +6038,7 @@
         <w:rPr>
           <w:noProof/>
         </w:rPr>
+        <w:lastRenderedPageBreak/>
         <w:drawing>
           <wp:inline distT="0" distB="0" distL="0" distR="0" wp14:anchorId="467E2726" wp14:editId="1911C543">
             <wp:extent cx="5153025" cy="2400300"/>
@@ -5852,8 +6082,6 @@
           </wp:inline>
         </w:drawing>
       </w:r>
-      <w:bookmarkStart w:id="6" w:name="_GoBack"/>
-      <w:bookmarkEnd w:id="6"/>
     </w:p>
     <w:sectPr>
       <w:footerReference w:type="default" r:id="rId17"/>
@@ -5888,6 +6116,13 @@
       </w:r>
     </w:p>
   </w:endnote>
+  <w:endnote w:type="continuationNotice" w:id="1">
+    <w:p>
+      <w:pPr>
+        <w:spacing w:after="0" w:line="240" w:lineRule="auto"/>
+      </w:pPr>
+    </w:p>
+  </w:endnote>
 </w:endnotes>
 </file>
 
@@ -5898,25 +6133,10 @@
       <w:pStyle w:val="Fuzeile"/>
     </w:pPr>
     <w:r>
-      <w:t>Stand: 202</w:t>
+      <w:t>Stand: 2024-09-2</w:t>
     </w:r>
     <w:r>
-      <w:t>3</w:t>
-    </w:r>
-    <w:r>
-      <w:t>-</w:t>
-    </w:r>
-    <w:r>
-      <w:t>09</w:t>
-    </w:r>
-    <w:r>
-      <w:t>-</w:t>
-    </w:r>
-    <w:r>
-      <w:t>2</w:t>
-    </w:r>
-    <w:r>
-      <w:t>4</w:t>
+      <w:t>7</w:t>
     </w:r>
   </w:p>
 </w:ftr>
@@ -5942,6 +6162,13 @@
       <w:r>
         <w:continuationSeparator/>
       </w:r>
+    </w:p>
+  </w:footnote>
+  <w:footnote w:type="continuationNotice" w:id="1">
+    <w:p>
+      <w:pPr>
+        <w:spacing w:after="0" w:line="240" w:lineRule="auto"/>
+      </w:pPr>
     </w:p>
   </w:footnote>
 </w:footnotes>
@@ -6954,7 +7181,7 @@
 </file>
 
 <file path=customXml/itemProps1.xml><?xml version="1.0" encoding="utf-8"?>
-<ds:datastoreItem xmlns:ds="http://schemas.openxmlformats.org/officeDocument/2006/customXml" ds:itemID="{123CCE8B-15FB-430A-BF83-80132D5860A4}">
+<ds:datastoreItem xmlns:ds="http://schemas.openxmlformats.org/officeDocument/2006/customXml" ds:itemID="{B51A927F-F315-4787-8527-67BA8502E0D5}">
   <ds:schemaRefs>
     <ds:schemaRef ds:uri="http://schemas.openxmlformats.org/officeDocument/2006/bibliography"/>
   </ds:schemaRefs>

</xml_diff>